<commit_message>
fix: resolve defects F-01 through F-14 and improve DOCX rendering pipeline
- Stabilize Mermaid rendering with Chromium bootstrap script and persistent media paths
- Support rich nested AST content (tables, code, lists) inside callouts without flattening
- Add repeating table headers (<w:tblHeader/>), row split prevention (<w:cantSplit/>), and headerless table support
- Enhance BiDi run splitting for Persian/Latin/numbers/punctuation and preserve line breaks (<w:br/>)
- Support strikeout, sub/superscript, definition lists, horizontal rules, and page breaks
- Clean shell.docx body while preserving sectPr, headers, and footers
- Enforce strict CLI error contracts, exit codes, and comprehensive template schema validation
- Expand test suite to 120 passing tests and regenerate all fixture DOCX files
</commit_message>
<xml_diff>
--- a/examples/english_technical_doc.docx
+++ b/examples/english_technical_doc.docx
@@ -4,13 +4,13 @@
   <w:body>
     <w:tbl>
       <w:tblPr>
-        <w:tblW w:type="auto" w:w="0"/>
+        <w:tblW w:type="dxa" w:w="9638"/>
         <w:tblLayout w:type="fixed"/>
         <w:tblLook w:firstColumn="1" w:firstRow="1" w:lastColumn="0" w:lastRow="0" w:noHBand="0" w:noVBand="1" w:val="04A0"/>
       </w:tblPr>
       <w:tblGrid>
-        <w:gridCol w:w="4819"/>
-        <w:gridCol w:w="4819"/>
+        <w:gridCol w:w="936"/>
+        <w:gridCol w:w="8702"/>
       </w:tblGrid>
       <w:tr>
         <w:tc>
@@ -34,7 +34,6 @@
             <w:pPr>
               <w:jc w:val="center"/>
             </w:pPr>
-            <w:r/>
             <w:r>
               <w:rPr>
                 <w:rFonts w:ascii="Vazirmatn" w:hAnsi="Vazirmatn" w:cs="Vazirmatn"/>
@@ -69,7 +68,6 @@
             <w:pPr>
               <w:jc w:val="start"/>
             </w:pPr>
-            <w:r/>
             <w:r>
               <w:rPr>
                 <w:rFonts w:ascii="Vazirmatn" w:hAnsi="Vazirmatn" w:cs="Vazirmatn"/>
@@ -94,7 +92,7 @@
     </w:p>
     <w:p>
       <w:pPr>
-        <w:spacing w:line="324" w:lineRule="auto" w:after="120"/>
+        <w:spacing w:line="336" w:lineRule="auto" w:after="120"/>
         <w:jc w:val="both"/>
       </w:pPr>
       <w:r>
@@ -105,7 +103,7 @@
           <w:color w:val="2D2D2D"/>
           <w:lang w:val="en-US" w:bidi="fa-IR"/>
         </w:rPr>
-        <w:t>This document provides a technical specification for the distributed caching layer and data synchronization pipelines deployed across high</w:t>
+        <w:t>This</w:t>
       </w:r>
       <w:r>
         <w:rPr>
@@ -115,7 +113,7 @@
           <w:color w:val="2D2D2D"/>
           <w:lang w:val="en-US" w:bidi="fa-IR"/>
         </w:rPr>
-        <w:t>-</w:t>
+        <w:t xml:space="preserve"> </w:t>
       </w:r>
       <w:r>
         <w:rPr>
@@ -125,7 +123,7 @@
           <w:color w:val="2D2D2D"/>
           <w:lang w:val="en-US" w:bidi="fa-IR"/>
         </w:rPr>
-        <w:t>throughput production clusters</w:t>
+        <w:t>document</w:t>
       </w:r>
       <w:r>
         <w:rPr>
@@ -135,18 +133,368 @@
           <w:color w:val="2D2D2D"/>
           <w:lang w:val="en-US" w:bidi="fa-IR"/>
         </w:rPr>
-        <w:t>.</w:t>
+        <w:t xml:space="preserve"> </w:t>
+      </w:r>
+      <w:r>
+        <w:rPr>
+          <w:rFonts w:ascii="Vazirmatn" w:hAnsi="Vazirmatn" w:cs="Vazirmatn"/>
+          <w:sz w:val="22"/>
+          <w:szCs w:val="22"/>
+          <w:color w:val="2D2D2D"/>
+          <w:lang w:val="en-US" w:bidi="fa-IR"/>
+        </w:rPr>
+        <w:t>provides</w:t>
+      </w:r>
+      <w:r>
+        <w:rPr>
+          <w:rFonts w:ascii="Vazirmatn" w:hAnsi="Vazirmatn" w:cs="Vazirmatn"/>
+          <w:sz w:val="22"/>
+          <w:szCs w:val="22"/>
+          <w:color w:val="2D2D2D"/>
+          <w:lang w:val="en-US" w:bidi="fa-IR"/>
+        </w:rPr>
+        <w:t xml:space="preserve"> </w:t>
+      </w:r>
+      <w:r>
+        <w:rPr>
+          <w:rFonts w:ascii="Vazirmatn" w:hAnsi="Vazirmatn" w:cs="Vazirmatn"/>
+          <w:sz w:val="22"/>
+          <w:szCs w:val="22"/>
+          <w:color w:val="2D2D2D"/>
+          <w:lang w:val="en-US" w:bidi="fa-IR"/>
+        </w:rPr>
+        <w:t>a</w:t>
+      </w:r>
+      <w:r>
+        <w:rPr>
+          <w:rFonts w:ascii="Vazirmatn" w:hAnsi="Vazirmatn" w:cs="Vazirmatn"/>
+          <w:sz w:val="22"/>
+          <w:szCs w:val="22"/>
+          <w:color w:val="2D2D2D"/>
+          <w:lang w:val="en-US" w:bidi="fa-IR"/>
+        </w:rPr>
+        <w:t xml:space="preserve"> </w:t>
+      </w:r>
+      <w:r>
+        <w:rPr>
+          <w:rFonts w:ascii="Vazirmatn" w:hAnsi="Vazirmatn" w:cs="Vazirmatn"/>
+          <w:sz w:val="22"/>
+          <w:szCs w:val="22"/>
+          <w:color w:val="2D2D2D"/>
+          <w:lang w:val="en-US" w:bidi="fa-IR"/>
+        </w:rPr>
+        <w:t>technical</w:t>
+      </w:r>
+      <w:r>
+        <w:rPr>
+          <w:rFonts w:ascii="Vazirmatn" w:hAnsi="Vazirmatn" w:cs="Vazirmatn"/>
+          <w:sz w:val="22"/>
+          <w:szCs w:val="22"/>
+          <w:color w:val="2D2D2D"/>
+          <w:lang w:val="en-US" w:bidi="fa-IR"/>
+        </w:rPr>
+        <w:t xml:space="preserve"> </w:t>
+      </w:r>
+      <w:r>
+        <w:rPr>
+          <w:rFonts w:ascii="Vazirmatn" w:hAnsi="Vazirmatn" w:cs="Vazirmatn"/>
+          <w:sz w:val="22"/>
+          <w:szCs w:val="22"/>
+          <w:color w:val="2D2D2D"/>
+          <w:lang w:val="en-US" w:bidi="fa-IR"/>
+        </w:rPr>
+        <w:t>specification</w:t>
+      </w:r>
+      <w:r>
+        <w:rPr>
+          <w:rFonts w:ascii="Vazirmatn" w:hAnsi="Vazirmatn" w:cs="Vazirmatn"/>
+          <w:sz w:val="22"/>
+          <w:szCs w:val="22"/>
+          <w:color w:val="2D2D2D"/>
+          <w:lang w:val="en-US" w:bidi="fa-IR"/>
+        </w:rPr>
+        <w:t xml:space="preserve"> </w:t>
+      </w:r>
+      <w:r>
+        <w:rPr>
+          <w:rFonts w:ascii="Vazirmatn" w:hAnsi="Vazirmatn" w:cs="Vazirmatn"/>
+          <w:sz w:val="22"/>
+          <w:szCs w:val="22"/>
+          <w:color w:val="2D2D2D"/>
+          <w:lang w:val="en-US" w:bidi="fa-IR"/>
+        </w:rPr>
+        <w:t>for</w:t>
+      </w:r>
+      <w:r>
+        <w:rPr>
+          <w:rFonts w:ascii="Vazirmatn" w:hAnsi="Vazirmatn" w:cs="Vazirmatn"/>
+          <w:sz w:val="22"/>
+          <w:szCs w:val="22"/>
+          <w:color w:val="2D2D2D"/>
+          <w:lang w:val="en-US" w:bidi="fa-IR"/>
+        </w:rPr>
+        <w:t xml:space="preserve"> </w:t>
+      </w:r>
+      <w:r>
+        <w:rPr>
+          <w:rFonts w:ascii="Vazirmatn" w:hAnsi="Vazirmatn" w:cs="Vazirmatn"/>
+          <w:sz w:val="22"/>
+          <w:szCs w:val="22"/>
+          <w:color w:val="2D2D2D"/>
+          <w:lang w:val="en-US" w:bidi="fa-IR"/>
+        </w:rPr>
+        <w:t>the</w:t>
+      </w:r>
+      <w:r>
+        <w:rPr>
+          <w:rFonts w:ascii="Vazirmatn" w:hAnsi="Vazirmatn" w:cs="Vazirmatn"/>
+          <w:sz w:val="22"/>
+          <w:szCs w:val="22"/>
+          <w:color w:val="2D2D2D"/>
+          <w:lang w:val="en-US" w:bidi="fa-IR"/>
+        </w:rPr>
+        <w:t xml:space="preserve"> </w:t>
+      </w:r>
+      <w:r>
+        <w:rPr>
+          <w:rFonts w:ascii="Vazirmatn" w:hAnsi="Vazirmatn" w:cs="Vazirmatn"/>
+          <w:sz w:val="22"/>
+          <w:szCs w:val="22"/>
+          <w:color w:val="2D2D2D"/>
+          <w:lang w:val="en-US" w:bidi="fa-IR"/>
+        </w:rPr>
+        <w:t>distributed</w:t>
+      </w:r>
+      <w:r>
+        <w:rPr>
+          <w:rFonts w:ascii="Vazirmatn" w:hAnsi="Vazirmatn" w:cs="Vazirmatn"/>
+          <w:sz w:val="22"/>
+          <w:szCs w:val="22"/>
+          <w:color w:val="2D2D2D"/>
+          <w:lang w:val="en-US" w:bidi="fa-IR"/>
+        </w:rPr>
+        <w:t xml:space="preserve"> </w:t>
+      </w:r>
+      <w:r>
+        <w:rPr>
+          <w:rFonts w:ascii="Vazirmatn" w:hAnsi="Vazirmatn" w:cs="Vazirmatn"/>
+          <w:sz w:val="22"/>
+          <w:szCs w:val="22"/>
+          <w:color w:val="2D2D2D"/>
+          <w:lang w:val="en-US" w:bidi="fa-IR"/>
+        </w:rPr>
+        <w:t>caching</w:t>
+      </w:r>
+      <w:r>
+        <w:rPr>
+          <w:rFonts w:ascii="Vazirmatn" w:hAnsi="Vazirmatn" w:cs="Vazirmatn"/>
+          <w:sz w:val="22"/>
+          <w:szCs w:val="22"/>
+          <w:color w:val="2D2D2D"/>
+          <w:lang w:val="en-US" w:bidi="fa-IR"/>
+        </w:rPr>
+        <w:t xml:space="preserve"> </w:t>
+      </w:r>
+      <w:r>
+        <w:rPr>
+          <w:rFonts w:ascii="Vazirmatn" w:hAnsi="Vazirmatn" w:cs="Vazirmatn"/>
+          <w:sz w:val="22"/>
+          <w:szCs w:val="22"/>
+          <w:color w:val="2D2D2D"/>
+          <w:lang w:val="en-US" w:bidi="fa-IR"/>
+        </w:rPr>
+        <w:t>layer</w:t>
+      </w:r>
+      <w:r>
+        <w:rPr>
+          <w:rFonts w:ascii="Vazirmatn" w:hAnsi="Vazirmatn" w:cs="Vazirmatn"/>
+          <w:sz w:val="22"/>
+          <w:szCs w:val="22"/>
+          <w:color w:val="2D2D2D"/>
+          <w:lang w:val="en-US" w:bidi="fa-IR"/>
+        </w:rPr>
+        <w:t xml:space="preserve"> </w:t>
+      </w:r>
+      <w:r>
+        <w:rPr>
+          <w:rFonts w:ascii="Vazirmatn" w:hAnsi="Vazirmatn" w:cs="Vazirmatn"/>
+          <w:sz w:val="22"/>
+          <w:szCs w:val="22"/>
+          <w:color w:val="2D2D2D"/>
+          <w:lang w:val="en-US" w:bidi="fa-IR"/>
+        </w:rPr>
+        <w:t>and</w:t>
+      </w:r>
+      <w:r>
+        <w:rPr>
+          <w:rFonts w:ascii="Vazirmatn" w:hAnsi="Vazirmatn" w:cs="Vazirmatn"/>
+          <w:sz w:val="22"/>
+          <w:szCs w:val="22"/>
+          <w:color w:val="2D2D2D"/>
+          <w:lang w:val="en-US" w:bidi="fa-IR"/>
+        </w:rPr>
+        <w:t xml:space="preserve"> </w:t>
+      </w:r>
+      <w:r>
+        <w:rPr>
+          <w:rFonts w:ascii="Vazirmatn" w:hAnsi="Vazirmatn" w:cs="Vazirmatn"/>
+          <w:sz w:val="22"/>
+          <w:szCs w:val="22"/>
+          <w:color w:val="2D2D2D"/>
+          <w:lang w:val="en-US" w:bidi="fa-IR"/>
+        </w:rPr>
+        <w:t>data</w:t>
+      </w:r>
+      <w:r>
+        <w:rPr>
+          <w:rFonts w:ascii="Vazirmatn" w:hAnsi="Vazirmatn" w:cs="Vazirmatn"/>
+          <w:sz w:val="22"/>
+          <w:szCs w:val="22"/>
+          <w:color w:val="2D2D2D"/>
+          <w:lang w:val="en-US" w:bidi="fa-IR"/>
+        </w:rPr>
+        <w:t xml:space="preserve"> </w:t>
+      </w:r>
+      <w:r>
+        <w:rPr>
+          <w:rFonts w:ascii="Vazirmatn" w:hAnsi="Vazirmatn" w:cs="Vazirmatn"/>
+          <w:sz w:val="22"/>
+          <w:szCs w:val="22"/>
+          <w:color w:val="2D2D2D"/>
+          <w:lang w:val="en-US" w:bidi="fa-IR"/>
+        </w:rPr>
+        <w:t>synchronization</w:t>
+      </w:r>
+      <w:r>
+        <w:rPr>
+          <w:rFonts w:ascii="Vazirmatn" w:hAnsi="Vazirmatn" w:cs="Vazirmatn"/>
+          <w:sz w:val="22"/>
+          <w:szCs w:val="22"/>
+          <w:color w:val="2D2D2D"/>
+          <w:lang w:val="en-US" w:bidi="fa-IR"/>
+        </w:rPr>
+        <w:t xml:space="preserve"> </w:t>
+      </w:r>
+      <w:r>
+        <w:rPr>
+          <w:rFonts w:ascii="Vazirmatn" w:hAnsi="Vazirmatn" w:cs="Vazirmatn"/>
+          <w:sz w:val="22"/>
+          <w:szCs w:val="22"/>
+          <w:color w:val="2D2D2D"/>
+          <w:lang w:val="en-US" w:bidi="fa-IR"/>
+        </w:rPr>
+        <w:t>pipelines</w:t>
+      </w:r>
+      <w:r>
+        <w:rPr>
+          <w:rFonts w:ascii="Vazirmatn" w:hAnsi="Vazirmatn" w:cs="Vazirmatn"/>
+          <w:sz w:val="22"/>
+          <w:szCs w:val="22"/>
+          <w:color w:val="2D2D2D"/>
+          <w:lang w:val="en-US" w:bidi="fa-IR"/>
+        </w:rPr>
+        <w:t xml:space="preserve"> </w:t>
+      </w:r>
+      <w:r>
+        <w:rPr>
+          <w:rFonts w:ascii="Vazirmatn" w:hAnsi="Vazirmatn" w:cs="Vazirmatn"/>
+          <w:sz w:val="22"/>
+          <w:szCs w:val="22"/>
+          <w:color w:val="2D2D2D"/>
+          <w:lang w:val="en-US" w:bidi="fa-IR"/>
+        </w:rPr>
+        <w:t>deployed</w:t>
+      </w:r>
+      <w:r>
+        <w:rPr>
+          <w:rFonts w:ascii="Vazirmatn" w:hAnsi="Vazirmatn" w:cs="Vazirmatn"/>
+          <w:sz w:val="22"/>
+          <w:szCs w:val="22"/>
+          <w:color w:val="2D2D2D"/>
+          <w:lang w:val="en-US" w:bidi="fa-IR"/>
+        </w:rPr>
+        <w:t xml:space="preserve"> </w:t>
+      </w:r>
+      <w:r>
+        <w:rPr>
+          <w:rFonts w:ascii="Vazirmatn" w:hAnsi="Vazirmatn" w:cs="Vazirmatn"/>
+          <w:sz w:val="22"/>
+          <w:szCs w:val="22"/>
+          <w:color w:val="2D2D2D"/>
+          <w:lang w:val="en-US" w:bidi="fa-IR"/>
+        </w:rPr>
+        <w:t>across</w:t>
+      </w:r>
+      <w:r>
+        <w:rPr>
+          <w:rFonts w:ascii="Vazirmatn" w:hAnsi="Vazirmatn" w:cs="Vazirmatn"/>
+          <w:sz w:val="22"/>
+          <w:szCs w:val="22"/>
+          <w:color w:val="2D2D2D"/>
+          <w:lang w:val="en-US" w:bidi="fa-IR"/>
+        </w:rPr>
+        <w:t xml:space="preserve"> </w:t>
+      </w:r>
+      <w:r>
+        <w:rPr>
+          <w:rFonts w:ascii="Vazirmatn" w:hAnsi="Vazirmatn" w:cs="Vazirmatn"/>
+          <w:sz w:val="22"/>
+          <w:szCs w:val="22"/>
+          <w:color w:val="2D2D2D"/>
+          <w:lang w:val="en-US" w:bidi="fa-IR"/>
+        </w:rPr>
+        <w:t>high-throughput</w:t>
+      </w:r>
+      <w:r>
+        <w:rPr>
+          <w:rFonts w:ascii="Vazirmatn" w:hAnsi="Vazirmatn" w:cs="Vazirmatn"/>
+          <w:sz w:val="22"/>
+          <w:szCs w:val="22"/>
+          <w:color w:val="2D2D2D"/>
+          <w:lang w:val="en-US" w:bidi="fa-IR"/>
+        </w:rPr>
+        <w:t xml:space="preserve"> </w:t>
+      </w:r>
+      <w:r>
+        <w:rPr>
+          <w:rFonts w:ascii="Vazirmatn" w:hAnsi="Vazirmatn" w:cs="Vazirmatn"/>
+          <w:sz w:val="22"/>
+          <w:szCs w:val="22"/>
+          <w:color w:val="2D2D2D"/>
+          <w:lang w:val="en-US" w:bidi="fa-IR"/>
+        </w:rPr>
+        <w:t>production</w:t>
+      </w:r>
+      <w:r>
+        <w:rPr>
+          <w:rFonts w:ascii="Vazirmatn" w:hAnsi="Vazirmatn" w:cs="Vazirmatn"/>
+          <w:sz w:val="22"/>
+          <w:szCs w:val="22"/>
+          <w:color w:val="2D2D2D"/>
+          <w:lang w:val="en-US" w:bidi="fa-IR"/>
+        </w:rPr>
+        <w:t xml:space="preserve"> </w:t>
+      </w:r>
+      <w:r>
+        <w:rPr>
+          <w:rFonts w:ascii="Vazirmatn" w:hAnsi="Vazirmatn" w:cs="Vazirmatn"/>
+          <w:sz w:val="22"/>
+          <w:szCs w:val="22"/>
+          <w:color w:val="2D2D2D"/>
+          <w:lang w:val="en-US" w:bidi="fa-IR"/>
+        </w:rPr>
+        <w:t>clusters.</w:t>
       </w:r>
     </w:p>
     <w:tbl>
       <w:tblPr>
-        <w:tblW w:type="auto" w:w="0"/>
+        <w:tblW w:type="dxa" w:w="9638"/>
         <w:tblLayout w:type="fixed"/>
         <w:tblLook w:firstColumn="1" w:firstRow="1" w:lastColumn="0" w:lastRow="0" w:noHBand="0" w:noVBand="1" w:val="04A0"/>
       </w:tblPr>
       <w:tblGrid>
-        <w:gridCol w:w="4819"/>
-        <w:gridCol w:w="4819"/>
+        <w:gridCol w:w="936"/>
+        <w:gridCol w:w="8702"/>
       </w:tblGrid>
       <w:tr>
         <w:tc>
@@ -170,7 +518,6 @@
             <w:pPr>
               <w:jc w:val="center"/>
             </w:pPr>
-            <w:r/>
             <w:r>
               <w:rPr>
                 <w:rFonts w:ascii="Vazirmatn" w:hAnsi="Vazirmatn" w:cs="Vazirmatn"/>
@@ -205,7 +552,6 @@
             <w:pPr>
               <w:jc w:val="start"/>
             </w:pPr>
-            <w:r/>
             <w:r>
               <w:rPr>
                 <w:rFonts w:ascii="Vazirmatn" w:hAnsi="Vazirmatn" w:cs="Vazirmatn"/>
@@ -216,31 +562,7 @@
                 <w:color w:val="2D2D2D"/>
                 <w:lang w:val="en-US" w:bidi="fa-IR"/>
               </w:rPr>
-              <w:t>Cache</w:t>
-            </w:r>
-            <w:r>
-              <w:rPr>
-                <w:rFonts w:ascii="Vazirmatn" w:hAnsi="Vazirmatn" w:cs="Vazirmatn"/>
-                <w:sz w:val="28"/>
-                <w:szCs w:val="28"/>
-                <w:b/>
-                <w:bCs/>
-                <w:color w:val="2D2D2D"/>
-                <w:lang w:val="en-US" w:bidi="fa-IR"/>
-              </w:rPr>
-              <w:t>-</w:t>
-            </w:r>
-            <w:r>
-              <w:rPr>
-                <w:rFonts w:ascii="Vazirmatn" w:hAnsi="Vazirmatn" w:cs="Vazirmatn"/>
-                <w:sz w:val="28"/>
-                <w:szCs w:val="28"/>
-                <w:b/>
-                <w:bCs/>
-                <w:color w:val="2D2D2D"/>
-                <w:lang w:val="en-US" w:bidi="fa-IR"/>
-              </w:rPr>
-              <w:t>Aside Pattern and Invalidation</w:t>
+              <w:t>Cache-Aside Pattern and Invalidation</w:t>
             </w:r>
           </w:p>
         </w:tc>
@@ -254,7 +576,7 @@
     </w:p>
     <w:p>
       <w:pPr>
-        <w:spacing w:line="324" w:lineRule="auto" w:after="120"/>
+        <w:spacing w:line="336" w:lineRule="auto" w:after="120"/>
         <w:jc w:val="both"/>
       </w:pPr>
       <w:r>
@@ -265,7 +587,7 @@
           <w:color w:val="2D2D2D"/>
           <w:lang w:val="en-US" w:bidi="fa-IR"/>
         </w:rPr>
-        <w:t>The caching architecture implements the standard Cache</w:t>
+        <w:t>The</w:t>
       </w:r>
       <w:r>
         <w:rPr>
@@ -275,7 +597,7 @@
           <w:color w:val="2D2D2D"/>
           <w:lang w:val="en-US" w:bidi="fa-IR"/>
         </w:rPr>
-        <w:t>-</w:t>
+        <w:t xml:space="preserve"> </w:t>
       </w:r>
       <w:r>
         <w:rPr>
@@ -285,7 +607,7 @@
           <w:color w:val="2D2D2D"/>
           <w:lang w:val="en-US" w:bidi="fa-IR"/>
         </w:rPr>
-        <w:t>Aside pattern combined with time</w:t>
+        <w:t>caching</w:t>
       </w:r>
       <w:r>
         <w:rPr>
@@ -295,7 +617,7 @@
           <w:color w:val="2D2D2D"/>
           <w:lang w:val="en-US" w:bidi="fa-IR"/>
         </w:rPr>
-        <w:t>-</w:t>
+        <w:t xml:space="preserve"> </w:t>
       </w:r>
       <w:r>
         <w:rPr>
@@ -305,7 +627,7 @@
           <w:color w:val="2D2D2D"/>
           <w:lang w:val="en-US" w:bidi="fa-IR"/>
         </w:rPr>
-        <w:t>to</w:t>
+        <w:t>architecture</w:t>
       </w:r>
       <w:r>
         <w:rPr>
@@ -315,7 +637,7 @@
           <w:color w:val="2D2D2D"/>
           <w:lang w:val="en-US" w:bidi="fa-IR"/>
         </w:rPr>
-        <w:t>-</w:t>
+        <w:t xml:space="preserve"> </w:t>
       </w:r>
       <w:r>
         <w:rPr>
@@ -325,7 +647,7 @@
           <w:color w:val="2D2D2D"/>
           <w:lang w:val="en-US" w:bidi="fa-IR"/>
         </w:rPr>
-        <w:t>live</w:t>
+        <w:t>implements</w:t>
       </w:r>
       <w:r>
         <w:rPr>
@@ -335,7 +657,7 @@
           <w:color w:val="2D2D2D"/>
           <w:lang w:val="en-US" w:bidi="fa-IR"/>
         </w:rPr>
-        <w:t xml:space="preserve"> (</w:t>
+        <w:t xml:space="preserve"> </w:t>
       </w:r>
       <w:r>
         <w:rPr>
@@ -345,7 +667,7 @@
           <w:color w:val="2D2D2D"/>
           <w:lang w:val="en-US" w:bidi="fa-IR"/>
         </w:rPr>
-        <w:t>TTL</w:t>
+        <w:t>the</w:t>
       </w:r>
       <w:r>
         <w:rPr>
@@ -355,7 +677,7 @@
           <w:color w:val="2D2D2D"/>
           <w:lang w:val="en-US" w:bidi="fa-IR"/>
         </w:rPr>
-        <w:t xml:space="preserve">) </w:t>
+        <w:t xml:space="preserve"> </w:t>
       </w:r>
       <w:r>
         <w:rPr>
@@ -365,7 +687,7 @@
           <w:color w:val="2D2D2D"/>
           <w:lang w:val="en-US" w:bidi="fa-IR"/>
         </w:rPr>
-        <w:t>expiration and proactive write</w:t>
+        <w:t>standard</w:t>
       </w:r>
       <w:r>
         <w:rPr>
@@ -375,7 +697,7 @@
           <w:color w:val="2D2D2D"/>
           <w:lang w:val="en-US" w:bidi="fa-IR"/>
         </w:rPr>
-        <w:t>-</w:t>
+        <w:t xml:space="preserve"> </w:t>
       </w:r>
       <w:r>
         <w:rPr>
@@ -385,7 +707,7 @@
           <w:color w:val="2D2D2D"/>
           <w:lang w:val="en-US" w:bidi="fa-IR"/>
         </w:rPr>
-        <w:t>through invalidation for sensitive database records</w:t>
+        <w:t>Cache-Aside</w:t>
       </w:r>
       <w:r>
         <w:rPr>
@@ -395,7 +717,277 @@
           <w:color w:val="2D2D2D"/>
           <w:lang w:val="en-US" w:bidi="fa-IR"/>
         </w:rPr>
-        <w:t>.</w:t>
+        <w:t xml:space="preserve"> </w:t>
+      </w:r>
+      <w:r>
+        <w:rPr>
+          <w:rFonts w:ascii="Vazirmatn" w:hAnsi="Vazirmatn" w:cs="Vazirmatn"/>
+          <w:sz w:val="22"/>
+          <w:szCs w:val="22"/>
+          <w:color w:val="2D2D2D"/>
+          <w:lang w:val="en-US" w:bidi="fa-IR"/>
+        </w:rPr>
+        <w:t>pattern</w:t>
+      </w:r>
+      <w:r>
+        <w:rPr>
+          <w:rFonts w:ascii="Vazirmatn" w:hAnsi="Vazirmatn" w:cs="Vazirmatn"/>
+          <w:sz w:val="22"/>
+          <w:szCs w:val="22"/>
+          <w:color w:val="2D2D2D"/>
+          <w:lang w:val="en-US" w:bidi="fa-IR"/>
+        </w:rPr>
+        <w:t xml:space="preserve"> </w:t>
+      </w:r>
+      <w:r>
+        <w:rPr>
+          <w:rFonts w:ascii="Vazirmatn" w:hAnsi="Vazirmatn" w:cs="Vazirmatn"/>
+          <w:sz w:val="22"/>
+          <w:szCs w:val="22"/>
+          <w:color w:val="2D2D2D"/>
+          <w:lang w:val="en-US" w:bidi="fa-IR"/>
+        </w:rPr>
+        <w:t>combined</w:t>
+      </w:r>
+      <w:r>
+        <w:rPr>
+          <w:rFonts w:ascii="Vazirmatn" w:hAnsi="Vazirmatn" w:cs="Vazirmatn"/>
+          <w:sz w:val="22"/>
+          <w:szCs w:val="22"/>
+          <w:color w:val="2D2D2D"/>
+          <w:lang w:val="en-US" w:bidi="fa-IR"/>
+        </w:rPr>
+        <w:t xml:space="preserve"> </w:t>
+      </w:r>
+      <w:r>
+        <w:rPr>
+          <w:rFonts w:ascii="Vazirmatn" w:hAnsi="Vazirmatn" w:cs="Vazirmatn"/>
+          <w:sz w:val="22"/>
+          <w:szCs w:val="22"/>
+          <w:color w:val="2D2D2D"/>
+          <w:lang w:val="en-US" w:bidi="fa-IR"/>
+        </w:rPr>
+        <w:t>with</w:t>
+      </w:r>
+      <w:r>
+        <w:rPr>
+          <w:rFonts w:ascii="Vazirmatn" w:hAnsi="Vazirmatn" w:cs="Vazirmatn"/>
+          <w:sz w:val="22"/>
+          <w:szCs w:val="22"/>
+          <w:color w:val="2D2D2D"/>
+          <w:lang w:val="en-US" w:bidi="fa-IR"/>
+        </w:rPr>
+        <w:t xml:space="preserve"> </w:t>
+      </w:r>
+      <w:r>
+        <w:rPr>
+          <w:rFonts w:ascii="Vazirmatn" w:hAnsi="Vazirmatn" w:cs="Vazirmatn"/>
+          <w:sz w:val="22"/>
+          <w:szCs w:val="22"/>
+          <w:color w:val="2D2D2D"/>
+          <w:lang w:val="en-US" w:bidi="fa-IR"/>
+        </w:rPr>
+        <w:t>time-to-live</w:t>
+      </w:r>
+      <w:r>
+        <w:rPr>
+          <w:rFonts w:ascii="Vazirmatn" w:hAnsi="Vazirmatn" w:cs="Vazirmatn"/>
+          <w:sz w:val="22"/>
+          <w:szCs w:val="22"/>
+          <w:color w:val="2D2D2D"/>
+          <w:lang w:val="en-US" w:bidi="fa-IR"/>
+        </w:rPr>
+        <w:t xml:space="preserve"> </w:t>
+      </w:r>
+      <w:r>
+        <w:rPr>
+          <w:rFonts w:ascii="Vazirmatn" w:hAnsi="Vazirmatn" w:cs="Vazirmatn"/>
+          <w:sz w:val="22"/>
+          <w:szCs w:val="22"/>
+          <w:color w:val="2D2D2D"/>
+          <w:lang w:val="en-US" w:bidi="fa-IR"/>
+        </w:rPr>
+        <w:t>(TTL)</w:t>
+      </w:r>
+      <w:r>
+        <w:rPr>
+          <w:rFonts w:ascii="Vazirmatn" w:hAnsi="Vazirmatn" w:cs="Vazirmatn"/>
+          <w:sz w:val="22"/>
+          <w:szCs w:val="22"/>
+          <w:color w:val="2D2D2D"/>
+          <w:lang w:val="en-US" w:bidi="fa-IR"/>
+        </w:rPr>
+        <w:t xml:space="preserve"> </w:t>
+      </w:r>
+      <w:r>
+        <w:rPr>
+          <w:rFonts w:ascii="Vazirmatn" w:hAnsi="Vazirmatn" w:cs="Vazirmatn"/>
+          <w:sz w:val="22"/>
+          <w:szCs w:val="22"/>
+          <w:color w:val="2D2D2D"/>
+          <w:lang w:val="en-US" w:bidi="fa-IR"/>
+        </w:rPr>
+        <w:t>expiration</w:t>
+      </w:r>
+      <w:r>
+        <w:rPr>
+          <w:rFonts w:ascii="Vazirmatn" w:hAnsi="Vazirmatn" w:cs="Vazirmatn"/>
+          <w:sz w:val="22"/>
+          <w:szCs w:val="22"/>
+          <w:color w:val="2D2D2D"/>
+          <w:lang w:val="en-US" w:bidi="fa-IR"/>
+        </w:rPr>
+        <w:t xml:space="preserve"> </w:t>
+      </w:r>
+      <w:r>
+        <w:rPr>
+          <w:rFonts w:ascii="Vazirmatn" w:hAnsi="Vazirmatn" w:cs="Vazirmatn"/>
+          <w:sz w:val="22"/>
+          <w:szCs w:val="22"/>
+          <w:color w:val="2D2D2D"/>
+          <w:lang w:val="en-US" w:bidi="fa-IR"/>
+        </w:rPr>
+        <w:t>and</w:t>
+      </w:r>
+      <w:r>
+        <w:rPr>
+          <w:rFonts w:ascii="Vazirmatn" w:hAnsi="Vazirmatn" w:cs="Vazirmatn"/>
+          <w:sz w:val="22"/>
+          <w:szCs w:val="22"/>
+          <w:color w:val="2D2D2D"/>
+          <w:lang w:val="en-US" w:bidi="fa-IR"/>
+        </w:rPr>
+        <w:t xml:space="preserve"> </w:t>
+      </w:r>
+      <w:r>
+        <w:rPr>
+          <w:rFonts w:ascii="Vazirmatn" w:hAnsi="Vazirmatn" w:cs="Vazirmatn"/>
+          <w:sz w:val="22"/>
+          <w:szCs w:val="22"/>
+          <w:color w:val="2D2D2D"/>
+          <w:lang w:val="en-US" w:bidi="fa-IR"/>
+        </w:rPr>
+        <w:t>proactive</w:t>
+      </w:r>
+      <w:r>
+        <w:rPr>
+          <w:rFonts w:ascii="Vazirmatn" w:hAnsi="Vazirmatn" w:cs="Vazirmatn"/>
+          <w:sz w:val="22"/>
+          <w:szCs w:val="22"/>
+          <w:color w:val="2D2D2D"/>
+          <w:lang w:val="en-US" w:bidi="fa-IR"/>
+        </w:rPr>
+        <w:t xml:space="preserve"> </w:t>
+      </w:r>
+      <w:r>
+        <w:rPr>
+          <w:rFonts w:ascii="Vazirmatn" w:hAnsi="Vazirmatn" w:cs="Vazirmatn"/>
+          <w:sz w:val="22"/>
+          <w:szCs w:val="22"/>
+          <w:color w:val="2D2D2D"/>
+          <w:lang w:val="en-US" w:bidi="fa-IR"/>
+        </w:rPr>
+        <w:t>write-through</w:t>
+      </w:r>
+      <w:r>
+        <w:rPr>
+          <w:rFonts w:ascii="Vazirmatn" w:hAnsi="Vazirmatn" w:cs="Vazirmatn"/>
+          <w:sz w:val="22"/>
+          <w:szCs w:val="22"/>
+          <w:color w:val="2D2D2D"/>
+          <w:lang w:val="en-US" w:bidi="fa-IR"/>
+        </w:rPr>
+        <w:t xml:space="preserve"> </w:t>
+      </w:r>
+      <w:r>
+        <w:rPr>
+          <w:rFonts w:ascii="Vazirmatn" w:hAnsi="Vazirmatn" w:cs="Vazirmatn"/>
+          <w:sz w:val="22"/>
+          <w:szCs w:val="22"/>
+          <w:color w:val="2D2D2D"/>
+          <w:lang w:val="en-US" w:bidi="fa-IR"/>
+        </w:rPr>
+        <w:t>invalidation</w:t>
+      </w:r>
+      <w:r>
+        <w:rPr>
+          <w:rFonts w:ascii="Vazirmatn" w:hAnsi="Vazirmatn" w:cs="Vazirmatn"/>
+          <w:sz w:val="22"/>
+          <w:szCs w:val="22"/>
+          <w:color w:val="2D2D2D"/>
+          <w:lang w:val="en-US" w:bidi="fa-IR"/>
+        </w:rPr>
+        <w:t xml:space="preserve"> </w:t>
+      </w:r>
+      <w:r>
+        <w:rPr>
+          <w:rFonts w:ascii="Vazirmatn" w:hAnsi="Vazirmatn" w:cs="Vazirmatn"/>
+          <w:sz w:val="22"/>
+          <w:szCs w:val="22"/>
+          <w:color w:val="2D2D2D"/>
+          <w:lang w:val="en-US" w:bidi="fa-IR"/>
+        </w:rPr>
+        <w:t>for</w:t>
+      </w:r>
+      <w:r>
+        <w:rPr>
+          <w:rFonts w:ascii="Vazirmatn" w:hAnsi="Vazirmatn" w:cs="Vazirmatn"/>
+          <w:sz w:val="22"/>
+          <w:szCs w:val="22"/>
+          <w:color w:val="2D2D2D"/>
+          <w:lang w:val="en-US" w:bidi="fa-IR"/>
+        </w:rPr>
+        <w:t xml:space="preserve"> </w:t>
+      </w:r>
+      <w:r>
+        <w:rPr>
+          <w:rFonts w:ascii="Vazirmatn" w:hAnsi="Vazirmatn" w:cs="Vazirmatn"/>
+          <w:sz w:val="22"/>
+          <w:szCs w:val="22"/>
+          <w:color w:val="2D2D2D"/>
+          <w:lang w:val="en-US" w:bidi="fa-IR"/>
+        </w:rPr>
+        <w:t>sensitive</w:t>
+      </w:r>
+      <w:r>
+        <w:rPr>
+          <w:rFonts w:ascii="Vazirmatn" w:hAnsi="Vazirmatn" w:cs="Vazirmatn"/>
+          <w:sz w:val="22"/>
+          <w:szCs w:val="22"/>
+          <w:color w:val="2D2D2D"/>
+          <w:lang w:val="en-US" w:bidi="fa-IR"/>
+        </w:rPr>
+        <w:t xml:space="preserve"> </w:t>
+      </w:r>
+      <w:r>
+        <w:rPr>
+          <w:rFonts w:ascii="Vazirmatn" w:hAnsi="Vazirmatn" w:cs="Vazirmatn"/>
+          <w:sz w:val="22"/>
+          <w:szCs w:val="22"/>
+          <w:color w:val="2D2D2D"/>
+          <w:lang w:val="en-US" w:bidi="fa-IR"/>
+        </w:rPr>
+        <w:t>database</w:t>
+      </w:r>
+      <w:r>
+        <w:rPr>
+          <w:rFonts w:ascii="Vazirmatn" w:hAnsi="Vazirmatn" w:cs="Vazirmatn"/>
+          <w:sz w:val="22"/>
+          <w:szCs w:val="22"/>
+          <w:color w:val="2D2D2D"/>
+          <w:lang w:val="en-US" w:bidi="fa-IR"/>
+        </w:rPr>
+        <w:t xml:space="preserve"> </w:t>
+      </w:r>
+      <w:r>
+        <w:rPr>
+          <w:rFonts w:ascii="Vazirmatn" w:hAnsi="Vazirmatn" w:cs="Vazirmatn"/>
+          <w:sz w:val="22"/>
+          <w:szCs w:val="22"/>
+          <w:color w:val="2D2D2D"/>
+          <w:lang w:val="en-US" w:bidi="fa-IR"/>
+        </w:rPr>
+        <w:t>records.</w:t>
       </w:r>
     </w:p>
     <w:tbl>
@@ -429,7 +1021,6 @@
             <w:pPr>
               <w:jc w:val="start"/>
             </w:pPr>
-            <w:r/>
             <w:r>
               <w:rPr>
                 <w:rFonts w:ascii="Vazirmatn" w:hAnsi="Vazirmatn" w:cs="Vazirmatn"/>
@@ -477,10 +1068,9 @@
           </w:tcPr>
           <w:p>
             <w:pPr>
-              <w:spacing w:line="324" w:lineRule="auto" w:after="120"/>
+              <w:spacing w:line="276" w:lineRule="auto" w:after="80"/>
               <w:jc w:val="both"/>
             </w:pPr>
-            <w:r/>
             <w:r>
               <w:rPr>
                 <w:rFonts w:ascii="Vazirmatn" w:hAnsi="Vazirmatn" w:cs="Vazirmatn"/>
@@ -489,7 +1079,7 @@
                 <w:color w:val="2D2D2D"/>
                 <w:lang w:val="en-US" w:bidi="fa-IR"/>
               </w:rPr>
-              <w:t>Read replicas can experience brief replication lag during heavy write spikes</w:t>
+              <w:t>Read</w:t>
             </w:r>
             <w:r>
               <w:rPr>
@@ -499,7 +1089,7 @@
                 <w:color w:val="2D2D2D"/>
                 <w:lang w:val="en-US" w:bidi="fa-IR"/>
               </w:rPr>
-              <w:t xml:space="preserve">. </w:t>
+              <w:t xml:space="preserve"> </w:t>
             </w:r>
             <w:r>
               <w:rPr>
@@ -509,7 +1099,7 @@
                 <w:color w:val="2D2D2D"/>
                 <w:lang w:val="en-US" w:bidi="fa-IR"/>
               </w:rPr>
-              <w:t>For strictly consistent read operations</w:t>
+              <w:t>replicas</w:t>
             </w:r>
             <w:r>
               <w:rPr>
@@ -519,7 +1109,7 @@
                 <w:color w:val="2D2D2D"/>
                 <w:lang w:val="en-US" w:bidi="fa-IR"/>
               </w:rPr>
-              <w:t xml:space="preserve">, </w:t>
+              <w:t xml:space="preserve"> </w:t>
             </w:r>
             <w:r>
               <w:rPr>
@@ -529,7 +1119,7 @@
                 <w:color w:val="2D2D2D"/>
                 <w:lang w:val="en-US" w:bidi="fa-IR"/>
               </w:rPr>
-              <w:t>route queries to the primary database node</w:t>
+              <w:t>can</w:t>
             </w:r>
             <w:r>
               <w:rPr>
@@ -539,7 +1129,407 @@
                 <w:color w:val="2D2D2D"/>
                 <w:lang w:val="en-US" w:bidi="fa-IR"/>
               </w:rPr>
-              <w:t>.</w:t>
+              <w:t xml:space="preserve"> </w:t>
+            </w:r>
+            <w:r>
+              <w:rPr>
+                <w:rFonts w:ascii="Vazirmatn" w:hAnsi="Vazirmatn" w:cs="Vazirmatn"/>
+                <w:sz w:val="21"/>
+                <w:szCs w:val="21"/>
+                <w:color w:val="2D2D2D"/>
+                <w:lang w:val="en-US" w:bidi="fa-IR"/>
+              </w:rPr>
+              <w:t>experience</w:t>
+            </w:r>
+            <w:r>
+              <w:rPr>
+                <w:rFonts w:ascii="Vazirmatn" w:hAnsi="Vazirmatn" w:cs="Vazirmatn"/>
+                <w:sz w:val="21"/>
+                <w:szCs w:val="21"/>
+                <w:color w:val="2D2D2D"/>
+                <w:lang w:val="en-US" w:bidi="fa-IR"/>
+              </w:rPr>
+              <w:t xml:space="preserve"> </w:t>
+            </w:r>
+            <w:r>
+              <w:rPr>
+                <w:rFonts w:ascii="Vazirmatn" w:hAnsi="Vazirmatn" w:cs="Vazirmatn"/>
+                <w:sz w:val="21"/>
+                <w:szCs w:val="21"/>
+                <w:color w:val="2D2D2D"/>
+                <w:lang w:val="en-US" w:bidi="fa-IR"/>
+              </w:rPr>
+              <w:t>brief</w:t>
+            </w:r>
+            <w:r>
+              <w:rPr>
+                <w:rFonts w:ascii="Vazirmatn" w:hAnsi="Vazirmatn" w:cs="Vazirmatn"/>
+                <w:sz w:val="21"/>
+                <w:szCs w:val="21"/>
+                <w:color w:val="2D2D2D"/>
+                <w:lang w:val="en-US" w:bidi="fa-IR"/>
+              </w:rPr>
+              <w:t xml:space="preserve"> </w:t>
+            </w:r>
+            <w:r>
+              <w:rPr>
+                <w:rFonts w:ascii="Vazirmatn" w:hAnsi="Vazirmatn" w:cs="Vazirmatn"/>
+                <w:sz w:val="21"/>
+                <w:szCs w:val="21"/>
+                <w:color w:val="2D2D2D"/>
+                <w:lang w:val="en-US" w:bidi="fa-IR"/>
+              </w:rPr>
+              <w:t>replication</w:t>
+            </w:r>
+            <w:r>
+              <w:rPr>
+                <w:rFonts w:ascii="Vazirmatn" w:hAnsi="Vazirmatn" w:cs="Vazirmatn"/>
+                <w:sz w:val="21"/>
+                <w:szCs w:val="21"/>
+                <w:color w:val="2D2D2D"/>
+                <w:lang w:val="en-US" w:bidi="fa-IR"/>
+              </w:rPr>
+              <w:t xml:space="preserve"> </w:t>
+            </w:r>
+            <w:r>
+              <w:rPr>
+                <w:rFonts w:ascii="Vazirmatn" w:hAnsi="Vazirmatn" w:cs="Vazirmatn"/>
+                <w:sz w:val="21"/>
+                <w:szCs w:val="21"/>
+                <w:color w:val="2D2D2D"/>
+                <w:lang w:val="en-US" w:bidi="fa-IR"/>
+              </w:rPr>
+              <w:t>lag</w:t>
+            </w:r>
+            <w:r>
+              <w:rPr>
+                <w:rFonts w:ascii="Vazirmatn" w:hAnsi="Vazirmatn" w:cs="Vazirmatn"/>
+                <w:sz w:val="21"/>
+                <w:szCs w:val="21"/>
+                <w:color w:val="2D2D2D"/>
+                <w:lang w:val="en-US" w:bidi="fa-IR"/>
+              </w:rPr>
+              <w:t xml:space="preserve"> </w:t>
+            </w:r>
+            <w:r>
+              <w:rPr>
+                <w:rFonts w:ascii="Vazirmatn" w:hAnsi="Vazirmatn" w:cs="Vazirmatn"/>
+                <w:sz w:val="21"/>
+                <w:szCs w:val="21"/>
+                <w:color w:val="2D2D2D"/>
+                <w:lang w:val="en-US" w:bidi="fa-IR"/>
+              </w:rPr>
+              <w:t>during</w:t>
+            </w:r>
+            <w:r>
+              <w:rPr>
+                <w:rFonts w:ascii="Vazirmatn" w:hAnsi="Vazirmatn" w:cs="Vazirmatn"/>
+                <w:sz w:val="21"/>
+                <w:szCs w:val="21"/>
+                <w:color w:val="2D2D2D"/>
+                <w:lang w:val="en-US" w:bidi="fa-IR"/>
+              </w:rPr>
+              <w:t xml:space="preserve"> </w:t>
+            </w:r>
+            <w:r>
+              <w:rPr>
+                <w:rFonts w:ascii="Vazirmatn" w:hAnsi="Vazirmatn" w:cs="Vazirmatn"/>
+                <w:sz w:val="21"/>
+                <w:szCs w:val="21"/>
+                <w:color w:val="2D2D2D"/>
+                <w:lang w:val="en-US" w:bidi="fa-IR"/>
+              </w:rPr>
+              <w:t>heavy</w:t>
+            </w:r>
+            <w:r>
+              <w:rPr>
+                <w:rFonts w:ascii="Vazirmatn" w:hAnsi="Vazirmatn" w:cs="Vazirmatn"/>
+                <w:sz w:val="21"/>
+                <w:szCs w:val="21"/>
+                <w:color w:val="2D2D2D"/>
+                <w:lang w:val="en-US" w:bidi="fa-IR"/>
+              </w:rPr>
+              <w:t xml:space="preserve"> </w:t>
+            </w:r>
+            <w:r>
+              <w:rPr>
+                <w:rFonts w:ascii="Vazirmatn" w:hAnsi="Vazirmatn" w:cs="Vazirmatn"/>
+                <w:sz w:val="21"/>
+                <w:szCs w:val="21"/>
+                <w:color w:val="2D2D2D"/>
+                <w:lang w:val="en-US" w:bidi="fa-IR"/>
+              </w:rPr>
+              <w:t>write</w:t>
+            </w:r>
+            <w:r>
+              <w:rPr>
+                <w:rFonts w:ascii="Vazirmatn" w:hAnsi="Vazirmatn" w:cs="Vazirmatn"/>
+                <w:sz w:val="21"/>
+                <w:szCs w:val="21"/>
+                <w:color w:val="2D2D2D"/>
+                <w:lang w:val="en-US" w:bidi="fa-IR"/>
+              </w:rPr>
+              <w:t xml:space="preserve"> </w:t>
+            </w:r>
+            <w:r>
+              <w:rPr>
+                <w:rFonts w:ascii="Vazirmatn" w:hAnsi="Vazirmatn" w:cs="Vazirmatn"/>
+                <w:sz w:val="21"/>
+                <w:szCs w:val="21"/>
+                <w:color w:val="2D2D2D"/>
+                <w:lang w:val="en-US" w:bidi="fa-IR"/>
+              </w:rPr>
+              <w:t>spikes.</w:t>
+            </w:r>
+            <w:r>
+              <w:rPr>
+                <w:rFonts w:ascii="Vazirmatn" w:hAnsi="Vazirmatn" w:cs="Vazirmatn"/>
+                <w:sz w:val="21"/>
+                <w:szCs w:val="21"/>
+                <w:color w:val="2D2D2D"/>
+                <w:lang w:val="en-US" w:bidi="fa-IR"/>
+              </w:rPr>
+              <w:t xml:space="preserve"> </w:t>
+            </w:r>
+            <w:r>
+              <w:rPr>
+                <w:rFonts w:ascii="Vazirmatn" w:hAnsi="Vazirmatn" w:cs="Vazirmatn"/>
+                <w:sz w:val="21"/>
+                <w:szCs w:val="21"/>
+                <w:color w:val="2D2D2D"/>
+                <w:lang w:val="en-US" w:bidi="fa-IR"/>
+              </w:rPr>
+              <w:t>For</w:t>
+            </w:r>
+            <w:r>
+              <w:rPr>
+                <w:rFonts w:ascii="Vazirmatn" w:hAnsi="Vazirmatn" w:cs="Vazirmatn"/>
+                <w:sz w:val="21"/>
+                <w:szCs w:val="21"/>
+                <w:color w:val="2D2D2D"/>
+                <w:lang w:val="en-US" w:bidi="fa-IR"/>
+              </w:rPr>
+              <w:t xml:space="preserve"> </w:t>
+            </w:r>
+            <w:r>
+              <w:rPr>
+                <w:rFonts w:ascii="Vazirmatn" w:hAnsi="Vazirmatn" w:cs="Vazirmatn"/>
+                <w:sz w:val="21"/>
+                <w:szCs w:val="21"/>
+                <w:color w:val="2D2D2D"/>
+                <w:lang w:val="en-US" w:bidi="fa-IR"/>
+              </w:rPr>
+              <w:t>strictly</w:t>
+            </w:r>
+            <w:r>
+              <w:rPr>
+                <w:rFonts w:ascii="Vazirmatn" w:hAnsi="Vazirmatn" w:cs="Vazirmatn"/>
+                <w:sz w:val="21"/>
+                <w:szCs w:val="21"/>
+                <w:color w:val="2D2D2D"/>
+                <w:lang w:val="en-US" w:bidi="fa-IR"/>
+              </w:rPr>
+              <w:t xml:space="preserve"> </w:t>
+            </w:r>
+            <w:r>
+              <w:rPr>
+                <w:rFonts w:ascii="Vazirmatn" w:hAnsi="Vazirmatn" w:cs="Vazirmatn"/>
+                <w:sz w:val="21"/>
+                <w:szCs w:val="21"/>
+                <w:color w:val="2D2D2D"/>
+                <w:lang w:val="en-US" w:bidi="fa-IR"/>
+              </w:rPr>
+              <w:t>consistent</w:t>
+            </w:r>
+            <w:r>
+              <w:rPr>
+                <w:rFonts w:ascii="Vazirmatn" w:hAnsi="Vazirmatn" w:cs="Vazirmatn"/>
+                <w:sz w:val="21"/>
+                <w:szCs w:val="21"/>
+                <w:color w:val="2D2D2D"/>
+                <w:lang w:val="en-US" w:bidi="fa-IR"/>
+              </w:rPr>
+              <w:t xml:space="preserve"> </w:t>
+            </w:r>
+            <w:r>
+              <w:rPr>
+                <w:rFonts w:ascii="Vazirmatn" w:hAnsi="Vazirmatn" w:cs="Vazirmatn"/>
+                <w:sz w:val="21"/>
+                <w:szCs w:val="21"/>
+                <w:color w:val="2D2D2D"/>
+                <w:lang w:val="en-US" w:bidi="fa-IR"/>
+              </w:rPr>
+              <w:t>read</w:t>
+            </w:r>
+            <w:r>
+              <w:rPr>
+                <w:rFonts w:ascii="Vazirmatn" w:hAnsi="Vazirmatn" w:cs="Vazirmatn"/>
+                <w:sz w:val="21"/>
+                <w:szCs w:val="21"/>
+                <w:color w:val="2D2D2D"/>
+                <w:lang w:val="en-US" w:bidi="fa-IR"/>
+              </w:rPr>
+              <w:t xml:space="preserve"> </w:t>
+            </w:r>
+            <w:r>
+              <w:rPr>
+                <w:rFonts w:ascii="Vazirmatn" w:hAnsi="Vazirmatn" w:cs="Vazirmatn"/>
+                <w:sz w:val="21"/>
+                <w:szCs w:val="21"/>
+                <w:color w:val="2D2D2D"/>
+                <w:lang w:val="en-US" w:bidi="fa-IR"/>
+              </w:rPr>
+              <w:t>operations</w:t>
+            </w:r>
+            <w:r>
+              <w:rPr>
+                <w:rFonts w:ascii="Vazirmatn" w:hAnsi="Vazirmatn" w:cs="Vazirmatn"/>
+                <w:sz w:val="21"/>
+                <w:szCs w:val="21"/>
+                <w:color w:val="2D2D2D"/>
+                <w:lang w:val="en-US" w:bidi="fa-IR"/>
+              </w:rPr>
+              <w:t>,</w:t>
+            </w:r>
+            <w:r>
+              <w:rPr>
+                <w:rFonts w:ascii="Vazirmatn" w:hAnsi="Vazirmatn" w:cs="Vazirmatn"/>
+                <w:sz w:val="21"/>
+                <w:szCs w:val="21"/>
+                <w:color w:val="2D2D2D"/>
+                <w:lang w:val="en-US" w:bidi="fa-IR"/>
+              </w:rPr>
+              <w:t xml:space="preserve"> </w:t>
+            </w:r>
+            <w:r>
+              <w:rPr>
+                <w:rFonts w:ascii="Vazirmatn" w:hAnsi="Vazirmatn" w:cs="Vazirmatn"/>
+                <w:sz w:val="21"/>
+                <w:szCs w:val="21"/>
+                <w:color w:val="2D2D2D"/>
+                <w:lang w:val="en-US" w:bidi="fa-IR"/>
+              </w:rPr>
+              <w:t>route</w:t>
+            </w:r>
+            <w:r>
+              <w:rPr>
+                <w:rFonts w:ascii="Vazirmatn" w:hAnsi="Vazirmatn" w:cs="Vazirmatn"/>
+                <w:sz w:val="21"/>
+                <w:szCs w:val="21"/>
+                <w:color w:val="2D2D2D"/>
+                <w:lang w:val="en-US" w:bidi="fa-IR"/>
+              </w:rPr>
+              <w:t xml:space="preserve"> </w:t>
+            </w:r>
+            <w:r>
+              <w:rPr>
+                <w:rFonts w:ascii="Vazirmatn" w:hAnsi="Vazirmatn" w:cs="Vazirmatn"/>
+                <w:sz w:val="21"/>
+                <w:szCs w:val="21"/>
+                <w:color w:val="2D2D2D"/>
+                <w:lang w:val="en-US" w:bidi="fa-IR"/>
+              </w:rPr>
+              <w:t>queries</w:t>
+            </w:r>
+            <w:r>
+              <w:rPr>
+                <w:rFonts w:ascii="Vazirmatn" w:hAnsi="Vazirmatn" w:cs="Vazirmatn"/>
+                <w:sz w:val="21"/>
+                <w:szCs w:val="21"/>
+                <w:color w:val="2D2D2D"/>
+                <w:lang w:val="en-US" w:bidi="fa-IR"/>
+              </w:rPr>
+              <w:t xml:space="preserve"> </w:t>
+            </w:r>
+            <w:r>
+              <w:rPr>
+                <w:rFonts w:ascii="Vazirmatn" w:hAnsi="Vazirmatn" w:cs="Vazirmatn"/>
+                <w:sz w:val="21"/>
+                <w:szCs w:val="21"/>
+                <w:color w:val="2D2D2D"/>
+                <w:lang w:val="en-US" w:bidi="fa-IR"/>
+              </w:rPr>
+              <w:t>to</w:t>
+            </w:r>
+            <w:r>
+              <w:rPr>
+                <w:rFonts w:ascii="Vazirmatn" w:hAnsi="Vazirmatn" w:cs="Vazirmatn"/>
+                <w:sz w:val="21"/>
+                <w:szCs w:val="21"/>
+                <w:color w:val="2D2D2D"/>
+                <w:lang w:val="en-US" w:bidi="fa-IR"/>
+              </w:rPr>
+              <w:t xml:space="preserve"> </w:t>
+            </w:r>
+            <w:r>
+              <w:rPr>
+                <w:rFonts w:ascii="Vazirmatn" w:hAnsi="Vazirmatn" w:cs="Vazirmatn"/>
+                <w:sz w:val="21"/>
+                <w:szCs w:val="21"/>
+                <w:color w:val="2D2D2D"/>
+                <w:lang w:val="en-US" w:bidi="fa-IR"/>
+              </w:rPr>
+              <w:t>the</w:t>
+            </w:r>
+            <w:r>
+              <w:rPr>
+                <w:rFonts w:ascii="Vazirmatn" w:hAnsi="Vazirmatn" w:cs="Vazirmatn"/>
+                <w:sz w:val="21"/>
+                <w:szCs w:val="21"/>
+                <w:color w:val="2D2D2D"/>
+                <w:lang w:val="en-US" w:bidi="fa-IR"/>
+              </w:rPr>
+              <w:t xml:space="preserve"> </w:t>
+            </w:r>
+            <w:r>
+              <w:rPr>
+                <w:rFonts w:ascii="Vazirmatn" w:hAnsi="Vazirmatn" w:cs="Vazirmatn"/>
+                <w:sz w:val="21"/>
+                <w:szCs w:val="21"/>
+                <w:color w:val="2D2D2D"/>
+                <w:lang w:val="en-US" w:bidi="fa-IR"/>
+              </w:rPr>
+              <w:t>primary</w:t>
+            </w:r>
+            <w:r>
+              <w:rPr>
+                <w:rFonts w:ascii="Vazirmatn" w:hAnsi="Vazirmatn" w:cs="Vazirmatn"/>
+                <w:sz w:val="21"/>
+                <w:szCs w:val="21"/>
+                <w:color w:val="2D2D2D"/>
+                <w:lang w:val="en-US" w:bidi="fa-IR"/>
+              </w:rPr>
+              <w:t xml:space="preserve"> </w:t>
+            </w:r>
+            <w:r>
+              <w:rPr>
+                <w:rFonts w:ascii="Vazirmatn" w:hAnsi="Vazirmatn" w:cs="Vazirmatn"/>
+                <w:sz w:val="21"/>
+                <w:szCs w:val="21"/>
+                <w:color w:val="2D2D2D"/>
+                <w:lang w:val="en-US" w:bidi="fa-IR"/>
+              </w:rPr>
+              <w:t>database</w:t>
+            </w:r>
+            <w:r>
+              <w:rPr>
+                <w:rFonts w:ascii="Vazirmatn" w:hAnsi="Vazirmatn" w:cs="Vazirmatn"/>
+                <w:sz w:val="21"/>
+                <w:szCs w:val="21"/>
+                <w:color w:val="2D2D2D"/>
+                <w:lang w:val="en-US" w:bidi="fa-IR"/>
+              </w:rPr>
+              <w:t xml:space="preserve"> </w:t>
+            </w:r>
+            <w:r>
+              <w:rPr>
+                <w:rFonts w:ascii="Vazirmatn" w:hAnsi="Vazirmatn" w:cs="Vazirmatn"/>
+                <w:sz w:val="21"/>
+                <w:szCs w:val="21"/>
+                <w:color w:val="2D2D2D"/>
+                <w:lang w:val="en-US" w:bidi="fa-IR"/>
+              </w:rPr>
+              <w:t>node.</w:t>
             </w:r>
           </w:p>
         </w:tc>
@@ -582,7 +1572,6 @@
             <w:pPr>
               <w:jc w:val="start"/>
             </w:pPr>
-            <w:r/>
             <w:r>
               <w:rPr>
                 <w:rFonts w:ascii="Vazirmatn" w:hAnsi="Vazirmatn" w:cs="Vazirmatn"/>
@@ -618,10 +1607,9 @@
           </w:tcPr>
           <w:p>
             <w:pPr>
-              <w:spacing w:line="324" w:lineRule="auto" w:after="120"/>
+              <w:spacing w:line="276" w:lineRule="auto" w:after="80"/>
               <w:jc w:val="both"/>
             </w:pPr>
-            <w:r/>
             <w:r>
               <w:rPr>
                 <w:rFonts w:ascii="Vazirmatn" w:hAnsi="Vazirmatn" w:cs="Vazirmatn"/>
@@ -630,7 +1618,7 @@
                 <w:color w:val="2D2D2D"/>
                 <w:lang w:val="en-US" w:bidi="fa-IR"/>
               </w:rPr>
-              <w:t>Ensure that maxmemory</w:t>
+              <w:t>Ensure</w:t>
             </w:r>
             <w:r>
               <w:rPr>
@@ -640,7 +1628,7 @@
                 <w:color w:val="2D2D2D"/>
                 <w:lang w:val="en-US" w:bidi="fa-IR"/>
               </w:rPr>
-              <w:t>-</w:t>
+              <w:t xml:space="preserve"> </w:t>
             </w:r>
             <w:r>
               <w:rPr>
@@ -650,7 +1638,7 @@
                 <w:color w:val="2D2D2D"/>
                 <w:lang w:val="en-US" w:bidi="fa-IR"/>
               </w:rPr>
-              <w:t>policy is configured to volatile</w:t>
+              <w:t>that</w:t>
             </w:r>
             <w:r>
               <w:rPr>
@@ -660,7 +1648,17 @@
                 <w:color w:val="2D2D2D"/>
                 <w:lang w:val="en-US" w:bidi="fa-IR"/>
               </w:rPr>
-              <w:t>-</w:t>
+              <w:t xml:space="preserve"> </w:t>
+            </w:r>
+            <w:r>
+              <w:rPr>
+                <w:rFonts w:ascii="Courier New" w:hAnsi="Courier New" w:cs="Courier New"/>
+                <w:sz w:val="21"/>
+                <w:szCs w:val="21"/>
+                <w:color w:val="2D2D2D"/>
+                <w:lang w:val="en-US" w:bidi="fa-IR"/>
+              </w:rPr>
+              <w:t>maxmemory-policy</w:t>
             </w:r>
             <w:r>
               <w:rPr>
@@ -670,7 +1668,7 @@
                 <w:color w:val="2D2D2D"/>
                 <w:lang w:val="en-US" w:bidi="fa-IR"/>
               </w:rPr>
-              <w:t>lru in production so that persistent auth tokens are never evicted prematurely</w:t>
+              <w:t xml:space="preserve"> </w:t>
             </w:r>
             <w:r>
               <w:rPr>
@@ -680,7 +1678,287 @@
                 <w:color w:val="2D2D2D"/>
                 <w:lang w:val="en-US" w:bidi="fa-IR"/>
               </w:rPr>
-              <w:t>.</w:t>
+              <w:t>is</w:t>
+            </w:r>
+            <w:r>
+              <w:rPr>
+                <w:rFonts w:ascii="Vazirmatn" w:hAnsi="Vazirmatn" w:cs="Vazirmatn"/>
+                <w:sz w:val="21"/>
+                <w:szCs w:val="21"/>
+                <w:color w:val="2D2D2D"/>
+                <w:lang w:val="en-US" w:bidi="fa-IR"/>
+              </w:rPr>
+              <w:t xml:space="preserve"> </w:t>
+            </w:r>
+            <w:r>
+              <w:rPr>
+                <w:rFonts w:ascii="Vazirmatn" w:hAnsi="Vazirmatn" w:cs="Vazirmatn"/>
+                <w:sz w:val="21"/>
+                <w:szCs w:val="21"/>
+                <w:color w:val="2D2D2D"/>
+                <w:lang w:val="en-US" w:bidi="fa-IR"/>
+              </w:rPr>
+              <w:t>configured</w:t>
+            </w:r>
+            <w:r>
+              <w:rPr>
+                <w:rFonts w:ascii="Vazirmatn" w:hAnsi="Vazirmatn" w:cs="Vazirmatn"/>
+                <w:sz w:val="21"/>
+                <w:szCs w:val="21"/>
+                <w:color w:val="2D2D2D"/>
+                <w:lang w:val="en-US" w:bidi="fa-IR"/>
+              </w:rPr>
+              <w:t xml:space="preserve"> </w:t>
+            </w:r>
+            <w:r>
+              <w:rPr>
+                <w:rFonts w:ascii="Vazirmatn" w:hAnsi="Vazirmatn" w:cs="Vazirmatn"/>
+                <w:sz w:val="21"/>
+                <w:szCs w:val="21"/>
+                <w:color w:val="2D2D2D"/>
+                <w:lang w:val="en-US" w:bidi="fa-IR"/>
+              </w:rPr>
+              <w:t>to</w:t>
+            </w:r>
+            <w:r>
+              <w:rPr>
+                <w:rFonts w:ascii="Vazirmatn" w:hAnsi="Vazirmatn" w:cs="Vazirmatn"/>
+                <w:sz w:val="21"/>
+                <w:szCs w:val="21"/>
+                <w:color w:val="2D2D2D"/>
+                <w:lang w:val="en-US" w:bidi="fa-IR"/>
+              </w:rPr>
+              <w:t xml:space="preserve"> </w:t>
+            </w:r>
+            <w:r>
+              <w:rPr>
+                <w:rFonts w:ascii="Courier New" w:hAnsi="Courier New" w:cs="Courier New"/>
+                <w:sz w:val="21"/>
+                <w:szCs w:val="21"/>
+                <w:color w:val="2D2D2D"/>
+                <w:lang w:val="en-US" w:bidi="fa-IR"/>
+              </w:rPr>
+              <w:t>volatile-lru</w:t>
+            </w:r>
+            <w:r>
+              <w:rPr>
+                <w:rFonts w:ascii="Vazirmatn" w:hAnsi="Vazirmatn" w:cs="Vazirmatn"/>
+                <w:sz w:val="21"/>
+                <w:szCs w:val="21"/>
+                <w:color w:val="2D2D2D"/>
+                <w:lang w:val="en-US" w:bidi="fa-IR"/>
+              </w:rPr>
+              <w:t xml:space="preserve"> </w:t>
+            </w:r>
+            <w:r>
+              <w:rPr>
+                <w:rFonts w:ascii="Vazirmatn" w:hAnsi="Vazirmatn" w:cs="Vazirmatn"/>
+                <w:sz w:val="21"/>
+                <w:szCs w:val="21"/>
+                <w:color w:val="2D2D2D"/>
+                <w:lang w:val="en-US" w:bidi="fa-IR"/>
+              </w:rPr>
+              <w:t>in</w:t>
+            </w:r>
+            <w:r>
+              <w:rPr>
+                <w:rFonts w:ascii="Vazirmatn" w:hAnsi="Vazirmatn" w:cs="Vazirmatn"/>
+                <w:sz w:val="21"/>
+                <w:szCs w:val="21"/>
+                <w:color w:val="2D2D2D"/>
+                <w:lang w:val="en-US" w:bidi="fa-IR"/>
+              </w:rPr>
+              <w:t xml:space="preserve"> </w:t>
+            </w:r>
+            <w:r>
+              <w:rPr>
+                <w:rFonts w:ascii="Vazirmatn" w:hAnsi="Vazirmatn" w:cs="Vazirmatn"/>
+                <w:sz w:val="21"/>
+                <w:szCs w:val="21"/>
+                <w:color w:val="2D2D2D"/>
+                <w:lang w:val="en-US" w:bidi="fa-IR"/>
+              </w:rPr>
+              <w:t>production</w:t>
+            </w:r>
+            <w:r>
+              <w:rPr>
+                <w:rFonts w:ascii="Vazirmatn" w:hAnsi="Vazirmatn" w:cs="Vazirmatn"/>
+                <w:sz w:val="21"/>
+                <w:szCs w:val="21"/>
+                <w:color w:val="2D2D2D"/>
+                <w:lang w:val="en-US" w:bidi="fa-IR"/>
+              </w:rPr>
+              <w:t xml:space="preserve"> </w:t>
+            </w:r>
+            <w:r>
+              <w:rPr>
+                <w:rFonts w:ascii="Vazirmatn" w:hAnsi="Vazirmatn" w:cs="Vazirmatn"/>
+                <w:sz w:val="21"/>
+                <w:szCs w:val="21"/>
+                <w:color w:val="2D2D2D"/>
+                <w:lang w:val="en-US" w:bidi="fa-IR"/>
+              </w:rPr>
+              <w:t>so</w:t>
+            </w:r>
+            <w:r>
+              <w:rPr>
+                <w:rFonts w:ascii="Vazirmatn" w:hAnsi="Vazirmatn" w:cs="Vazirmatn"/>
+                <w:sz w:val="21"/>
+                <w:szCs w:val="21"/>
+                <w:color w:val="2D2D2D"/>
+                <w:lang w:val="en-US" w:bidi="fa-IR"/>
+              </w:rPr>
+              <w:t xml:space="preserve"> </w:t>
+            </w:r>
+            <w:r>
+              <w:rPr>
+                <w:rFonts w:ascii="Vazirmatn" w:hAnsi="Vazirmatn" w:cs="Vazirmatn"/>
+                <w:sz w:val="21"/>
+                <w:szCs w:val="21"/>
+                <w:color w:val="2D2D2D"/>
+                <w:lang w:val="en-US" w:bidi="fa-IR"/>
+              </w:rPr>
+              <w:t>that</w:t>
+            </w:r>
+            <w:r>
+              <w:rPr>
+                <w:rFonts w:ascii="Vazirmatn" w:hAnsi="Vazirmatn" w:cs="Vazirmatn"/>
+                <w:sz w:val="21"/>
+                <w:szCs w:val="21"/>
+                <w:color w:val="2D2D2D"/>
+                <w:lang w:val="en-US" w:bidi="fa-IR"/>
+              </w:rPr>
+              <w:t xml:space="preserve"> </w:t>
+            </w:r>
+            <w:r>
+              <w:rPr>
+                <w:rFonts w:ascii="Vazirmatn" w:hAnsi="Vazirmatn" w:cs="Vazirmatn"/>
+                <w:sz w:val="21"/>
+                <w:szCs w:val="21"/>
+                <w:color w:val="2D2D2D"/>
+                <w:lang w:val="en-US" w:bidi="fa-IR"/>
+              </w:rPr>
+              <w:t>persistent</w:t>
+            </w:r>
+            <w:r>
+              <w:rPr>
+                <w:rFonts w:ascii="Vazirmatn" w:hAnsi="Vazirmatn" w:cs="Vazirmatn"/>
+                <w:sz w:val="21"/>
+                <w:szCs w:val="21"/>
+                <w:color w:val="2D2D2D"/>
+                <w:lang w:val="en-US" w:bidi="fa-IR"/>
+              </w:rPr>
+              <w:t xml:space="preserve"> </w:t>
+            </w:r>
+            <w:r>
+              <w:rPr>
+                <w:rFonts w:ascii="Vazirmatn" w:hAnsi="Vazirmatn" w:cs="Vazirmatn"/>
+                <w:sz w:val="21"/>
+                <w:szCs w:val="21"/>
+                <w:color w:val="2D2D2D"/>
+                <w:lang w:val="en-US" w:bidi="fa-IR"/>
+              </w:rPr>
+              <w:t>auth</w:t>
+            </w:r>
+            <w:r>
+              <w:rPr>
+                <w:rFonts w:ascii="Vazirmatn" w:hAnsi="Vazirmatn" w:cs="Vazirmatn"/>
+                <w:sz w:val="21"/>
+                <w:szCs w:val="21"/>
+                <w:color w:val="2D2D2D"/>
+                <w:lang w:val="en-US" w:bidi="fa-IR"/>
+              </w:rPr>
+              <w:t xml:space="preserve"> </w:t>
+            </w:r>
+            <w:r>
+              <w:rPr>
+                <w:rFonts w:ascii="Vazirmatn" w:hAnsi="Vazirmatn" w:cs="Vazirmatn"/>
+                <w:sz w:val="21"/>
+                <w:szCs w:val="21"/>
+                <w:color w:val="2D2D2D"/>
+                <w:lang w:val="en-US" w:bidi="fa-IR"/>
+              </w:rPr>
+              <w:t>tokens</w:t>
+            </w:r>
+            <w:r>
+              <w:rPr>
+                <w:rFonts w:ascii="Vazirmatn" w:hAnsi="Vazirmatn" w:cs="Vazirmatn"/>
+                <w:sz w:val="21"/>
+                <w:szCs w:val="21"/>
+                <w:color w:val="2D2D2D"/>
+                <w:lang w:val="en-US" w:bidi="fa-IR"/>
+              </w:rPr>
+              <w:t xml:space="preserve"> </w:t>
+            </w:r>
+            <w:r>
+              <w:rPr>
+                <w:rFonts w:ascii="Vazirmatn" w:hAnsi="Vazirmatn" w:cs="Vazirmatn"/>
+                <w:sz w:val="21"/>
+                <w:szCs w:val="21"/>
+                <w:color w:val="2D2D2D"/>
+                <w:lang w:val="en-US" w:bidi="fa-IR"/>
+              </w:rPr>
+              <w:t>are</w:t>
+            </w:r>
+            <w:r>
+              <w:rPr>
+                <w:rFonts w:ascii="Vazirmatn" w:hAnsi="Vazirmatn" w:cs="Vazirmatn"/>
+                <w:sz w:val="21"/>
+                <w:szCs w:val="21"/>
+                <w:color w:val="2D2D2D"/>
+                <w:lang w:val="en-US" w:bidi="fa-IR"/>
+              </w:rPr>
+              <w:t xml:space="preserve"> </w:t>
+            </w:r>
+            <w:r>
+              <w:rPr>
+                <w:rFonts w:ascii="Vazirmatn" w:hAnsi="Vazirmatn" w:cs="Vazirmatn"/>
+                <w:sz w:val="21"/>
+                <w:szCs w:val="21"/>
+                <w:color w:val="2D2D2D"/>
+                <w:lang w:val="en-US" w:bidi="fa-IR"/>
+              </w:rPr>
+              <w:t>never</w:t>
+            </w:r>
+            <w:r>
+              <w:rPr>
+                <w:rFonts w:ascii="Vazirmatn" w:hAnsi="Vazirmatn" w:cs="Vazirmatn"/>
+                <w:sz w:val="21"/>
+                <w:szCs w:val="21"/>
+                <w:color w:val="2D2D2D"/>
+                <w:lang w:val="en-US" w:bidi="fa-IR"/>
+              </w:rPr>
+              <w:t xml:space="preserve"> </w:t>
+            </w:r>
+            <w:r>
+              <w:rPr>
+                <w:rFonts w:ascii="Vazirmatn" w:hAnsi="Vazirmatn" w:cs="Vazirmatn"/>
+                <w:sz w:val="21"/>
+                <w:szCs w:val="21"/>
+                <w:color w:val="2D2D2D"/>
+                <w:lang w:val="en-US" w:bidi="fa-IR"/>
+              </w:rPr>
+              <w:t>evicted</w:t>
+            </w:r>
+            <w:r>
+              <w:rPr>
+                <w:rFonts w:ascii="Vazirmatn" w:hAnsi="Vazirmatn" w:cs="Vazirmatn"/>
+                <w:sz w:val="21"/>
+                <w:szCs w:val="21"/>
+                <w:color w:val="2D2D2D"/>
+                <w:lang w:val="en-US" w:bidi="fa-IR"/>
+              </w:rPr>
+              <w:t xml:space="preserve"> </w:t>
+            </w:r>
+            <w:r>
+              <w:rPr>
+                <w:rFonts w:ascii="Vazirmatn" w:hAnsi="Vazirmatn" w:cs="Vazirmatn"/>
+                <w:sz w:val="21"/>
+                <w:szCs w:val="21"/>
+                <w:color w:val="2D2D2D"/>
+                <w:lang w:val="en-US" w:bidi="fa-IR"/>
+              </w:rPr>
+              <w:t>prematurely.</w:t>
             </w:r>
           </w:p>
         </w:tc>
@@ -765,67 +2043,7 @@
           <w:color w:val="5A5A5A"/>
           <w:lang w:val="en-US" w:bidi="fa-IR"/>
         </w:rPr>
-        <w:t>End</w:t>
-      </w:r>
-      <w:r>
-        <w:rPr>
-          <w:rFonts w:ascii="Vazirmatn" w:hAnsi="Vazirmatn" w:cs="Vazirmatn"/>
-          <w:sz w:val="19"/>
-          <w:szCs w:val="19"/>
-          <w:color w:val="5A5A5A"/>
-          <w:lang w:val="en-US" w:bidi="fa-IR"/>
-        </w:rPr>
-        <w:t>-</w:t>
-      </w:r>
-      <w:r>
-        <w:rPr>
-          <w:rFonts w:ascii="Vazirmatn" w:hAnsi="Vazirmatn" w:cs="Vazirmatn"/>
-          <w:sz w:val="19"/>
-          <w:szCs w:val="19"/>
-          <w:color w:val="5A5A5A"/>
-          <w:lang w:val="en-US" w:bidi="fa-IR"/>
-        </w:rPr>
-        <w:t>to</w:t>
-      </w:r>
-      <w:r>
-        <w:rPr>
-          <w:rFonts w:ascii="Vazirmatn" w:hAnsi="Vazirmatn" w:cs="Vazirmatn"/>
-          <w:sz w:val="19"/>
-          <w:szCs w:val="19"/>
-          <w:color w:val="5A5A5A"/>
-          <w:lang w:val="en-US" w:bidi="fa-IR"/>
-        </w:rPr>
-        <w:t>-</w:t>
-      </w:r>
-      <w:r>
-        <w:rPr>
-          <w:rFonts w:ascii="Vazirmatn" w:hAnsi="Vazirmatn" w:cs="Vazirmatn"/>
-          <w:sz w:val="19"/>
-          <w:szCs w:val="19"/>
-          <w:color w:val="5A5A5A"/>
-          <w:lang w:val="en-US" w:bidi="fa-IR"/>
-        </w:rPr>
-        <w:t>end sequence diagram demonstrating Cache</w:t>
-      </w:r>
-      <w:r>
-        <w:rPr>
-          <w:rFonts w:ascii="Vazirmatn" w:hAnsi="Vazirmatn" w:cs="Vazirmatn"/>
-          <w:sz w:val="19"/>
-          <w:szCs w:val="19"/>
-          <w:color w:val="5A5A5A"/>
-          <w:lang w:val="en-US" w:bidi="fa-IR"/>
-        </w:rPr>
-        <w:t>-</w:t>
-      </w:r>
-      <w:r>
-        <w:rPr>
-          <w:rFonts w:ascii="Vazirmatn" w:hAnsi="Vazirmatn" w:cs="Vazirmatn"/>
-          <w:sz w:val="19"/>
-          <w:szCs w:val="19"/>
-          <w:color w:val="5A5A5A"/>
-          <w:lang w:val="en-US" w:bidi="fa-IR"/>
-        </w:rPr>
-        <w:t>Aside lookup</w:t>
+        <w:t>End-to-end sequence diagram demonstrating Cache-Aside lookup</w:t>
       </w:r>
       <w:r>
         <w:rPr>
@@ -865,22 +2083,12 @@
           <w:color w:val="5A5A5A"/>
           <w:lang w:val="en-US" w:bidi="fa-IR"/>
         </w:rPr>
-        <w:t>and asynchronous replenishment</w:t>
-      </w:r>
-      <w:r>
-        <w:rPr>
-          <w:rFonts w:ascii="Vazirmatn" w:hAnsi="Vazirmatn" w:cs="Vazirmatn"/>
-          <w:sz w:val="19"/>
-          <w:szCs w:val="19"/>
-          <w:color w:val="5A5A5A"/>
-          <w:lang w:val="en-US" w:bidi="fa-IR"/>
-        </w:rPr>
-        <w:t>.</w:t>
+        <w:t>and asynchronous replenishment.</w:t>
       </w:r>
     </w:p>
     <w:p>
       <w:pPr>
-        <w:spacing w:line="324" w:lineRule="auto" w:after="120"/>
+        <w:spacing w:line="336" w:lineRule="auto" w:after="120"/>
         <w:jc w:val="both"/>
       </w:pPr>
       <w:r>
@@ -891,7 +2099,267 @@
           <w:color w:val="2D2D2D"/>
           <w:lang w:val="en-US" w:bidi="fa-IR"/>
         </w:rPr>
-        <w:t>The distributed cache interface and typed fallback mechanism are implemented in TypeScript as follows</w:t>
+        <w:t>The</w:t>
+      </w:r>
+      <w:r>
+        <w:rPr>
+          <w:rFonts w:ascii="Vazirmatn" w:hAnsi="Vazirmatn" w:cs="Vazirmatn"/>
+          <w:sz w:val="22"/>
+          <w:szCs w:val="22"/>
+          <w:color w:val="2D2D2D"/>
+          <w:lang w:val="en-US" w:bidi="fa-IR"/>
+        </w:rPr>
+        <w:t xml:space="preserve"> </w:t>
+      </w:r>
+      <w:r>
+        <w:rPr>
+          <w:rFonts w:ascii="Vazirmatn" w:hAnsi="Vazirmatn" w:cs="Vazirmatn"/>
+          <w:sz w:val="22"/>
+          <w:szCs w:val="22"/>
+          <w:color w:val="2D2D2D"/>
+          <w:lang w:val="en-US" w:bidi="fa-IR"/>
+        </w:rPr>
+        <w:t>distributed</w:t>
+      </w:r>
+      <w:r>
+        <w:rPr>
+          <w:rFonts w:ascii="Vazirmatn" w:hAnsi="Vazirmatn" w:cs="Vazirmatn"/>
+          <w:sz w:val="22"/>
+          <w:szCs w:val="22"/>
+          <w:color w:val="2D2D2D"/>
+          <w:lang w:val="en-US" w:bidi="fa-IR"/>
+        </w:rPr>
+        <w:t xml:space="preserve"> </w:t>
+      </w:r>
+      <w:r>
+        <w:rPr>
+          <w:rFonts w:ascii="Vazirmatn" w:hAnsi="Vazirmatn" w:cs="Vazirmatn"/>
+          <w:sz w:val="22"/>
+          <w:szCs w:val="22"/>
+          <w:color w:val="2D2D2D"/>
+          <w:lang w:val="en-US" w:bidi="fa-IR"/>
+        </w:rPr>
+        <w:t>cache</w:t>
+      </w:r>
+      <w:r>
+        <w:rPr>
+          <w:rFonts w:ascii="Vazirmatn" w:hAnsi="Vazirmatn" w:cs="Vazirmatn"/>
+          <w:sz w:val="22"/>
+          <w:szCs w:val="22"/>
+          <w:color w:val="2D2D2D"/>
+          <w:lang w:val="en-US" w:bidi="fa-IR"/>
+        </w:rPr>
+        <w:t xml:space="preserve"> </w:t>
+      </w:r>
+      <w:r>
+        <w:rPr>
+          <w:rFonts w:ascii="Vazirmatn" w:hAnsi="Vazirmatn" w:cs="Vazirmatn"/>
+          <w:sz w:val="22"/>
+          <w:szCs w:val="22"/>
+          <w:color w:val="2D2D2D"/>
+          <w:lang w:val="en-US" w:bidi="fa-IR"/>
+        </w:rPr>
+        <w:t>interface</w:t>
+      </w:r>
+      <w:r>
+        <w:rPr>
+          <w:rFonts w:ascii="Vazirmatn" w:hAnsi="Vazirmatn" w:cs="Vazirmatn"/>
+          <w:sz w:val="22"/>
+          <w:szCs w:val="22"/>
+          <w:color w:val="2D2D2D"/>
+          <w:lang w:val="en-US" w:bidi="fa-IR"/>
+        </w:rPr>
+        <w:t xml:space="preserve"> </w:t>
+      </w:r>
+      <w:r>
+        <w:rPr>
+          <w:rFonts w:ascii="Vazirmatn" w:hAnsi="Vazirmatn" w:cs="Vazirmatn"/>
+          <w:sz w:val="22"/>
+          <w:szCs w:val="22"/>
+          <w:color w:val="2D2D2D"/>
+          <w:lang w:val="en-US" w:bidi="fa-IR"/>
+        </w:rPr>
+        <w:t>and</w:t>
+      </w:r>
+      <w:r>
+        <w:rPr>
+          <w:rFonts w:ascii="Vazirmatn" w:hAnsi="Vazirmatn" w:cs="Vazirmatn"/>
+          <w:sz w:val="22"/>
+          <w:szCs w:val="22"/>
+          <w:color w:val="2D2D2D"/>
+          <w:lang w:val="en-US" w:bidi="fa-IR"/>
+        </w:rPr>
+        <w:t xml:space="preserve"> </w:t>
+      </w:r>
+      <w:r>
+        <w:rPr>
+          <w:rFonts w:ascii="Vazirmatn" w:hAnsi="Vazirmatn" w:cs="Vazirmatn"/>
+          <w:sz w:val="22"/>
+          <w:szCs w:val="22"/>
+          <w:color w:val="2D2D2D"/>
+          <w:lang w:val="en-US" w:bidi="fa-IR"/>
+        </w:rPr>
+        <w:t>typed</w:t>
+      </w:r>
+      <w:r>
+        <w:rPr>
+          <w:rFonts w:ascii="Vazirmatn" w:hAnsi="Vazirmatn" w:cs="Vazirmatn"/>
+          <w:sz w:val="22"/>
+          <w:szCs w:val="22"/>
+          <w:color w:val="2D2D2D"/>
+          <w:lang w:val="en-US" w:bidi="fa-IR"/>
+        </w:rPr>
+        <w:t xml:space="preserve"> </w:t>
+      </w:r>
+      <w:r>
+        <w:rPr>
+          <w:rFonts w:ascii="Vazirmatn" w:hAnsi="Vazirmatn" w:cs="Vazirmatn"/>
+          <w:sz w:val="22"/>
+          <w:szCs w:val="22"/>
+          <w:color w:val="2D2D2D"/>
+          <w:lang w:val="en-US" w:bidi="fa-IR"/>
+        </w:rPr>
+        <w:t>fallback</w:t>
+      </w:r>
+      <w:r>
+        <w:rPr>
+          <w:rFonts w:ascii="Vazirmatn" w:hAnsi="Vazirmatn" w:cs="Vazirmatn"/>
+          <w:sz w:val="22"/>
+          <w:szCs w:val="22"/>
+          <w:color w:val="2D2D2D"/>
+          <w:lang w:val="en-US" w:bidi="fa-IR"/>
+        </w:rPr>
+        <w:t xml:space="preserve"> </w:t>
+      </w:r>
+      <w:r>
+        <w:rPr>
+          <w:rFonts w:ascii="Vazirmatn" w:hAnsi="Vazirmatn" w:cs="Vazirmatn"/>
+          <w:sz w:val="22"/>
+          <w:szCs w:val="22"/>
+          <w:color w:val="2D2D2D"/>
+          <w:lang w:val="en-US" w:bidi="fa-IR"/>
+        </w:rPr>
+        <w:t>mechanism</w:t>
+      </w:r>
+      <w:r>
+        <w:rPr>
+          <w:rFonts w:ascii="Vazirmatn" w:hAnsi="Vazirmatn" w:cs="Vazirmatn"/>
+          <w:sz w:val="22"/>
+          <w:szCs w:val="22"/>
+          <w:color w:val="2D2D2D"/>
+          <w:lang w:val="en-US" w:bidi="fa-IR"/>
+        </w:rPr>
+        <w:t xml:space="preserve"> </w:t>
+      </w:r>
+      <w:r>
+        <w:rPr>
+          <w:rFonts w:ascii="Vazirmatn" w:hAnsi="Vazirmatn" w:cs="Vazirmatn"/>
+          <w:sz w:val="22"/>
+          <w:szCs w:val="22"/>
+          <w:color w:val="2D2D2D"/>
+          <w:lang w:val="en-US" w:bidi="fa-IR"/>
+        </w:rPr>
+        <w:t>are</w:t>
+      </w:r>
+      <w:r>
+        <w:rPr>
+          <w:rFonts w:ascii="Vazirmatn" w:hAnsi="Vazirmatn" w:cs="Vazirmatn"/>
+          <w:sz w:val="22"/>
+          <w:szCs w:val="22"/>
+          <w:color w:val="2D2D2D"/>
+          <w:lang w:val="en-US" w:bidi="fa-IR"/>
+        </w:rPr>
+        <w:t xml:space="preserve"> </w:t>
+      </w:r>
+      <w:r>
+        <w:rPr>
+          <w:rFonts w:ascii="Vazirmatn" w:hAnsi="Vazirmatn" w:cs="Vazirmatn"/>
+          <w:sz w:val="22"/>
+          <w:szCs w:val="22"/>
+          <w:color w:val="2D2D2D"/>
+          <w:lang w:val="en-US" w:bidi="fa-IR"/>
+        </w:rPr>
+        <w:t>implemented</w:t>
+      </w:r>
+      <w:r>
+        <w:rPr>
+          <w:rFonts w:ascii="Vazirmatn" w:hAnsi="Vazirmatn" w:cs="Vazirmatn"/>
+          <w:sz w:val="22"/>
+          <w:szCs w:val="22"/>
+          <w:color w:val="2D2D2D"/>
+          <w:lang w:val="en-US" w:bidi="fa-IR"/>
+        </w:rPr>
+        <w:t xml:space="preserve"> </w:t>
+      </w:r>
+      <w:r>
+        <w:rPr>
+          <w:rFonts w:ascii="Vazirmatn" w:hAnsi="Vazirmatn" w:cs="Vazirmatn"/>
+          <w:sz w:val="22"/>
+          <w:szCs w:val="22"/>
+          <w:color w:val="2D2D2D"/>
+          <w:lang w:val="en-US" w:bidi="fa-IR"/>
+        </w:rPr>
+        <w:t>in</w:t>
+      </w:r>
+      <w:r>
+        <w:rPr>
+          <w:rFonts w:ascii="Vazirmatn" w:hAnsi="Vazirmatn" w:cs="Vazirmatn"/>
+          <w:sz w:val="22"/>
+          <w:szCs w:val="22"/>
+          <w:color w:val="2D2D2D"/>
+          <w:lang w:val="en-US" w:bidi="fa-IR"/>
+        </w:rPr>
+        <w:t xml:space="preserve"> </w:t>
+      </w:r>
+      <w:r>
+        <w:rPr>
+          <w:rFonts w:ascii="Vazirmatn" w:hAnsi="Vazirmatn" w:cs="Vazirmatn"/>
+          <w:sz w:val="22"/>
+          <w:szCs w:val="22"/>
+          <w:color w:val="2D2D2D"/>
+          <w:lang w:val="en-US" w:bidi="fa-IR"/>
+        </w:rPr>
+        <w:t>TypeScript</w:t>
+      </w:r>
+      <w:r>
+        <w:rPr>
+          <w:rFonts w:ascii="Vazirmatn" w:hAnsi="Vazirmatn" w:cs="Vazirmatn"/>
+          <w:sz w:val="22"/>
+          <w:szCs w:val="22"/>
+          <w:color w:val="2D2D2D"/>
+          <w:lang w:val="en-US" w:bidi="fa-IR"/>
+        </w:rPr>
+        <w:t xml:space="preserve"> </w:t>
+      </w:r>
+      <w:r>
+        <w:rPr>
+          <w:rFonts w:ascii="Vazirmatn" w:hAnsi="Vazirmatn" w:cs="Vazirmatn"/>
+          <w:sz w:val="22"/>
+          <w:szCs w:val="22"/>
+          <w:color w:val="2D2D2D"/>
+          <w:lang w:val="en-US" w:bidi="fa-IR"/>
+        </w:rPr>
+        <w:t>as</w:t>
+      </w:r>
+      <w:r>
+        <w:rPr>
+          <w:rFonts w:ascii="Vazirmatn" w:hAnsi="Vazirmatn" w:cs="Vazirmatn"/>
+          <w:sz w:val="22"/>
+          <w:szCs w:val="22"/>
+          <w:color w:val="2D2D2D"/>
+          <w:lang w:val="en-US" w:bidi="fa-IR"/>
+        </w:rPr>
+        <w:t xml:space="preserve"> </w:t>
+      </w:r>
+      <w:r>
+        <w:rPr>
+          <w:rFonts w:ascii="Vazirmatn" w:hAnsi="Vazirmatn" w:cs="Vazirmatn"/>
+          <w:sz w:val="22"/>
+          <w:szCs w:val="22"/>
+          <w:color w:val="2D2D2D"/>
+          <w:lang w:val="en-US" w:bidi="fa-IR"/>
+        </w:rPr>
+        <w:t>follows</w:t>
       </w:r>
       <w:r>
         <w:rPr>
@@ -2595,13 +4063,13 @@
     </w:p>
     <w:tbl>
       <w:tblPr>
-        <w:tblW w:type="auto" w:w="0"/>
+        <w:tblW w:type="dxa" w:w="9638"/>
         <w:tblLayout w:type="fixed"/>
         <w:tblLook w:firstColumn="1" w:firstRow="1" w:lastColumn="0" w:lastRow="0" w:noHBand="0" w:noVBand="1" w:val="04A0"/>
       </w:tblPr>
       <w:tblGrid>
-        <w:gridCol w:w="4819"/>
-        <w:gridCol w:w="4819"/>
+        <w:gridCol w:w="936"/>
+        <w:gridCol w:w="8702"/>
       </w:tblGrid>
       <w:tr>
         <w:tc>
@@ -2625,7 +4093,6 @@
             <w:pPr>
               <w:jc w:val="center"/>
             </w:pPr>
-            <w:r/>
             <w:r>
               <w:rPr>
                 <w:rFonts w:ascii="Vazirmatn" w:hAnsi="Vazirmatn" w:cs="Vazirmatn"/>
@@ -2660,7 +4127,6 @@
             <w:pPr>
               <w:jc w:val="start"/>
             </w:pPr>
-            <w:r/>
             <w:r>
               <w:rPr>
                 <w:rFonts w:ascii="Vazirmatn" w:hAnsi="Vazirmatn" w:cs="Vazirmatn"/>
@@ -2685,7 +4151,7 @@
     </w:p>
     <w:p>
       <w:pPr>
-        <w:spacing w:line="324" w:lineRule="auto" w:after="120"/>
+        <w:spacing w:line="336" w:lineRule="auto" w:after="120"/>
         <w:jc w:val="both"/>
       </w:pPr>
       <w:r>
@@ -2696,7 +4162,307 @@
           <w:color w:val="2D2D2D"/>
           <w:lang w:val="en-US" w:bidi="fa-IR"/>
         </w:rPr>
-        <w:t>The following Python snippet demonstrates the repository pattern with connection pooling and resilient timeout retry loops</w:t>
+        <w:t>The</w:t>
+      </w:r>
+      <w:r>
+        <w:rPr>
+          <w:rFonts w:ascii="Vazirmatn" w:hAnsi="Vazirmatn" w:cs="Vazirmatn"/>
+          <w:sz w:val="22"/>
+          <w:szCs w:val="22"/>
+          <w:color w:val="2D2D2D"/>
+          <w:lang w:val="en-US" w:bidi="fa-IR"/>
+        </w:rPr>
+        <w:t xml:space="preserve"> </w:t>
+      </w:r>
+      <w:r>
+        <w:rPr>
+          <w:rFonts w:ascii="Vazirmatn" w:hAnsi="Vazirmatn" w:cs="Vazirmatn"/>
+          <w:sz w:val="22"/>
+          <w:szCs w:val="22"/>
+          <w:color w:val="2D2D2D"/>
+          <w:lang w:val="en-US" w:bidi="fa-IR"/>
+        </w:rPr>
+        <w:t>following</w:t>
+      </w:r>
+      <w:r>
+        <w:rPr>
+          <w:rFonts w:ascii="Vazirmatn" w:hAnsi="Vazirmatn" w:cs="Vazirmatn"/>
+          <w:sz w:val="22"/>
+          <w:szCs w:val="22"/>
+          <w:color w:val="2D2D2D"/>
+          <w:lang w:val="en-US" w:bidi="fa-IR"/>
+        </w:rPr>
+        <w:t xml:space="preserve"> </w:t>
+      </w:r>
+      <w:r>
+        <w:rPr>
+          <w:rFonts w:ascii="Vazirmatn" w:hAnsi="Vazirmatn" w:cs="Vazirmatn"/>
+          <w:sz w:val="22"/>
+          <w:szCs w:val="22"/>
+          <w:color w:val="2D2D2D"/>
+          <w:lang w:val="en-US" w:bidi="fa-IR"/>
+        </w:rPr>
+        <w:t>Python</w:t>
+      </w:r>
+      <w:r>
+        <w:rPr>
+          <w:rFonts w:ascii="Vazirmatn" w:hAnsi="Vazirmatn" w:cs="Vazirmatn"/>
+          <w:sz w:val="22"/>
+          <w:szCs w:val="22"/>
+          <w:color w:val="2D2D2D"/>
+          <w:lang w:val="en-US" w:bidi="fa-IR"/>
+        </w:rPr>
+        <w:t xml:space="preserve"> </w:t>
+      </w:r>
+      <w:r>
+        <w:rPr>
+          <w:rFonts w:ascii="Vazirmatn" w:hAnsi="Vazirmatn" w:cs="Vazirmatn"/>
+          <w:sz w:val="22"/>
+          <w:szCs w:val="22"/>
+          <w:color w:val="2D2D2D"/>
+          <w:lang w:val="en-US" w:bidi="fa-IR"/>
+        </w:rPr>
+        <w:t>snippet</w:t>
+      </w:r>
+      <w:r>
+        <w:rPr>
+          <w:rFonts w:ascii="Vazirmatn" w:hAnsi="Vazirmatn" w:cs="Vazirmatn"/>
+          <w:sz w:val="22"/>
+          <w:szCs w:val="22"/>
+          <w:color w:val="2D2D2D"/>
+          <w:lang w:val="en-US" w:bidi="fa-IR"/>
+        </w:rPr>
+        <w:t xml:space="preserve"> </w:t>
+      </w:r>
+      <w:r>
+        <w:rPr>
+          <w:rFonts w:ascii="Vazirmatn" w:hAnsi="Vazirmatn" w:cs="Vazirmatn"/>
+          <w:sz w:val="22"/>
+          <w:szCs w:val="22"/>
+          <w:color w:val="2D2D2D"/>
+          <w:lang w:val="en-US" w:bidi="fa-IR"/>
+        </w:rPr>
+        <w:t>demonstrates</w:t>
+      </w:r>
+      <w:r>
+        <w:rPr>
+          <w:rFonts w:ascii="Vazirmatn" w:hAnsi="Vazirmatn" w:cs="Vazirmatn"/>
+          <w:sz w:val="22"/>
+          <w:szCs w:val="22"/>
+          <w:color w:val="2D2D2D"/>
+          <w:lang w:val="en-US" w:bidi="fa-IR"/>
+        </w:rPr>
+        <w:t xml:space="preserve"> </w:t>
+      </w:r>
+      <w:r>
+        <w:rPr>
+          <w:rFonts w:ascii="Vazirmatn" w:hAnsi="Vazirmatn" w:cs="Vazirmatn"/>
+          <w:sz w:val="22"/>
+          <w:szCs w:val="22"/>
+          <w:color w:val="2D2D2D"/>
+          <w:lang w:val="en-US" w:bidi="fa-IR"/>
+        </w:rPr>
+        <w:t>the</w:t>
+      </w:r>
+      <w:r>
+        <w:rPr>
+          <w:rFonts w:ascii="Vazirmatn" w:hAnsi="Vazirmatn" w:cs="Vazirmatn"/>
+          <w:sz w:val="22"/>
+          <w:szCs w:val="22"/>
+          <w:color w:val="2D2D2D"/>
+          <w:lang w:val="en-US" w:bidi="fa-IR"/>
+        </w:rPr>
+        <w:t xml:space="preserve"> </w:t>
+      </w:r>
+      <w:r>
+        <w:rPr>
+          <w:rFonts w:ascii="Vazirmatn" w:hAnsi="Vazirmatn" w:cs="Vazirmatn"/>
+          <w:sz w:val="22"/>
+          <w:szCs w:val="22"/>
+          <w:color w:val="2D2D2D"/>
+          <w:lang w:val="en-US" w:bidi="fa-IR"/>
+        </w:rPr>
+        <w:t>repository</w:t>
+      </w:r>
+      <w:r>
+        <w:rPr>
+          <w:rFonts w:ascii="Vazirmatn" w:hAnsi="Vazirmatn" w:cs="Vazirmatn"/>
+          <w:sz w:val="22"/>
+          <w:szCs w:val="22"/>
+          <w:color w:val="2D2D2D"/>
+          <w:lang w:val="en-US" w:bidi="fa-IR"/>
+        </w:rPr>
+        <w:t xml:space="preserve"> </w:t>
+      </w:r>
+      <w:r>
+        <w:rPr>
+          <w:rFonts w:ascii="Vazirmatn" w:hAnsi="Vazirmatn" w:cs="Vazirmatn"/>
+          <w:sz w:val="22"/>
+          <w:szCs w:val="22"/>
+          <w:color w:val="2D2D2D"/>
+          <w:lang w:val="en-US" w:bidi="fa-IR"/>
+        </w:rPr>
+        <w:t>pattern</w:t>
+      </w:r>
+      <w:r>
+        <w:rPr>
+          <w:rFonts w:ascii="Vazirmatn" w:hAnsi="Vazirmatn" w:cs="Vazirmatn"/>
+          <w:sz w:val="22"/>
+          <w:szCs w:val="22"/>
+          <w:color w:val="2D2D2D"/>
+          <w:lang w:val="en-US" w:bidi="fa-IR"/>
+        </w:rPr>
+        <w:t xml:space="preserve"> </w:t>
+      </w:r>
+      <w:r>
+        <w:rPr>
+          <w:rFonts w:ascii="Vazirmatn" w:hAnsi="Vazirmatn" w:cs="Vazirmatn"/>
+          <w:sz w:val="22"/>
+          <w:szCs w:val="22"/>
+          <w:color w:val="2D2D2D"/>
+          <w:lang w:val="en-US" w:bidi="fa-IR"/>
+        </w:rPr>
+        <w:t>with</w:t>
+      </w:r>
+      <w:r>
+        <w:rPr>
+          <w:rFonts w:ascii="Vazirmatn" w:hAnsi="Vazirmatn" w:cs="Vazirmatn"/>
+          <w:sz w:val="22"/>
+          <w:szCs w:val="22"/>
+          <w:color w:val="2D2D2D"/>
+          <w:lang w:val="en-US" w:bidi="fa-IR"/>
+        </w:rPr>
+        <w:t xml:space="preserve"> </w:t>
+      </w:r>
+      <w:r>
+        <w:rPr>
+          <w:rFonts w:ascii="Vazirmatn" w:hAnsi="Vazirmatn" w:cs="Vazirmatn"/>
+          <w:sz w:val="22"/>
+          <w:szCs w:val="22"/>
+          <w:color w:val="2D2D2D"/>
+          <w:lang w:val="en-US" w:bidi="fa-IR"/>
+        </w:rPr>
+        <w:t>connection</w:t>
+      </w:r>
+      <w:r>
+        <w:rPr>
+          <w:rFonts w:ascii="Vazirmatn" w:hAnsi="Vazirmatn" w:cs="Vazirmatn"/>
+          <w:sz w:val="22"/>
+          <w:szCs w:val="22"/>
+          <w:color w:val="2D2D2D"/>
+          <w:lang w:val="en-US" w:bidi="fa-IR"/>
+        </w:rPr>
+        <w:t xml:space="preserve"> </w:t>
+      </w:r>
+      <w:r>
+        <w:rPr>
+          <w:rFonts w:ascii="Vazirmatn" w:hAnsi="Vazirmatn" w:cs="Vazirmatn"/>
+          <w:sz w:val="22"/>
+          <w:szCs w:val="22"/>
+          <w:color w:val="2D2D2D"/>
+          <w:lang w:val="en-US" w:bidi="fa-IR"/>
+        </w:rPr>
+        <w:t>pooling</w:t>
+      </w:r>
+      <w:r>
+        <w:rPr>
+          <w:rFonts w:ascii="Vazirmatn" w:hAnsi="Vazirmatn" w:cs="Vazirmatn"/>
+          <w:sz w:val="22"/>
+          <w:szCs w:val="22"/>
+          <w:color w:val="2D2D2D"/>
+          <w:lang w:val="en-US" w:bidi="fa-IR"/>
+        </w:rPr>
+        <w:t xml:space="preserve"> </w:t>
+      </w:r>
+      <w:r>
+        <w:rPr>
+          <w:rFonts w:ascii="Vazirmatn" w:hAnsi="Vazirmatn" w:cs="Vazirmatn"/>
+          <w:sz w:val="22"/>
+          <w:szCs w:val="22"/>
+          <w:color w:val="2D2D2D"/>
+          <w:lang w:val="en-US" w:bidi="fa-IR"/>
+        </w:rPr>
+        <w:t>and</w:t>
+      </w:r>
+      <w:r>
+        <w:rPr>
+          <w:rFonts w:ascii="Vazirmatn" w:hAnsi="Vazirmatn" w:cs="Vazirmatn"/>
+          <w:sz w:val="22"/>
+          <w:szCs w:val="22"/>
+          <w:color w:val="2D2D2D"/>
+          <w:lang w:val="en-US" w:bidi="fa-IR"/>
+        </w:rPr>
+        <w:t xml:space="preserve"> </w:t>
+      </w:r>
+      <w:r>
+        <w:rPr>
+          <w:rFonts w:ascii="Vazirmatn" w:hAnsi="Vazirmatn" w:cs="Vazirmatn"/>
+          <w:sz w:val="22"/>
+          <w:szCs w:val="22"/>
+          <w:color w:val="2D2D2D"/>
+          <w:lang w:val="en-US" w:bidi="fa-IR"/>
+        </w:rPr>
+        <w:t>resilient</w:t>
+      </w:r>
+      <w:r>
+        <w:rPr>
+          <w:rFonts w:ascii="Vazirmatn" w:hAnsi="Vazirmatn" w:cs="Vazirmatn"/>
+          <w:sz w:val="22"/>
+          <w:szCs w:val="22"/>
+          <w:color w:val="2D2D2D"/>
+          <w:lang w:val="en-US" w:bidi="fa-IR"/>
+        </w:rPr>
+        <w:t xml:space="preserve"> </w:t>
+      </w:r>
+      <w:r>
+        <w:rPr>
+          <w:rFonts w:ascii="Vazirmatn" w:hAnsi="Vazirmatn" w:cs="Vazirmatn"/>
+          <w:sz w:val="22"/>
+          <w:szCs w:val="22"/>
+          <w:color w:val="2D2D2D"/>
+          <w:lang w:val="en-US" w:bidi="fa-IR"/>
+        </w:rPr>
+        <w:t>timeout</w:t>
+      </w:r>
+      <w:r>
+        <w:rPr>
+          <w:rFonts w:ascii="Vazirmatn" w:hAnsi="Vazirmatn" w:cs="Vazirmatn"/>
+          <w:sz w:val="22"/>
+          <w:szCs w:val="22"/>
+          <w:color w:val="2D2D2D"/>
+          <w:lang w:val="en-US" w:bidi="fa-IR"/>
+        </w:rPr>
+        <w:t xml:space="preserve"> </w:t>
+      </w:r>
+      <w:r>
+        <w:rPr>
+          <w:rFonts w:ascii="Vazirmatn" w:hAnsi="Vazirmatn" w:cs="Vazirmatn"/>
+          <w:sz w:val="22"/>
+          <w:szCs w:val="22"/>
+          <w:color w:val="2D2D2D"/>
+          <w:lang w:val="en-US" w:bidi="fa-IR"/>
+        </w:rPr>
+        <w:t>retry</w:t>
+      </w:r>
+      <w:r>
+        <w:rPr>
+          <w:rFonts w:ascii="Vazirmatn" w:hAnsi="Vazirmatn" w:cs="Vazirmatn"/>
+          <w:sz w:val="22"/>
+          <w:szCs w:val="22"/>
+          <w:color w:val="2D2D2D"/>
+          <w:lang w:val="en-US" w:bidi="fa-IR"/>
+        </w:rPr>
+        <w:t xml:space="preserve"> </w:t>
+      </w:r>
+      <w:r>
+        <w:rPr>
+          <w:rFonts w:ascii="Vazirmatn" w:hAnsi="Vazirmatn" w:cs="Vazirmatn"/>
+          <w:sz w:val="22"/>
+          <w:szCs w:val="22"/>
+          <w:color w:val="2D2D2D"/>
+          <w:lang w:val="en-US" w:bidi="fa-IR"/>
+        </w:rPr>
+        <w:t>loops</w:t>
       </w:r>
       <w:r>
         <w:rPr>
@@ -4238,7 +6004,7 @@
     </w:p>
     <w:p>
       <w:pPr>
-        <w:spacing w:line="324" w:lineRule="auto" w:after="120"/>
+        <w:spacing w:line="336" w:lineRule="auto" w:after="120"/>
         <w:jc w:val="both"/>
       </w:pPr>
       <w:r>
@@ -4249,7 +6015,247 @@
           <w:color w:val="2D2D2D"/>
           <w:lang w:val="en-US" w:bidi="fa-IR"/>
         </w:rPr>
-        <w:t>The relational database persistence schema utilizes partitioned indexing to optimize range scan throughput</w:t>
+        <w:t>The</w:t>
+      </w:r>
+      <w:r>
+        <w:rPr>
+          <w:rFonts w:ascii="Vazirmatn" w:hAnsi="Vazirmatn" w:cs="Vazirmatn"/>
+          <w:sz w:val="22"/>
+          <w:szCs w:val="22"/>
+          <w:color w:val="2D2D2D"/>
+          <w:lang w:val="en-US" w:bidi="fa-IR"/>
+        </w:rPr>
+        <w:t xml:space="preserve"> </w:t>
+      </w:r>
+      <w:r>
+        <w:rPr>
+          <w:rFonts w:ascii="Vazirmatn" w:hAnsi="Vazirmatn" w:cs="Vazirmatn"/>
+          <w:sz w:val="22"/>
+          <w:szCs w:val="22"/>
+          <w:color w:val="2D2D2D"/>
+          <w:lang w:val="en-US" w:bidi="fa-IR"/>
+        </w:rPr>
+        <w:t>relational</w:t>
+      </w:r>
+      <w:r>
+        <w:rPr>
+          <w:rFonts w:ascii="Vazirmatn" w:hAnsi="Vazirmatn" w:cs="Vazirmatn"/>
+          <w:sz w:val="22"/>
+          <w:szCs w:val="22"/>
+          <w:color w:val="2D2D2D"/>
+          <w:lang w:val="en-US" w:bidi="fa-IR"/>
+        </w:rPr>
+        <w:t xml:space="preserve"> </w:t>
+      </w:r>
+      <w:r>
+        <w:rPr>
+          <w:rFonts w:ascii="Vazirmatn" w:hAnsi="Vazirmatn" w:cs="Vazirmatn"/>
+          <w:sz w:val="22"/>
+          <w:szCs w:val="22"/>
+          <w:color w:val="2D2D2D"/>
+          <w:lang w:val="en-US" w:bidi="fa-IR"/>
+        </w:rPr>
+        <w:t>database</w:t>
+      </w:r>
+      <w:r>
+        <w:rPr>
+          <w:rFonts w:ascii="Vazirmatn" w:hAnsi="Vazirmatn" w:cs="Vazirmatn"/>
+          <w:sz w:val="22"/>
+          <w:szCs w:val="22"/>
+          <w:color w:val="2D2D2D"/>
+          <w:lang w:val="en-US" w:bidi="fa-IR"/>
+        </w:rPr>
+        <w:t xml:space="preserve"> </w:t>
+      </w:r>
+      <w:r>
+        <w:rPr>
+          <w:rFonts w:ascii="Vazirmatn" w:hAnsi="Vazirmatn" w:cs="Vazirmatn"/>
+          <w:sz w:val="22"/>
+          <w:szCs w:val="22"/>
+          <w:color w:val="2D2D2D"/>
+          <w:lang w:val="en-US" w:bidi="fa-IR"/>
+        </w:rPr>
+        <w:t>persistence</w:t>
+      </w:r>
+      <w:r>
+        <w:rPr>
+          <w:rFonts w:ascii="Vazirmatn" w:hAnsi="Vazirmatn" w:cs="Vazirmatn"/>
+          <w:sz w:val="22"/>
+          <w:szCs w:val="22"/>
+          <w:color w:val="2D2D2D"/>
+          <w:lang w:val="en-US" w:bidi="fa-IR"/>
+        </w:rPr>
+        <w:t xml:space="preserve"> </w:t>
+      </w:r>
+      <w:r>
+        <w:rPr>
+          <w:rFonts w:ascii="Vazirmatn" w:hAnsi="Vazirmatn" w:cs="Vazirmatn"/>
+          <w:sz w:val="22"/>
+          <w:szCs w:val="22"/>
+          <w:color w:val="2D2D2D"/>
+          <w:lang w:val="en-US" w:bidi="fa-IR"/>
+        </w:rPr>
+        <w:t>schema</w:t>
+      </w:r>
+      <w:r>
+        <w:rPr>
+          <w:rFonts w:ascii="Vazirmatn" w:hAnsi="Vazirmatn" w:cs="Vazirmatn"/>
+          <w:sz w:val="22"/>
+          <w:szCs w:val="22"/>
+          <w:color w:val="2D2D2D"/>
+          <w:lang w:val="en-US" w:bidi="fa-IR"/>
+        </w:rPr>
+        <w:t xml:space="preserve"> </w:t>
+      </w:r>
+      <w:r>
+        <w:rPr>
+          <w:rFonts w:ascii="Vazirmatn" w:hAnsi="Vazirmatn" w:cs="Vazirmatn"/>
+          <w:sz w:val="22"/>
+          <w:szCs w:val="22"/>
+          <w:color w:val="2D2D2D"/>
+          <w:lang w:val="en-US" w:bidi="fa-IR"/>
+        </w:rPr>
+        <w:t>utilizes</w:t>
+      </w:r>
+      <w:r>
+        <w:rPr>
+          <w:rFonts w:ascii="Vazirmatn" w:hAnsi="Vazirmatn" w:cs="Vazirmatn"/>
+          <w:sz w:val="22"/>
+          <w:szCs w:val="22"/>
+          <w:color w:val="2D2D2D"/>
+          <w:lang w:val="en-US" w:bidi="fa-IR"/>
+        </w:rPr>
+        <w:t xml:space="preserve"> </w:t>
+      </w:r>
+      <w:r>
+        <w:rPr>
+          <w:rFonts w:ascii="Vazirmatn" w:hAnsi="Vazirmatn" w:cs="Vazirmatn"/>
+          <w:sz w:val="22"/>
+          <w:szCs w:val="22"/>
+          <w:color w:val="2D2D2D"/>
+          <w:lang w:val="en-US" w:bidi="fa-IR"/>
+        </w:rPr>
+        <w:t>partitioned</w:t>
+      </w:r>
+      <w:r>
+        <w:rPr>
+          <w:rFonts w:ascii="Vazirmatn" w:hAnsi="Vazirmatn" w:cs="Vazirmatn"/>
+          <w:sz w:val="22"/>
+          <w:szCs w:val="22"/>
+          <w:color w:val="2D2D2D"/>
+          <w:lang w:val="en-US" w:bidi="fa-IR"/>
+        </w:rPr>
+        <w:t xml:space="preserve"> </w:t>
+      </w:r>
+      <w:r>
+        <w:rPr>
+          <w:rFonts w:ascii="Vazirmatn" w:hAnsi="Vazirmatn" w:cs="Vazirmatn"/>
+          <w:sz w:val="22"/>
+          <w:szCs w:val="22"/>
+          <w:color w:val="2D2D2D"/>
+          <w:lang w:val="en-US" w:bidi="fa-IR"/>
+        </w:rPr>
+        <w:t>indexing</w:t>
+      </w:r>
+      <w:r>
+        <w:rPr>
+          <w:rFonts w:ascii="Vazirmatn" w:hAnsi="Vazirmatn" w:cs="Vazirmatn"/>
+          <w:sz w:val="22"/>
+          <w:szCs w:val="22"/>
+          <w:color w:val="2D2D2D"/>
+          <w:lang w:val="en-US" w:bidi="fa-IR"/>
+        </w:rPr>
+        <w:t xml:space="preserve"> </w:t>
+      </w:r>
+      <w:r>
+        <w:rPr>
+          <w:rFonts w:ascii="Vazirmatn" w:hAnsi="Vazirmatn" w:cs="Vazirmatn"/>
+          <w:sz w:val="22"/>
+          <w:szCs w:val="22"/>
+          <w:color w:val="2D2D2D"/>
+          <w:lang w:val="en-US" w:bidi="fa-IR"/>
+        </w:rPr>
+        <w:t>to</w:t>
+      </w:r>
+      <w:r>
+        <w:rPr>
+          <w:rFonts w:ascii="Vazirmatn" w:hAnsi="Vazirmatn" w:cs="Vazirmatn"/>
+          <w:sz w:val="22"/>
+          <w:szCs w:val="22"/>
+          <w:color w:val="2D2D2D"/>
+          <w:lang w:val="en-US" w:bidi="fa-IR"/>
+        </w:rPr>
+        <w:t xml:space="preserve"> </w:t>
+      </w:r>
+      <w:r>
+        <w:rPr>
+          <w:rFonts w:ascii="Vazirmatn" w:hAnsi="Vazirmatn" w:cs="Vazirmatn"/>
+          <w:sz w:val="22"/>
+          <w:szCs w:val="22"/>
+          <w:color w:val="2D2D2D"/>
+          <w:lang w:val="en-US" w:bidi="fa-IR"/>
+        </w:rPr>
+        <w:t>optimize</w:t>
+      </w:r>
+      <w:r>
+        <w:rPr>
+          <w:rFonts w:ascii="Vazirmatn" w:hAnsi="Vazirmatn" w:cs="Vazirmatn"/>
+          <w:sz w:val="22"/>
+          <w:szCs w:val="22"/>
+          <w:color w:val="2D2D2D"/>
+          <w:lang w:val="en-US" w:bidi="fa-IR"/>
+        </w:rPr>
+        <w:t xml:space="preserve"> </w:t>
+      </w:r>
+      <w:r>
+        <w:rPr>
+          <w:rFonts w:ascii="Vazirmatn" w:hAnsi="Vazirmatn" w:cs="Vazirmatn"/>
+          <w:sz w:val="22"/>
+          <w:szCs w:val="22"/>
+          <w:color w:val="2D2D2D"/>
+          <w:lang w:val="en-US" w:bidi="fa-IR"/>
+        </w:rPr>
+        <w:t>range</w:t>
+      </w:r>
+      <w:r>
+        <w:rPr>
+          <w:rFonts w:ascii="Vazirmatn" w:hAnsi="Vazirmatn" w:cs="Vazirmatn"/>
+          <w:sz w:val="22"/>
+          <w:szCs w:val="22"/>
+          <w:color w:val="2D2D2D"/>
+          <w:lang w:val="en-US" w:bidi="fa-IR"/>
+        </w:rPr>
+        <w:t xml:space="preserve"> </w:t>
+      </w:r>
+      <w:r>
+        <w:rPr>
+          <w:rFonts w:ascii="Vazirmatn" w:hAnsi="Vazirmatn" w:cs="Vazirmatn"/>
+          <w:sz w:val="22"/>
+          <w:szCs w:val="22"/>
+          <w:color w:val="2D2D2D"/>
+          <w:lang w:val="en-US" w:bidi="fa-IR"/>
+        </w:rPr>
+        <w:t>scan</w:t>
+      </w:r>
+      <w:r>
+        <w:rPr>
+          <w:rFonts w:ascii="Vazirmatn" w:hAnsi="Vazirmatn" w:cs="Vazirmatn"/>
+          <w:sz w:val="22"/>
+          <w:szCs w:val="22"/>
+          <w:color w:val="2D2D2D"/>
+          <w:lang w:val="en-US" w:bidi="fa-IR"/>
+        </w:rPr>
+        <w:t xml:space="preserve"> </w:t>
+      </w:r>
+      <w:r>
+        <w:rPr>
+          <w:rFonts w:ascii="Vazirmatn" w:hAnsi="Vazirmatn" w:cs="Vazirmatn"/>
+          <w:sz w:val="22"/>
+          <w:szCs w:val="22"/>
+          <w:color w:val="2D2D2D"/>
+          <w:lang w:val="en-US" w:bidi="fa-IR"/>
+        </w:rPr>
+        <w:t>throughput</w:t>
       </w:r>
       <w:r>
         <w:rPr>
@@ -5726,13 +7732,13 @@
     </w:p>
     <w:tbl>
       <w:tblPr>
-        <w:tblW w:type="auto" w:w="0"/>
+        <w:tblW w:type="dxa" w:w="9638"/>
         <w:tblLayout w:type="fixed"/>
         <w:tblLook w:firstColumn="1" w:firstRow="1" w:lastColumn="0" w:lastRow="0" w:noHBand="0" w:noVBand="1" w:val="04A0"/>
       </w:tblPr>
       <w:tblGrid>
-        <w:gridCol w:w="4819"/>
-        <w:gridCol w:w="4819"/>
+        <w:gridCol w:w="936"/>
+        <w:gridCol w:w="8702"/>
       </w:tblGrid>
       <w:tr>
         <w:tc>
@@ -5756,7 +7762,6 @@
             <w:pPr>
               <w:jc w:val="center"/>
             </w:pPr>
-            <w:r/>
             <w:r>
               <w:rPr>
                 <w:rFonts w:ascii="Vazirmatn" w:hAnsi="Vazirmatn" w:cs="Vazirmatn"/>
@@ -5791,7 +7796,6 @@
             <w:pPr>
               <w:jc w:val="start"/>
             </w:pPr>
-            <w:r/>
             <w:r>
               <w:rPr>
                 <w:rFonts w:ascii="Vazirmatn" w:hAnsi="Vazirmatn" w:cs="Vazirmatn"/>
@@ -5816,7 +7820,7 @@
     </w:p>
     <w:p>
       <w:pPr>
-        <w:spacing w:line="324" w:lineRule="auto" w:after="120"/>
+        <w:spacing w:line="336" w:lineRule="auto" w:after="120"/>
         <w:jc w:val="both"/>
       </w:pPr>
       <w:r>
@@ -5827,7 +7831,7 @@
           <w:color w:val="2D2D2D"/>
           <w:lang w:val="en-US" w:bidi="fa-IR"/>
         </w:rPr>
-        <w:t>Production telemetry verifies memory consumption</w:t>
+        <w:t>Production</w:t>
       </w:r>
       <w:r>
         <w:rPr>
@@ -5837,7 +7841,7 @@
           <w:color w:val="2D2D2D"/>
           <w:lang w:val="en-US" w:bidi="fa-IR"/>
         </w:rPr>
-        <w:t xml:space="preserve">, </w:t>
+        <w:t xml:space="preserve"> </w:t>
       </w:r>
       <w:r>
         <w:rPr>
@@ -5847,7 +7851,7 @@
           <w:color w:val="2D2D2D"/>
           <w:lang w:val="en-US" w:bidi="fa-IR"/>
         </w:rPr>
-        <w:t>query throughput</w:t>
+        <w:t>telemetry</w:t>
       </w:r>
       <w:r>
         <w:rPr>
@@ -5857,7 +7861,7 @@
           <w:color w:val="2D2D2D"/>
           <w:lang w:val="en-US" w:bidi="fa-IR"/>
         </w:rPr>
-        <w:t xml:space="preserve">, </w:t>
+        <w:t xml:space="preserve"> </w:t>
       </w:r>
       <w:r>
         <w:rPr>
@@ -5867,7 +7871,7 @@
           <w:color w:val="2D2D2D"/>
           <w:lang w:val="en-US" w:bidi="fa-IR"/>
         </w:rPr>
-        <w:t>and p</w:t>
+        <w:t>verifies</w:t>
       </w:r>
       <w:r>
         <w:rPr>
@@ -5877,7 +7881,7 @@
           <w:color w:val="2D2D2D"/>
           <w:lang w:val="en-US" w:bidi="fa-IR"/>
         </w:rPr>
-        <w:t xml:space="preserve">99 </w:t>
+        <w:t xml:space="preserve"> </w:t>
       </w:r>
       <w:r>
         <w:rPr>
@@ -5887,7 +7891,7 @@
           <w:color w:val="2D2D2D"/>
           <w:lang w:val="en-US" w:bidi="fa-IR"/>
         </w:rPr>
-        <w:t>latency across all cluster nodes</w:t>
+        <w:t>memory</w:t>
       </w:r>
       <w:r>
         <w:rPr>
@@ -5897,12 +7901,222 @@
           <w:color w:val="2D2D2D"/>
           <w:lang w:val="en-US" w:bidi="fa-IR"/>
         </w:rPr>
-        <w:t>.</w:t>
+        <w:t xml:space="preserve"> </w:t>
+      </w:r>
+      <w:r>
+        <w:rPr>
+          <w:rFonts w:ascii="Vazirmatn" w:hAnsi="Vazirmatn" w:cs="Vazirmatn"/>
+          <w:sz w:val="22"/>
+          <w:szCs w:val="22"/>
+          <w:color w:val="2D2D2D"/>
+          <w:lang w:val="en-US" w:bidi="fa-IR"/>
+        </w:rPr>
+        <w:t>consumption</w:t>
+      </w:r>
+      <w:r>
+        <w:rPr>
+          <w:rFonts w:ascii="Vazirmatn" w:hAnsi="Vazirmatn" w:cs="Vazirmatn"/>
+          <w:sz w:val="22"/>
+          <w:szCs w:val="22"/>
+          <w:color w:val="2D2D2D"/>
+          <w:lang w:val="en-US" w:bidi="fa-IR"/>
+        </w:rPr>
+        <w:t>,</w:t>
+      </w:r>
+      <w:r>
+        <w:rPr>
+          <w:rFonts w:ascii="Vazirmatn" w:hAnsi="Vazirmatn" w:cs="Vazirmatn"/>
+          <w:sz w:val="22"/>
+          <w:szCs w:val="22"/>
+          <w:color w:val="2D2D2D"/>
+          <w:lang w:val="en-US" w:bidi="fa-IR"/>
+        </w:rPr>
+        <w:t xml:space="preserve"> </w:t>
+      </w:r>
+      <w:r>
+        <w:rPr>
+          <w:rFonts w:ascii="Vazirmatn" w:hAnsi="Vazirmatn" w:cs="Vazirmatn"/>
+          <w:sz w:val="22"/>
+          <w:szCs w:val="22"/>
+          <w:color w:val="2D2D2D"/>
+          <w:lang w:val="en-US" w:bidi="fa-IR"/>
+        </w:rPr>
+        <w:t>query</w:t>
+      </w:r>
+      <w:r>
+        <w:rPr>
+          <w:rFonts w:ascii="Vazirmatn" w:hAnsi="Vazirmatn" w:cs="Vazirmatn"/>
+          <w:sz w:val="22"/>
+          <w:szCs w:val="22"/>
+          <w:color w:val="2D2D2D"/>
+          <w:lang w:val="en-US" w:bidi="fa-IR"/>
+        </w:rPr>
+        <w:t xml:space="preserve"> </w:t>
+      </w:r>
+      <w:r>
+        <w:rPr>
+          <w:rFonts w:ascii="Vazirmatn" w:hAnsi="Vazirmatn" w:cs="Vazirmatn"/>
+          <w:sz w:val="22"/>
+          <w:szCs w:val="22"/>
+          <w:color w:val="2D2D2D"/>
+          <w:lang w:val="en-US" w:bidi="fa-IR"/>
+        </w:rPr>
+        <w:t>throughput</w:t>
+      </w:r>
+      <w:r>
+        <w:rPr>
+          <w:rFonts w:ascii="Vazirmatn" w:hAnsi="Vazirmatn" w:cs="Vazirmatn"/>
+          <w:sz w:val="22"/>
+          <w:szCs w:val="22"/>
+          <w:color w:val="2D2D2D"/>
+          <w:lang w:val="en-US" w:bidi="fa-IR"/>
+        </w:rPr>
+        <w:t>,</w:t>
+      </w:r>
+      <w:r>
+        <w:rPr>
+          <w:rFonts w:ascii="Vazirmatn" w:hAnsi="Vazirmatn" w:cs="Vazirmatn"/>
+          <w:sz w:val="22"/>
+          <w:szCs w:val="22"/>
+          <w:color w:val="2D2D2D"/>
+          <w:lang w:val="en-US" w:bidi="fa-IR"/>
+        </w:rPr>
+        <w:t xml:space="preserve"> </w:t>
+      </w:r>
+      <w:r>
+        <w:rPr>
+          <w:rFonts w:ascii="Vazirmatn" w:hAnsi="Vazirmatn" w:cs="Vazirmatn"/>
+          <w:sz w:val="22"/>
+          <w:szCs w:val="22"/>
+          <w:color w:val="2D2D2D"/>
+          <w:lang w:val="en-US" w:bidi="fa-IR"/>
+        </w:rPr>
+        <w:t>and</w:t>
+      </w:r>
+      <w:r>
+        <w:rPr>
+          <w:rFonts w:ascii="Vazirmatn" w:hAnsi="Vazirmatn" w:cs="Vazirmatn"/>
+          <w:sz w:val="22"/>
+          <w:szCs w:val="22"/>
+          <w:color w:val="2D2D2D"/>
+          <w:lang w:val="en-US" w:bidi="fa-IR"/>
+        </w:rPr>
+        <w:t xml:space="preserve"> </w:t>
+      </w:r>
+      <w:r>
+        <w:rPr>
+          <w:rFonts w:ascii="Vazirmatn" w:hAnsi="Vazirmatn" w:cs="Vazirmatn"/>
+          <w:sz w:val="22"/>
+          <w:szCs w:val="22"/>
+          <w:color w:val="2D2D2D"/>
+          <w:lang w:val="en-US" w:bidi="fa-IR"/>
+        </w:rPr>
+        <w:t>p99</w:t>
+      </w:r>
+      <w:r>
+        <w:rPr>
+          <w:rFonts w:ascii="Vazirmatn" w:hAnsi="Vazirmatn" w:cs="Vazirmatn"/>
+          <w:sz w:val="22"/>
+          <w:szCs w:val="22"/>
+          <w:color w:val="2D2D2D"/>
+          <w:lang w:val="en-US" w:bidi="fa-IR"/>
+        </w:rPr>
+        <w:t xml:space="preserve"> </w:t>
+      </w:r>
+      <w:r>
+        <w:rPr>
+          <w:rFonts w:ascii="Vazirmatn" w:hAnsi="Vazirmatn" w:cs="Vazirmatn"/>
+          <w:sz w:val="22"/>
+          <w:szCs w:val="22"/>
+          <w:color w:val="2D2D2D"/>
+          <w:lang w:val="en-US" w:bidi="fa-IR"/>
+        </w:rPr>
+        <w:t>latency</w:t>
+      </w:r>
+      <w:r>
+        <w:rPr>
+          <w:rFonts w:ascii="Vazirmatn" w:hAnsi="Vazirmatn" w:cs="Vazirmatn"/>
+          <w:sz w:val="22"/>
+          <w:szCs w:val="22"/>
+          <w:color w:val="2D2D2D"/>
+          <w:lang w:val="en-US" w:bidi="fa-IR"/>
+        </w:rPr>
+        <w:t xml:space="preserve"> </w:t>
+      </w:r>
+      <w:r>
+        <w:rPr>
+          <w:rFonts w:ascii="Vazirmatn" w:hAnsi="Vazirmatn" w:cs="Vazirmatn"/>
+          <w:sz w:val="22"/>
+          <w:szCs w:val="22"/>
+          <w:color w:val="2D2D2D"/>
+          <w:lang w:val="en-US" w:bidi="fa-IR"/>
+        </w:rPr>
+        <w:t>across</w:t>
+      </w:r>
+      <w:r>
+        <w:rPr>
+          <w:rFonts w:ascii="Vazirmatn" w:hAnsi="Vazirmatn" w:cs="Vazirmatn"/>
+          <w:sz w:val="22"/>
+          <w:szCs w:val="22"/>
+          <w:color w:val="2D2D2D"/>
+          <w:lang w:val="en-US" w:bidi="fa-IR"/>
+        </w:rPr>
+        <w:t xml:space="preserve"> </w:t>
+      </w:r>
+      <w:r>
+        <w:rPr>
+          <w:rFonts w:ascii="Vazirmatn" w:hAnsi="Vazirmatn" w:cs="Vazirmatn"/>
+          <w:sz w:val="22"/>
+          <w:szCs w:val="22"/>
+          <w:color w:val="2D2D2D"/>
+          <w:lang w:val="en-US" w:bidi="fa-IR"/>
+        </w:rPr>
+        <w:t>all</w:t>
+      </w:r>
+      <w:r>
+        <w:rPr>
+          <w:rFonts w:ascii="Vazirmatn" w:hAnsi="Vazirmatn" w:cs="Vazirmatn"/>
+          <w:sz w:val="22"/>
+          <w:szCs w:val="22"/>
+          <w:color w:val="2D2D2D"/>
+          <w:lang w:val="en-US" w:bidi="fa-IR"/>
+        </w:rPr>
+        <w:t xml:space="preserve"> </w:t>
+      </w:r>
+      <w:r>
+        <w:rPr>
+          <w:rFonts w:ascii="Vazirmatn" w:hAnsi="Vazirmatn" w:cs="Vazirmatn"/>
+          <w:sz w:val="22"/>
+          <w:szCs w:val="22"/>
+          <w:color w:val="2D2D2D"/>
+          <w:lang w:val="en-US" w:bidi="fa-IR"/>
+        </w:rPr>
+        <w:t>cluster</w:t>
+      </w:r>
+      <w:r>
+        <w:rPr>
+          <w:rFonts w:ascii="Vazirmatn" w:hAnsi="Vazirmatn" w:cs="Vazirmatn"/>
+          <w:sz w:val="22"/>
+          <w:szCs w:val="22"/>
+          <w:color w:val="2D2D2D"/>
+          <w:lang w:val="en-US" w:bidi="fa-IR"/>
+        </w:rPr>
+        <w:t xml:space="preserve"> </w:t>
+      </w:r>
+      <w:r>
+        <w:rPr>
+          <w:rFonts w:ascii="Vazirmatn" w:hAnsi="Vazirmatn" w:cs="Vazirmatn"/>
+          <w:sz w:val="22"/>
+          <w:szCs w:val="22"/>
+          <w:color w:val="2D2D2D"/>
+          <w:lang w:val="en-US" w:bidi="fa-IR"/>
+        </w:rPr>
+        <w:t>nodes.</w:t>
       </w:r>
     </w:p>
     <w:p>
       <w:pPr>
-        <w:spacing w:line="324" w:lineRule="auto" w:after="120"/>
+        <w:spacing w:line="336" w:lineRule="auto" w:after="120"/>
         <w:jc w:val="both"/>
       </w:pPr>
       <w:r>
@@ -5913,7 +8127,247 @@
           <w:color w:val="2D2D2D"/>
           <w:lang w:val="en-US" w:bidi="fa-IR"/>
         </w:rPr>
-        <w:t>Cluster health monitoring daemons emit node state payloads in the following JSON schema</w:t>
+        <w:t>Cluster</w:t>
+      </w:r>
+      <w:r>
+        <w:rPr>
+          <w:rFonts w:ascii="Vazirmatn" w:hAnsi="Vazirmatn" w:cs="Vazirmatn"/>
+          <w:sz w:val="22"/>
+          <w:szCs w:val="22"/>
+          <w:color w:val="2D2D2D"/>
+          <w:lang w:val="en-US" w:bidi="fa-IR"/>
+        </w:rPr>
+        <w:t xml:space="preserve"> </w:t>
+      </w:r>
+      <w:r>
+        <w:rPr>
+          <w:rFonts w:ascii="Vazirmatn" w:hAnsi="Vazirmatn" w:cs="Vazirmatn"/>
+          <w:sz w:val="22"/>
+          <w:szCs w:val="22"/>
+          <w:color w:val="2D2D2D"/>
+          <w:lang w:val="en-US" w:bidi="fa-IR"/>
+        </w:rPr>
+        <w:t>health</w:t>
+      </w:r>
+      <w:r>
+        <w:rPr>
+          <w:rFonts w:ascii="Vazirmatn" w:hAnsi="Vazirmatn" w:cs="Vazirmatn"/>
+          <w:sz w:val="22"/>
+          <w:szCs w:val="22"/>
+          <w:color w:val="2D2D2D"/>
+          <w:lang w:val="en-US" w:bidi="fa-IR"/>
+        </w:rPr>
+        <w:t xml:space="preserve"> </w:t>
+      </w:r>
+      <w:r>
+        <w:rPr>
+          <w:rFonts w:ascii="Vazirmatn" w:hAnsi="Vazirmatn" w:cs="Vazirmatn"/>
+          <w:sz w:val="22"/>
+          <w:szCs w:val="22"/>
+          <w:color w:val="2D2D2D"/>
+          <w:lang w:val="en-US" w:bidi="fa-IR"/>
+        </w:rPr>
+        <w:t>monitoring</w:t>
+      </w:r>
+      <w:r>
+        <w:rPr>
+          <w:rFonts w:ascii="Vazirmatn" w:hAnsi="Vazirmatn" w:cs="Vazirmatn"/>
+          <w:sz w:val="22"/>
+          <w:szCs w:val="22"/>
+          <w:color w:val="2D2D2D"/>
+          <w:lang w:val="en-US" w:bidi="fa-IR"/>
+        </w:rPr>
+        <w:t xml:space="preserve"> </w:t>
+      </w:r>
+      <w:r>
+        <w:rPr>
+          <w:rFonts w:ascii="Vazirmatn" w:hAnsi="Vazirmatn" w:cs="Vazirmatn"/>
+          <w:sz w:val="22"/>
+          <w:szCs w:val="22"/>
+          <w:color w:val="2D2D2D"/>
+          <w:lang w:val="en-US" w:bidi="fa-IR"/>
+        </w:rPr>
+        <w:t>daemons</w:t>
+      </w:r>
+      <w:r>
+        <w:rPr>
+          <w:rFonts w:ascii="Vazirmatn" w:hAnsi="Vazirmatn" w:cs="Vazirmatn"/>
+          <w:sz w:val="22"/>
+          <w:szCs w:val="22"/>
+          <w:color w:val="2D2D2D"/>
+          <w:lang w:val="en-US" w:bidi="fa-IR"/>
+        </w:rPr>
+        <w:t xml:space="preserve"> </w:t>
+      </w:r>
+      <w:r>
+        <w:rPr>
+          <w:rFonts w:ascii="Vazirmatn" w:hAnsi="Vazirmatn" w:cs="Vazirmatn"/>
+          <w:sz w:val="22"/>
+          <w:szCs w:val="22"/>
+          <w:color w:val="2D2D2D"/>
+          <w:lang w:val="en-US" w:bidi="fa-IR"/>
+        </w:rPr>
+        <w:t>emit</w:t>
+      </w:r>
+      <w:r>
+        <w:rPr>
+          <w:rFonts w:ascii="Vazirmatn" w:hAnsi="Vazirmatn" w:cs="Vazirmatn"/>
+          <w:sz w:val="22"/>
+          <w:szCs w:val="22"/>
+          <w:color w:val="2D2D2D"/>
+          <w:lang w:val="en-US" w:bidi="fa-IR"/>
+        </w:rPr>
+        <w:t xml:space="preserve"> </w:t>
+      </w:r>
+      <w:r>
+        <w:rPr>
+          <w:rFonts w:ascii="Vazirmatn" w:hAnsi="Vazirmatn" w:cs="Vazirmatn"/>
+          <w:sz w:val="22"/>
+          <w:szCs w:val="22"/>
+          <w:color w:val="2D2D2D"/>
+          <w:lang w:val="en-US" w:bidi="fa-IR"/>
+        </w:rPr>
+        <w:t>node</w:t>
+      </w:r>
+      <w:r>
+        <w:rPr>
+          <w:rFonts w:ascii="Vazirmatn" w:hAnsi="Vazirmatn" w:cs="Vazirmatn"/>
+          <w:sz w:val="22"/>
+          <w:szCs w:val="22"/>
+          <w:color w:val="2D2D2D"/>
+          <w:lang w:val="en-US" w:bidi="fa-IR"/>
+        </w:rPr>
+        <w:t xml:space="preserve"> </w:t>
+      </w:r>
+      <w:r>
+        <w:rPr>
+          <w:rFonts w:ascii="Vazirmatn" w:hAnsi="Vazirmatn" w:cs="Vazirmatn"/>
+          <w:sz w:val="22"/>
+          <w:szCs w:val="22"/>
+          <w:color w:val="2D2D2D"/>
+          <w:lang w:val="en-US" w:bidi="fa-IR"/>
+        </w:rPr>
+        <w:t>state</w:t>
+      </w:r>
+      <w:r>
+        <w:rPr>
+          <w:rFonts w:ascii="Vazirmatn" w:hAnsi="Vazirmatn" w:cs="Vazirmatn"/>
+          <w:sz w:val="22"/>
+          <w:szCs w:val="22"/>
+          <w:color w:val="2D2D2D"/>
+          <w:lang w:val="en-US" w:bidi="fa-IR"/>
+        </w:rPr>
+        <w:t xml:space="preserve"> </w:t>
+      </w:r>
+      <w:r>
+        <w:rPr>
+          <w:rFonts w:ascii="Vazirmatn" w:hAnsi="Vazirmatn" w:cs="Vazirmatn"/>
+          <w:sz w:val="22"/>
+          <w:szCs w:val="22"/>
+          <w:color w:val="2D2D2D"/>
+          <w:lang w:val="en-US" w:bidi="fa-IR"/>
+        </w:rPr>
+        <w:t>payloads</w:t>
+      </w:r>
+      <w:r>
+        <w:rPr>
+          <w:rFonts w:ascii="Vazirmatn" w:hAnsi="Vazirmatn" w:cs="Vazirmatn"/>
+          <w:sz w:val="22"/>
+          <w:szCs w:val="22"/>
+          <w:color w:val="2D2D2D"/>
+          <w:lang w:val="en-US" w:bidi="fa-IR"/>
+        </w:rPr>
+        <w:t xml:space="preserve"> </w:t>
+      </w:r>
+      <w:r>
+        <w:rPr>
+          <w:rFonts w:ascii="Vazirmatn" w:hAnsi="Vazirmatn" w:cs="Vazirmatn"/>
+          <w:sz w:val="22"/>
+          <w:szCs w:val="22"/>
+          <w:color w:val="2D2D2D"/>
+          <w:lang w:val="en-US" w:bidi="fa-IR"/>
+        </w:rPr>
+        <w:t>in</w:t>
+      </w:r>
+      <w:r>
+        <w:rPr>
+          <w:rFonts w:ascii="Vazirmatn" w:hAnsi="Vazirmatn" w:cs="Vazirmatn"/>
+          <w:sz w:val="22"/>
+          <w:szCs w:val="22"/>
+          <w:color w:val="2D2D2D"/>
+          <w:lang w:val="en-US" w:bidi="fa-IR"/>
+        </w:rPr>
+        <w:t xml:space="preserve"> </w:t>
+      </w:r>
+      <w:r>
+        <w:rPr>
+          <w:rFonts w:ascii="Vazirmatn" w:hAnsi="Vazirmatn" w:cs="Vazirmatn"/>
+          <w:sz w:val="22"/>
+          <w:szCs w:val="22"/>
+          <w:color w:val="2D2D2D"/>
+          <w:lang w:val="en-US" w:bidi="fa-IR"/>
+        </w:rPr>
+        <w:t>the</w:t>
+      </w:r>
+      <w:r>
+        <w:rPr>
+          <w:rFonts w:ascii="Vazirmatn" w:hAnsi="Vazirmatn" w:cs="Vazirmatn"/>
+          <w:sz w:val="22"/>
+          <w:szCs w:val="22"/>
+          <w:color w:val="2D2D2D"/>
+          <w:lang w:val="en-US" w:bidi="fa-IR"/>
+        </w:rPr>
+        <w:t xml:space="preserve"> </w:t>
+      </w:r>
+      <w:r>
+        <w:rPr>
+          <w:rFonts w:ascii="Vazirmatn" w:hAnsi="Vazirmatn" w:cs="Vazirmatn"/>
+          <w:sz w:val="22"/>
+          <w:szCs w:val="22"/>
+          <w:color w:val="2D2D2D"/>
+          <w:lang w:val="en-US" w:bidi="fa-IR"/>
+        </w:rPr>
+        <w:t>following</w:t>
+      </w:r>
+      <w:r>
+        <w:rPr>
+          <w:rFonts w:ascii="Vazirmatn" w:hAnsi="Vazirmatn" w:cs="Vazirmatn"/>
+          <w:sz w:val="22"/>
+          <w:szCs w:val="22"/>
+          <w:color w:val="2D2D2D"/>
+          <w:lang w:val="en-US" w:bidi="fa-IR"/>
+        </w:rPr>
+        <w:t xml:space="preserve"> </w:t>
+      </w:r>
+      <w:r>
+        <w:rPr>
+          <w:rFonts w:ascii="Vazirmatn" w:hAnsi="Vazirmatn" w:cs="Vazirmatn"/>
+          <w:sz w:val="22"/>
+          <w:szCs w:val="22"/>
+          <w:color w:val="2D2D2D"/>
+          <w:lang w:val="en-US" w:bidi="fa-IR"/>
+        </w:rPr>
+        <w:t>JSON</w:t>
+      </w:r>
+      <w:r>
+        <w:rPr>
+          <w:rFonts w:ascii="Vazirmatn" w:hAnsi="Vazirmatn" w:cs="Vazirmatn"/>
+          <w:sz w:val="22"/>
+          <w:szCs w:val="22"/>
+          <w:color w:val="2D2D2D"/>
+          <w:lang w:val="en-US" w:bidi="fa-IR"/>
+        </w:rPr>
+        <w:t xml:space="preserve"> </w:t>
+      </w:r>
+      <w:r>
+        <w:rPr>
+          <w:rFonts w:ascii="Vazirmatn" w:hAnsi="Vazirmatn" w:cs="Vazirmatn"/>
+          <w:sz w:val="22"/>
+          <w:szCs w:val="22"/>
+          <w:color w:val="2D2D2D"/>
+          <w:lang w:val="en-US" w:bidi="fa-IR"/>
+        </w:rPr>
+        <w:t>schema</w:t>
       </w:r>
       <w:r>
         <w:rPr>
@@ -6661,13 +9115,13 @@
     </w:p>
     <w:tbl>
       <w:tblPr>
-        <w:tblW w:type="auto" w:w="0"/>
+        <w:tblW w:type="dxa" w:w="9638"/>
         <w:tblLayout w:type="fixed"/>
         <w:tblLook w:firstColumn="1" w:firstRow="1" w:lastColumn="0" w:lastRow="0" w:noHBand="0" w:noVBand="1" w:val="04A0"/>
       </w:tblPr>
       <w:tblGrid>
-        <w:gridCol w:w="4819"/>
-        <w:gridCol w:w="4819"/>
+        <w:gridCol w:w="936"/>
+        <w:gridCol w:w="8702"/>
       </w:tblGrid>
       <w:tr>
         <w:tc>
@@ -6691,7 +9145,6 @@
             <w:pPr>
               <w:jc w:val="center"/>
             </w:pPr>
-            <w:r/>
             <w:r>
               <w:rPr>
                 <w:rFonts w:ascii="Vazirmatn" w:hAnsi="Vazirmatn" w:cs="Vazirmatn"/>
@@ -6726,7 +9179,6 @@
             <w:pPr>
               <w:jc w:val="start"/>
             </w:pPr>
-            <w:r/>
             <w:r>
               <w:rPr>
                 <w:rFonts w:ascii="Vazirmatn" w:hAnsi="Vazirmatn" w:cs="Vazirmatn"/>
@@ -6751,7 +9203,7 @@
     </w:p>
     <w:p>
       <w:pPr>
-        <w:spacing w:line="324" w:lineRule="auto" w:after="120"/>
+        <w:spacing w:line="336" w:lineRule="auto" w:after="120"/>
         <w:jc w:val="both"/>
       </w:pPr>
       <w:r>
@@ -6762,7 +9214,7 @@
           <w:color w:val="2D2D2D"/>
           <w:lang w:val="en-US" w:bidi="fa-IR"/>
         </w:rPr>
-        <w:t>The following table summarizes node roles</w:t>
+        <w:t>The</w:t>
       </w:r>
       <w:r>
         <w:rPr>
@@ -6772,7 +9224,7 @@
           <w:color w:val="2D2D2D"/>
           <w:lang w:val="en-US" w:bidi="fa-IR"/>
         </w:rPr>
-        <w:t xml:space="preserve">, </w:t>
+        <w:t xml:space="preserve"> </w:t>
       </w:r>
       <w:r>
         <w:rPr>
@@ -6782,7 +9234,7 @@
           <w:color w:val="2D2D2D"/>
           <w:lang w:val="en-US" w:bidi="fa-IR"/>
         </w:rPr>
-        <w:t>resource allocations</w:t>
+        <w:t>following</w:t>
       </w:r>
       <w:r>
         <w:rPr>
@@ -6792,7 +9244,7 @@
           <w:color w:val="2D2D2D"/>
           <w:lang w:val="en-US" w:bidi="fa-IR"/>
         </w:rPr>
-        <w:t xml:space="preserve">, </w:t>
+        <w:t xml:space="preserve"> </w:t>
       </w:r>
       <w:r>
         <w:rPr>
@@ -6802,7 +9254,187 @@
           <w:color w:val="2D2D2D"/>
           <w:lang w:val="en-US" w:bidi="fa-IR"/>
         </w:rPr>
-        <w:t>and operational status</w:t>
+        <w:t>table</w:t>
+      </w:r>
+      <w:r>
+        <w:rPr>
+          <w:rFonts w:ascii="Vazirmatn" w:hAnsi="Vazirmatn" w:cs="Vazirmatn"/>
+          <w:sz w:val="22"/>
+          <w:szCs w:val="22"/>
+          <w:color w:val="2D2D2D"/>
+          <w:lang w:val="en-US" w:bidi="fa-IR"/>
+        </w:rPr>
+        <w:t xml:space="preserve"> </w:t>
+      </w:r>
+      <w:r>
+        <w:rPr>
+          <w:rFonts w:ascii="Vazirmatn" w:hAnsi="Vazirmatn" w:cs="Vazirmatn"/>
+          <w:sz w:val="22"/>
+          <w:szCs w:val="22"/>
+          <w:color w:val="2D2D2D"/>
+          <w:lang w:val="en-US" w:bidi="fa-IR"/>
+        </w:rPr>
+        <w:t>summarizes</w:t>
+      </w:r>
+      <w:r>
+        <w:rPr>
+          <w:rFonts w:ascii="Vazirmatn" w:hAnsi="Vazirmatn" w:cs="Vazirmatn"/>
+          <w:sz w:val="22"/>
+          <w:szCs w:val="22"/>
+          <w:color w:val="2D2D2D"/>
+          <w:lang w:val="en-US" w:bidi="fa-IR"/>
+        </w:rPr>
+        <w:t xml:space="preserve"> </w:t>
+      </w:r>
+      <w:r>
+        <w:rPr>
+          <w:rFonts w:ascii="Vazirmatn" w:hAnsi="Vazirmatn" w:cs="Vazirmatn"/>
+          <w:sz w:val="22"/>
+          <w:szCs w:val="22"/>
+          <w:color w:val="2D2D2D"/>
+          <w:lang w:val="en-US" w:bidi="fa-IR"/>
+        </w:rPr>
+        <w:t>node</w:t>
+      </w:r>
+      <w:r>
+        <w:rPr>
+          <w:rFonts w:ascii="Vazirmatn" w:hAnsi="Vazirmatn" w:cs="Vazirmatn"/>
+          <w:sz w:val="22"/>
+          <w:szCs w:val="22"/>
+          <w:color w:val="2D2D2D"/>
+          <w:lang w:val="en-US" w:bidi="fa-IR"/>
+        </w:rPr>
+        <w:t xml:space="preserve"> </w:t>
+      </w:r>
+      <w:r>
+        <w:rPr>
+          <w:rFonts w:ascii="Vazirmatn" w:hAnsi="Vazirmatn" w:cs="Vazirmatn"/>
+          <w:sz w:val="22"/>
+          <w:szCs w:val="22"/>
+          <w:color w:val="2D2D2D"/>
+          <w:lang w:val="en-US" w:bidi="fa-IR"/>
+        </w:rPr>
+        <w:t>roles</w:t>
+      </w:r>
+      <w:r>
+        <w:rPr>
+          <w:rFonts w:ascii="Vazirmatn" w:hAnsi="Vazirmatn" w:cs="Vazirmatn"/>
+          <w:sz w:val="22"/>
+          <w:szCs w:val="22"/>
+          <w:color w:val="2D2D2D"/>
+          <w:lang w:val="en-US" w:bidi="fa-IR"/>
+        </w:rPr>
+        <w:t>,</w:t>
+      </w:r>
+      <w:r>
+        <w:rPr>
+          <w:rFonts w:ascii="Vazirmatn" w:hAnsi="Vazirmatn" w:cs="Vazirmatn"/>
+          <w:sz w:val="22"/>
+          <w:szCs w:val="22"/>
+          <w:color w:val="2D2D2D"/>
+          <w:lang w:val="en-US" w:bidi="fa-IR"/>
+        </w:rPr>
+        <w:t xml:space="preserve"> </w:t>
+      </w:r>
+      <w:r>
+        <w:rPr>
+          <w:rFonts w:ascii="Vazirmatn" w:hAnsi="Vazirmatn" w:cs="Vazirmatn"/>
+          <w:sz w:val="22"/>
+          <w:szCs w:val="22"/>
+          <w:color w:val="2D2D2D"/>
+          <w:lang w:val="en-US" w:bidi="fa-IR"/>
+        </w:rPr>
+        <w:t>resource</w:t>
+      </w:r>
+      <w:r>
+        <w:rPr>
+          <w:rFonts w:ascii="Vazirmatn" w:hAnsi="Vazirmatn" w:cs="Vazirmatn"/>
+          <w:sz w:val="22"/>
+          <w:szCs w:val="22"/>
+          <w:color w:val="2D2D2D"/>
+          <w:lang w:val="en-US" w:bidi="fa-IR"/>
+        </w:rPr>
+        <w:t xml:space="preserve"> </w:t>
+      </w:r>
+      <w:r>
+        <w:rPr>
+          <w:rFonts w:ascii="Vazirmatn" w:hAnsi="Vazirmatn" w:cs="Vazirmatn"/>
+          <w:sz w:val="22"/>
+          <w:szCs w:val="22"/>
+          <w:color w:val="2D2D2D"/>
+          <w:lang w:val="en-US" w:bidi="fa-IR"/>
+        </w:rPr>
+        <w:t>allocations</w:t>
+      </w:r>
+      <w:r>
+        <w:rPr>
+          <w:rFonts w:ascii="Vazirmatn" w:hAnsi="Vazirmatn" w:cs="Vazirmatn"/>
+          <w:sz w:val="22"/>
+          <w:szCs w:val="22"/>
+          <w:color w:val="2D2D2D"/>
+          <w:lang w:val="en-US" w:bidi="fa-IR"/>
+        </w:rPr>
+        <w:t>,</w:t>
+      </w:r>
+      <w:r>
+        <w:rPr>
+          <w:rFonts w:ascii="Vazirmatn" w:hAnsi="Vazirmatn" w:cs="Vazirmatn"/>
+          <w:sz w:val="22"/>
+          <w:szCs w:val="22"/>
+          <w:color w:val="2D2D2D"/>
+          <w:lang w:val="en-US" w:bidi="fa-IR"/>
+        </w:rPr>
+        <w:t xml:space="preserve"> </w:t>
+      </w:r>
+      <w:r>
+        <w:rPr>
+          <w:rFonts w:ascii="Vazirmatn" w:hAnsi="Vazirmatn" w:cs="Vazirmatn"/>
+          <w:sz w:val="22"/>
+          <w:szCs w:val="22"/>
+          <w:color w:val="2D2D2D"/>
+          <w:lang w:val="en-US" w:bidi="fa-IR"/>
+        </w:rPr>
+        <w:t>and</w:t>
+      </w:r>
+      <w:r>
+        <w:rPr>
+          <w:rFonts w:ascii="Vazirmatn" w:hAnsi="Vazirmatn" w:cs="Vazirmatn"/>
+          <w:sz w:val="22"/>
+          <w:szCs w:val="22"/>
+          <w:color w:val="2D2D2D"/>
+          <w:lang w:val="en-US" w:bidi="fa-IR"/>
+        </w:rPr>
+        <w:t xml:space="preserve"> </w:t>
+      </w:r>
+      <w:r>
+        <w:rPr>
+          <w:rFonts w:ascii="Vazirmatn" w:hAnsi="Vazirmatn" w:cs="Vazirmatn"/>
+          <w:sz w:val="22"/>
+          <w:szCs w:val="22"/>
+          <w:color w:val="2D2D2D"/>
+          <w:lang w:val="en-US" w:bidi="fa-IR"/>
+        </w:rPr>
+        <w:t>operational</w:t>
+      </w:r>
+      <w:r>
+        <w:rPr>
+          <w:rFonts w:ascii="Vazirmatn" w:hAnsi="Vazirmatn" w:cs="Vazirmatn"/>
+          <w:sz w:val="22"/>
+          <w:szCs w:val="22"/>
+          <w:color w:val="2D2D2D"/>
+          <w:lang w:val="en-US" w:bidi="fa-IR"/>
+        </w:rPr>
+        <w:t xml:space="preserve"> </w:t>
+      </w:r>
+      <w:r>
+        <w:rPr>
+          <w:rFonts w:ascii="Vazirmatn" w:hAnsi="Vazirmatn" w:cs="Vazirmatn"/>
+          <w:sz w:val="22"/>
+          <w:szCs w:val="22"/>
+          <w:color w:val="2D2D2D"/>
+          <w:lang w:val="en-US" w:bidi="fa-IR"/>
+        </w:rPr>
+        <w:t>status</w:t>
       </w:r>
       <w:r>
         <w:rPr>
@@ -6817,7 +9449,7 @@
     </w:p>
     <w:tbl>
       <w:tblPr>
-        <w:tblW w:type="auto" w:w="0"/>
+        <w:tblW w:type="dxa" w:w="9638"/>
         <w:tblLayout w:type="fixed"/>
         <w:tblLook w:firstColumn="1" w:firstRow="1" w:lastColumn="0" w:lastRow="0" w:noHBand="0" w:noVBand="1" w:val="04A0"/>
       </w:tblPr>
@@ -6827,9 +9459,13 @@
         <w:gridCol w:w="1606"/>
         <w:gridCol w:w="1606"/>
         <w:gridCol w:w="1606"/>
-        <w:gridCol w:w="1606"/>
+        <w:gridCol w:w="1608"/>
       </w:tblGrid>
       <w:tr>
+        <w:trPr>
+          <w:tblHeader/>
+          <w:cantSplit/>
+        </w:trPr>
         <w:tc>
           <w:tcPr>
             <w:tcW w:type="dxa" w:w="1606"/>
@@ -6970,43 +9606,7 @@
                 <w:color w:val="FFFFFF"/>
                 <w:lang w:val="en-US" w:bidi="fa-IR"/>
               </w:rPr>
-              <w:t>Latency</w:t>
-            </w:r>
-            <w:r>
-              <w:rPr>
-                <w:rFonts w:ascii="Vazirmatn" w:hAnsi="Vazirmatn" w:cs="Vazirmatn"/>
-                <w:sz w:val="21"/>
-                <w:szCs w:val="21"/>
-                <w:b/>
-                <w:bCs/>
-                <w:color w:val="FFFFFF"/>
-                <w:lang w:val="en-US" w:bidi="fa-IR"/>
-              </w:rPr>
-              <w:t xml:space="preserve"> (</w:t>
-            </w:r>
-            <w:r>
-              <w:rPr>
-                <w:rFonts w:ascii="Vazirmatn" w:hAnsi="Vazirmatn" w:cs="Vazirmatn"/>
-                <w:sz w:val="21"/>
-                <w:szCs w:val="21"/>
-                <w:b/>
-                <w:bCs/>
-                <w:color w:val="FFFFFF"/>
-                <w:lang w:val="en-US" w:bidi="fa-IR"/>
-              </w:rPr>
-              <w:t>p</w:t>
-            </w:r>
-            <w:r>
-              <w:rPr>
-                <w:rFonts w:ascii="Vazirmatn" w:hAnsi="Vazirmatn" w:cs="Vazirmatn"/>
-                <w:sz w:val="21"/>
-                <w:szCs w:val="21"/>
-                <w:b/>
-                <w:bCs/>
-                <w:color w:val="FFFFFF"/>
-                <w:lang w:val="en-US" w:bidi="fa-IR"/>
-              </w:rPr>
-              <w:t>99)</w:t>
+              <w:t>Latency (p99)</w:t>
             </w:r>
           </w:p>
         </w:tc>
@@ -7048,7 +9648,7 @@
         </w:tc>
         <w:tc>
           <w:tcPr>
-            <w:tcW w:type="dxa" w:w="1606"/>
+            <w:tcW w:type="dxa" w:w="1608"/>
             <w:shd w:val="clear" w:color="auto" w:fill="6B2FA0"/>
             <w:tcMar>
               <w:top w:w="100" w:type="dxa"/>
@@ -7084,6 +9684,9 @@
         </w:tc>
       </w:tr>
       <w:tr>
+        <w:trPr>
+          <w:cantSplit/>
+        </w:trPr>
         <w:tc>
           <w:tcPr>
             <w:tcW w:type="dxa" w:w="1606"/>
@@ -7114,37 +9717,7 @@
                 <w:color w:val="2D2D2D"/>
                 <w:lang w:val="en-US" w:bidi="fa-IR"/>
               </w:rPr>
-              <w:t>redis</w:t>
-            </w:r>
-            <w:r>
-              <w:rPr>
-                <w:rFonts w:ascii="Vazirmatn" w:hAnsi="Vazirmatn" w:cs="Vazirmatn"/>
-                <w:sz w:val="20"/>
-                <w:szCs w:val="20"/>
-                <w:color w:val="2D2D2D"/>
-                <w:lang w:val="en-US" w:bidi="fa-IR"/>
-              </w:rPr>
-              <w:t>-</w:t>
-            </w:r>
-            <w:r>
-              <w:rPr>
-                <w:rFonts w:ascii="Vazirmatn" w:hAnsi="Vazirmatn" w:cs="Vazirmatn"/>
-                <w:sz w:val="20"/>
-                <w:szCs w:val="20"/>
-                <w:color w:val="2D2D2D"/>
-                <w:lang w:val="en-US" w:bidi="fa-IR"/>
-              </w:rPr>
-              <w:t>master</w:t>
-            </w:r>
-            <w:r>
-              <w:rPr>
-                <w:rFonts w:ascii="Vazirmatn" w:hAnsi="Vazirmatn" w:cs="Vazirmatn"/>
-                <w:sz w:val="20"/>
-                <w:szCs w:val="20"/>
-                <w:color w:val="2D2D2D"/>
-                <w:lang w:val="en-US" w:bidi="fa-IR"/>
-              </w:rPr>
-              <w:t>-01</w:t>
+              <w:t>redis-master-01</w:t>
             </w:r>
           </w:p>
         </w:tc>
@@ -7306,7 +9879,7 @@
         </w:tc>
         <w:tc>
           <w:tcPr>
-            <w:tcW w:type="dxa" w:w="1606"/>
+            <w:tcW w:type="dxa" w:w="1608"/>
             <w:shd w:val="clear" w:color="auto" w:fill="FFFFFF"/>
             <w:tcMar>
               <w:top w:w="80" w:type="dxa"/>
@@ -7340,6 +9913,9 @@
         </w:tc>
       </w:tr>
       <w:tr>
+        <w:trPr>
+          <w:cantSplit/>
+        </w:trPr>
         <w:tc>
           <w:tcPr>
             <w:tcW w:type="dxa" w:w="1606"/>
@@ -7370,47 +9946,7 @@
                 <w:color w:val="2D2D2D"/>
                 <w:lang w:val="en-US" w:bidi="fa-IR"/>
               </w:rPr>
-              <w:t>redis</w:t>
-            </w:r>
-            <w:r>
-              <w:rPr>
-                <w:rFonts w:ascii="Vazirmatn" w:hAnsi="Vazirmatn" w:cs="Vazirmatn"/>
-                <w:sz w:val="20"/>
-                <w:szCs w:val="20"/>
-                <w:color w:val="2D2D2D"/>
-                <w:lang w:val="en-US" w:bidi="fa-IR"/>
-              </w:rPr>
-              <w:t>-</w:t>
-            </w:r>
-            <w:r>
-              <w:rPr>
-                <w:rFonts w:ascii="Vazirmatn" w:hAnsi="Vazirmatn" w:cs="Vazirmatn"/>
-                <w:sz w:val="20"/>
-                <w:szCs w:val="20"/>
-                <w:color w:val="2D2D2D"/>
-                <w:lang w:val="en-US" w:bidi="fa-IR"/>
-              </w:rPr>
-              <w:t>replica</w:t>
-            </w:r>
-            <w:r>
-              <w:rPr>
-                <w:rFonts w:ascii="Vazirmatn" w:hAnsi="Vazirmatn" w:cs="Vazirmatn"/>
-                <w:sz w:val="20"/>
-                <w:szCs w:val="20"/>
-                <w:color w:val="2D2D2D"/>
-                <w:lang w:val="en-US" w:bidi="fa-IR"/>
-              </w:rPr>
-              <w:t>-01</w:t>
-            </w:r>
-            <w:r>
-              <w:rPr>
-                <w:rFonts w:ascii="Vazirmatn" w:hAnsi="Vazirmatn" w:cs="Vazirmatn"/>
-                <w:sz w:val="20"/>
-                <w:szCs w:val="20"/>
-                <w:color w:val="2D2D2D"/>
-                <w:lang w:val="en-US" w:bidi="fa-IR"/>
-              </w:rPr>
-              <w:t>a</w:t>
+              <w:t>redis-replica-01a</w:t>
             </w:r>
           </w:p>
         </w:tc>
@@ -7566,8 +10102,32 @@
                 <w:color w:val="2D2D2D"/>
                 <w:lang w:val="en-US" w:bidi="fa-IR"/>
               </w:rPr>
-              <w:t>In</w:t>
-            </w:r>
+              <w:t>In-Sync (Lag 0ms)</w:t>
+            </w:r>
+          </w:p>
+        </w:tc>
+        <w:tc>
+          <w:tcPr>
+            <w:tcW w:type="dxa" w:w="1608"/>
+            <w:shd w:val="clear" w:color="auto" w:fill="FFFFFF"/>
+            <w:tcMar>
+              <w:top w:w="80" w:type="dxa"/>
+              <w:bottom w:w="80" w:type="dxa"/>
+              <w:left w:w="120" w:type="dxa"/>
+              <w:right w:w="120" w:type="dxa"/>
+            </w:tcMar>
+            <w:tcBorders>
+              <w:top w:val="single" w:sz="4" w:space="0" w:color="D8D8D8"/>
+              <w:bottom w:val="single" w:sz="4" w:space="0" w:color="D8D8D8"/>
+              <w:left w:val="single" w:sz="4" w:space="0" w:color="D8D8D8"/>
+              <w:right w:val="single" w:sz="4" w:space="0" w:color="D8D8D8"/>
+            </w:tcBorders>
+          </w:tcPr>
+          <w:p>
+            <w:pPr>
+              <w:jc w:val="start"/>
+            </w:pPr>
+            <w:r/>
             <w:r>
               <w:rPr>
                 <w:rFonts w:ascii="Vazirmatn" w:hAnsi="Vazirmatn" w:cs="Vazirmatn"/>
@@ -7576,8 +10136,37 @@
                 <w:color w:val="2D2D2D"/>
                 <w:lang w:val="en-US" w:bidi="fa-IR"/>
               </w:rPr>
-              <w:t>-</w:t>
-            </w:r>
+              <w:t>Healthy</w:t>
+            </w:r>
+          </w:p>
+        </w:tc>
+      </w:tr>
+      <w:tr>
+        <w:trPr>
+          <w:cantSplit/>
+        </w:trPr>
+        <w:tc>
+          <w:tcPr>
+            <w:tcW w:type="dxa" w:w="1606"/>
+            <w:shd w:val="clear" w:color="auto" w:fill="FFFFFF"/>
+            <w:tcMar>
+              <w:top w:w="80" w:type="dxa"/>
+              <w:bottom w:w="80" w:type="dxa"/>
+              <w:left w:w="120" w:type="dxa"/>
+              <w:right w:w="120" w:type="dxa"/>
+            </w:tcMar>
+            <w:tcBorders>
+              <w:top w:val="single" w:sz="4" w:space="0" w:color="D8D8D8"/>
+              <w:bottom w:val="single" w:sz="4" w:space="0" w:color="D8D8D8"/>
+              <w:left w:val="single" w:sz="4" w:space="0" w:color="D8D8D8"/>
+              <w:right w:val="single" w:sz="4" w:space="0" w:color="D8D8D8"/>
+            </w:tcBorders>
+          </w:tcPr>
+          <w:p>
+            <w:pPr>
+              <w:jc w:val="start"/>
+            </w:pPr>
+            <w:r/>
             <w:r>
               <w:rPr>
                 <w:rFonts w:ascii="Vazirmatn" w:hAnsi="Vazirmatn" w:cs="Vazirmatn"/>
@@ -7586,57 +10175,7 @@
                 <w:color w:val="2D2D2D"/>
                 <w:lang w:val="en-US" w:bidi="fa-IR"/>
               </w:rPr>
-              <w:t>Sync</w:t>
-            </w:r>
-            <w:r>
-              <w:rPr>
-                <w:rFonts w:ascii="Vazirmatn" w:hAnsi="Vazirmatn" w:cs="Vazirmatn"/>
-                <w:sz w:val="20"/>
-                <w:szCs w:val="20"/>
-                <w:color w:val="2D2D2D"/>
-                <w:lang w:val="en-US" w:bidi="fa-IR"/>
-              </w:rPr>
-              <w:t xml:space="preserve"> (</w:t>
-            </w:r>
-            <w:r>
-              <w:rPr>
-                <w:rFonts w:ascii="Vazirmatn" w:hAnsi="Vazirmatn" w:cs="Vazirmatn"/>
-                <w:sz w:val="20"/>
-                <w:szCs w:val="20"/>
-                <w:color w:val="2D2D2D"/>
-                <w:lang w:val="en-US" w:bidi="fa-IR"/>
-              </w:rPr>
-              <w:t>Lag</w:t>
-            </w:r>
-            <w:r>
-              <w:rPr>
-                <w:rFonts w:ascii="Vazirmatn" w:hAnsi="Vazirmatn" w:cs="Vazirmatn"/>
-                <w:sz w:val="20"/>
-                <w:szCs w:val="20"/>
-                <w:color w:val="2D2D2D"/>
-                <w:lang w:val="en-US" w:bidi="fa-IR"/>
-              </w:rPr>
-              <w:t xml:space="preserve"> 0</w:t>
-            </w:r>
-            <w:r>
-              <w:rPr>
-                <w:rFonts w:ascii="Vazirmatn" w:hAnsi="Vazirmatn" w:cs="Vazirmatn"/>
-                <w:sz w:val="20"/>
-                <w:szCs w:val="20"/>
-                <w:color w:val="2D2D2D"/>
-                <w:lang w:val="en-US" w:bidi="fa-IR"/>
-              </w:rPr>
-              <w:t>ms</w:t>
-            </w:r>
-            <w:r>
-              <w:rPr>
-                <w:rFonts w:ascii="Vazirmatn" w:hAnsi="Vazirmatn" w:cs="Vazirmatn"/>
-                <w:sz w:val="20"/>
-                <w:szCs w:val="20"/>
-                <w:color w:val="2D2D2D"/>
-                <w:lang w:val="en-US" w:bidi="fa-IR"/>
-              </w:rPr>
-              <w:t>)</w:t>
+              <w:t>redis-replica-01b</w:t>
             </w:r>
           </w:p>
         </w:tc>
@@ -7670,83 +10209,7 @@
                 <w:color w:val="2D2D2D"/>
                 <w:lang w:val="en-US" w:bidi="fa-IR"/>
               </w:rPr>
-              <w:t>Healthy</w:t>
-            </w:r>
-          </w:p>
-        </w:tc>
-      </w:tr>
-      <w:tr>
-        <w:tc>
-          <w:tcPr>
-            <w:tcW w:type="dxa" w:w="1606"/>
-            <w:shd w:val="clear" w:color="auto" w:fill="FFFFFF"/>
-            <w:tcMar>
-              <w:top w:w="80" w:type="dxa"/>
-              <w:bottom w:w="80" w:type="dxa"/>
-              <w:left w:w="120" w:type="dxa"/>
-              <w:right w:w="120" w:type="dxa"/>
-            </w:tcMar>
-            <w:tcBorders>
-              <w:top w:val="single" w:sz="4" w:space="0" w:color="D8D8D8"/>
-              <w:bottom w:val="single" w:sz="4" w:space="0" w:color="D8D8D8"/>
-              <w:left w:val="single" w:sz="4" w:space="0" w:color="D8D8D8"/>
-              <w:right w:val="single" w:sz="4" w:space="0" w:color="D8D8D8"/>
-            </w:tcBorders>
-          </w:tcPr>
-          <w:p>
-            <w:pPr>
-              <w:jc w:val="start"/>
-            </w:pPr>
-            <w:r/>
-            <w:r>
-              <w:rPr>
-                <w:rFonts w:ascii="Vazirmatn" w:hAnsi="Vazirmatn" w:cs="Vazirmatn"/>
-                <w:sz w:val="20"/>
-                <w:szCs w:val="20"/>
-                <w:color w:val="2D2D2D"/>
-                <w:lang w:val="en-US" w:bidi="fa-IR"/>
-              </w:rPr>
-              <w:t>redis</w:t>
-            </w:r>
-            <w:r>
-              <w:rPr>
-                <w:rFonts w:ascii="Vazirmatn" w:hAnsi="Vazirmatn" w:cs="Vazirmatn"/>
-                <w:sz w:val="20"/>
-                <w:szCs w:val="20"/>
-                <w:color w:val="2D2D2D"/>
-                <w:lang w:val="en-US" w:bidi="fa-IR"/>
-              </w:rPr>
-              <w:t>-</w:t>
-            </w:r>
-            <w:r>
-              <w:rPr>
-                <w:rFonts w:ascii="Vazirmatn" w:hAnsi="Vazirmatn" w:cs="Vazirmatn"/>
-                <w:sz w:val="20"/>
-                <w:szCs w:val="20"/>
-                <w:color w:val="2D2D2D"/>
-                <w:lang w:val="en-US" w:bidi="fa-IR"/>
-              </w:rPr>
-              <w:t>replica</w:t>
-            </w:r>
-            <w:r>
-              <w:rPr>
-                <w:rFonts w:ascii="Vazirmatn" w:hAnsi="Vazirmatn" w:cs="Vazirmatn"/>
-                <w:sz w:val="20"/>
-                <w:szCs w:val="20"/>
-                <w:color w:val="2D2D2D"/>
-                <w:lang w:val="en-US" w:bidi="fa-IR"/>
-              </w:rPr>
-              <w:t>-01</w:t>
-            </w:r>
-            <w:r>
-              <w:rPr>
-                <w:rFonts w:ascii="Vazirmatn" w:hAnsi="Vazirmatn" w:cs="Vazirmatn"/>
-                <w:sz w:val="20"/>
-                <w:szCs w:val="20"/>
-                <w:color w:val="2D2D2D"/>
-                <w:lang w:val="en-US" w:bidi="fa-IR"/>
-              </w:rPr>
-              <w:t>b</w:t>
+              <w:t>Replica</w:t>
             </w:r>
           </w:p>
         </w:tc>
@@ -7780,7 +10243,17 @@
                 <w:color w:val="2D2D2D"/>
                 <w:lang w:val="en-US" w:bidi="fa-IR"/>
               </w:rPr>
-              <w:t>Replica</w:t>
+              <w:t xml:space="preserve">32 </w:t>
+            </w:r>
+            <w:r>
+              <w:rPr>
+                <w:rFonts w:ascii="Vazirmatn" w:hAnsi="Vazirmatn" w:cs="Vazirmatn"/>
+                <w:sz w:val="20"/>
+                <w:szCs w:val="20"/>
+                <w:color w:val="2D2D2D"/>
+                <w:lang w:val="en-US" w:bidi="fa-IR"/>
+              </w:rPr>
+              <w:t>GB</w:t>
             </w:r>
           </w:p>
         </w:tc>
@@ -7814,7 +10287,7 @@
                 <w:color w:val="2D2D2D"/>
                 <w:lang w:val="en-US" w:bidi="fa-IR"/>
               </w:rPr>
-              <w:t xml:space="preserve">32 </w:t>
+              <w:t xml:space="preserve">1.2 </w:t>
             </w:r>
             <w:r>
               <w:rPr>
@@ -7824,7 +10297,7 @@
                 <w:color w:val="2D2D2D"/>
                 <w:lang w:val="en-US" w:bidi="fa-IR"/>
               </w:rPr>
-              <w:t>GB</w:t>
+              <w:t>ms</w:t>
             </w:r>
           </w:p>
         </w:tc>
@@ -7858,8 +10331,32 @@
                 <w:color w:val="2D2D2D"/>
                 <w:lang w:val="en-US" w:bidi="fa-IR"/>
               </w:rPr>
-              <w:t xml:space="preserve">1.2 </w:t>
-            </w:r>
+              <w:t>In-Sync (Lag 1ms)</w:t>
+            </w:r>
+          </w:p>
+        </w:tc>
+        <w:tc>
+          <w:tcPr>
+            <w:tcW w:type="dxa" w:w="1608"/>
+            <w:shd w:val="clear" w:color="auto" w:fill="FFFFFF"/>
+            <w:tcMar>
+              <w:top w:w="80" w:type="dxa"/>
+              <w:bottom w:w="80" w:type="dxa"/>
+              <w:left w:w="120" w:type="dxa"/>
+              <w:right w:w="120" w:type="dxa"/>
+            </w:tcMar>
+            <w:tcBorders>
+              <w:top w:val="single" w:sz="4" w:space="0" w:color="D8D8D8"/>
+              <w:bottom w:val="single" w:sz="4" w:space="0" w:color="D8D8D8"/>
+              <w:left w:val="single" w:sz="4" w:space="0" w:color="D8D8D8"/>
+              <w:right w:val="single" w:sz="4" w:space="0" w:color="D8D8D8"/>
+            </w:tcBorders>
+          </w:tcPr>
+          <w:p>
+            <w:pPr>
+              <w:jc w:val="start"/>
+            </w:pPr>
+            <w:r/>
             <w:r>
               <w:rPr>
                 <w:rFonts w:ascii="Vazirmatn" w:hAnsi="Vazirmatn" w:cs="Vazirmatn"/>
@@ -7868,7 +10365,46 @@
                 <w:color w:val="2D2D2D"/>
                 <w:lang w:val="en-US" w:bidi="fa-IR"/>
               </w:rPr>
-              <w:t>ms</w:t>
+              <w:t>Healthy</w:t>
+            </w:r>
+          </w:p>
+        </w:tc>
+      </w:tr>
+      <w:tr>
+        <w:trPr>
+          <w:cantSplit/>
+        </w:trPr>
+        <w:tc>
+          <w:tcPr>
+            <w:tcW w:type="dxa" w:w="1606"/>
+            <w:shd w:val="clear" w:color="auto" w:fill="FFFFFF"/>
+            <w:tcMar>
+              <w:top w:w="80" w:type="dxa"/>
+              <w:bottom w:w="80" w:type="dxa"/>
+              <w:left w:w="120" w:type="dxa"/>
+              <w:right w:w="120" w:type="dxa"/>
+            </w:tcMar>
+            <w:tcBorders>
+              <w:top w:val="single" w:sz="4" w:space="0" w:color="D8D8D8"/>
+              <w:bottom w:val="single" w:sz="4" w:space="0" w:color="D8D8D8"/>
+              <w:left w:val="single" w:sz="4" w:space="0" w:color="D8D8D8"/>
+              <w:right w:val="single" w:sz="4" w:space="0" w:color="D8D8D8"/>
+            </w:tcBorders>
+          </w:tcPr>
+          <w:p>
+            <w:pPr>
+              <w:jc w:val="start"/>
+            </w:pPr>
+            <w:r/>
+            <w:r>
+              <w:rPr>
+                <w:rFonts w:ascii="Vazirmatn" w:hAnsi="Vazirmatn" w:cs="Vazirmatn"/>
+                <w:sz w:val="20"/>
+                <w:szCs w:val="20"/>
+                <w:color w:val="2D2D2D"/>
+                <w:lang w:val="en-US" w:bidi="fa-IR"/>
+              </w:rPr>
+              <w:t>redis-sentinel-01</w:t>
             </w:r>
           </w:p>
         </w:tc>
@@ -7902,77 +10438,7 @@
                 <w:color w:val="2D2D2D"/>
                 <w:lang w:val="en-US" w:bidi="fa-IR"/>
               </w:rPr>
-              <w:t>In</w:t>
-            </w:r>
-            <w:r>
-              <w:rPr>
-                <w:rFonts w:ascii="Vazirmatn" w:hAnsi="Vazirmatn" w:cs="Vazirmatn"/>
-                <w:sz w:val="20"/>
-                <w:szCs w:val="20"/>
-                <w:color w:val="2D2D2D"/>
-                <w:lang w:val="en-US" w:bidi="fa-IR"/>
-              </w:rPr>
-              <w:t>-</w:t>
-            </w:r>
-            <w:r>
-              <w:rPr>
-                <w:rFonts w:ascii="Vazirmatn" w:hAnsi="Vazirmatn" w:cs="Vazirmatn"/>
-                <w:sz w:val="20"/>
-                <w:szCs w:val="20"/>
-                <w:color w:val="2D2D2D"/>
-                <w:lang w:val="en-US" w:bidi="fa-IR"/>
-              </w:rPr>
-              <w:t>Sync</w:t>
-            </w:r>
-            <w:r>
-              <w:rPr>
-                <w:rFonts w:ascii="Vazirmatn" w:hAnsi="Vazirmatn" w:cs="Vazirmatn"/>
-                <w:sz w:val="20"/>
-                <w:szCs w:val="20"/>
-                <w:color w:val="2D2D2D"/>
-                <w:lang w:val="en-US" w:bidi="fa-IR"/>
-              </w:rPr>
-              <w:t xml:space="preserve"> (</w:t>
-            </w:r>
-            <w:r>
-              <w:rPr>
-                <w:rFonts w:ascii="Vazirmatn" w:hAnsi="Vazirmatn" w:cs="Vazirmatn"/>
-                <w:sz w:val="20"/>
-                <w:szCs w:val="20"/>
-                <w:color w:val="2D2D2D"/>
-                <w:lang w:val="en-US" w:bidi="fa-IR"/>
-              </w:rPr>
-              <w:t>Lag</w:t>
-            </w:r>
-            <w:r>
-              <w:rPr>
-                <w:rFonts w:ascii="Vazirmatn" w:hAnsi="Vazirmatn" w:cs="Vazirmatn"/>
-                <w:sz w:val="20"/>
-                <w:szCs w:val="20"/>
-                <w:color w:val="2D2D2D"/>
-                <w:lang w:val="en-US" w:bidi="fa-IR"/>
-              </w:rPr>
-              <w:t xml:space="preserve"> 1</w:t>
-            </w:r>
-            <w:r>
-              <w:rPr>
-                <w:rFonts w:ascii="Vazirmatn" w:hAnsi="Vazirmatn" w:cs="Vazirmatn"/>
-                <w:sz w:val="20"/>
-                <w:szCs w:val="20"/>
-                <w:color w:val="2D2D2D"/>
-                <w:lang w:val="en-US" w:bidi="fa-IR"/>
-              </w:rPr>
-              <w:t>ms</w:t>
-            </w:r>
-            <w:r>
-              <w:rPr>
-                <w:rFonts w:ascii="Vazirmatn" w:hAnsi="Vazirmatn" w:cs="Vazirmatn"/>
-                <w:sz w:val="20"/>
-                <w:szCs w:val="20"/>
-                <w:color w:val="2D2D2D"/>
-                <w:lang w:val="en-US" w:bidi="fa-IR"/>
-              </w:rPr>
-              <w:t>)</w:t>
+              <w:t>Monitor</w:t>
             </w:r>
           </w:p>
         </w:tc>
@@ -8006,34 +10472,8 @@
                 <w:color w:val="2D2D2D"/>
                 <w:lang w:val="en-US" w:bidi="fa-IR"/>
               </w:rPr>
-              <w:t>Healthy</w:t>
-            </w:r>
-          </w:p>
-        </w:tc>
-      </w:tr>
-      <w:tr>
-        <w:tc>
-          <w:tcPr>
-            <w:tcW w:type="dxa" w:w="1606"/>
-            <w:shd w:val="clear" w:color="auto" w:fill="FFFFFF"/>
-            <w:tcMar>
-              <w:top w:w="80" w:type="dxa"/>
-              <w:bottom w:w="80" w:type="dxa"/>
-              <w:left w:w="120" w:type="dxa"/>
-              <w:right w:w="120" w:type="dxa"/>
-            </w:tcMar>
-            <w:tcBorders>
-              <w:top w:val="single" w:sz="4" w:space="0" w:color="D8D8D8"/>
-              <w:bottom w:val="single" w:sz="4" w:space="0" w:color="D8D8D8"/>
-              <w:left w:val="single" w:sz="4" w:space="0" w:color="D8D8D8"/>
-              <w:right w:val="single" w:sz="4" w:space="0" w:color="D8D8D8"/>
-            </w:tcBorders>
-          </w:tcPr>
-          <w:p>
-            <w:pPr>
-              <w:jc w:val="start"/>
-            </w:pPr>
-            <w:r/>
+              <w:t xml:space="preserve">512 </w:t>
+            </w:r>
             <w:r>
               <w:rPr>
                 <w:rFonts w:ascii="Vazirmatn" w:hAnsi="Vazirmatn" w:cs="Vazirmatn"/>
@@ -8042,37 +10482,7 @@
                 <w:color w:val="2D2D2D"/>
                 <w:lang w:val="en-US" w:bidi="fa-IR"/>
               </w:rPr>
-              <w:t>redis</w:t>
-            </w:r>
-            <w:r>
-              <w:rPr>
-                <w:rFonts w:ascii="Vazirmatn" w:hAnsi="Vazirmatn" w:cs="Vazirmatn"/>
-                <w:sz w:val="20"/>
-                <w:szCs w:val="20"/>
-                <w:color w:val="2D2D2D"/>
-                <w:lang w:val="en-US" w:bidi="fa-IR"/>
-              </w:rPr>
-              <w:t>-</w:t>
-            </w:r>
-            <w:r>
-              <w:rPr>
-                <w:rFonts w:ascii="Vazirmatn" w:hAnsi="Vazirmatn" w:cs="Vazirmatn"/>
-                <w:sz w:val="20"/>
-                <w:szCs w:val="20"/>
-                <w:color w:val="2D2D2D"/>
-                <w:lang w:val="en-US" w:bidi="fa-IR"/>
-              </w:rPr>
-              <w:t>sentinel</w:t>
-            </w:r>
-            <w:r>
-              <w:rPr>
-                <w:rFonts w:ascii="Vazirmatn" w:hAnsi="Vazirmatn" w:cs="Vazirmatn"/>
-                <w:sz w:val="20"/>
-                <w:szCs w:val="20"/>
-                <w:color w:val="2D2D2D"/>
-                <w:lang w:val="en-US" w:bidi="fa-IR"/>
-              </w:rPr>
-              <w:t>-01</w:t>
+              <w:t>MB</w:t>
             </w:r>
           </w:p>
         </w:tc>
@@ -8106,7 +10516,17 @@
                 <w:color w:val="2D2D2D"/>
                 <w:lang w:val="en-US" w:bidi="fa-IR"/>
               </w:rPr>
-              <w:t>Monitor</w:t>
+              <w:t xml:space="preserve">0.2 </w:t>
+            </w:r>
+            <w:r>
+              <w:rPr>
+                <w:rFonts w:ascii="Vazirmatn" w:hAnsi="Vazirmatn" w:cs="Vazirmatn"/>
+                <w:sz w:val="20"/>
+                <w:szCs w:val="20"/>
+                <w:color w:val="2D2D2D"/>
+                <w:lang w:val="en-US" w:bidi="fa-IR"/>
+              </w:rPr>
+              <w:t>ms</w:t>
             </w:r>
           </w:p>
         </w:tc>
@@ -8140,23 +10560,13 @@
                 <w:color w:val="2D2D2D"/>
                 <w:lang w:val="en-US" w:bidi="fa-IR"/>
               </w:rPr>
-              <w:t xml:space="preserve">512 </w:t>
-            </w:r>
-            <w:r>
-              <w:rPr>
-                <w:rFonts w:ascii="Vazirmatn" w:hAnsi="Vazirmatn" w:cs="Vazirmatn"/>
-                <w:sz w:val="20"/>
-                <w:szCs w:val="20"/>
-                <w:color w:val="2D2D2D"/>
-                <w:lang w:val="en-US" w:bidi="fa-IR"/>
-              </w:rPr>
-              <w:t>MB</w:t>
+              <w:t>Quorum Active</w:t>
             </w:r>
           </w:p>
         </w:tc>
         <w:tc>
           <w:tcPr>
-            <w:tcW w:type="dxa" w:w="1606"/>
+            <w:tcW w:type="dxa" w:w="1608"/>
             <w:shd w:val="clear" w:color="auto" w:fill="FFFFFF"/>
             <w:tcMar>
               <w:top w:w="80" w:type="dxa"/>
@@ -8184,84 +10594,6 @@
                 <w:color w:val="2D2D2D"/>
                 <w:lang w:val="en-US" w:bidi="fa-IR"/>
               </w:rPr>
-              <w:t xml:space="preserve">0.2 </w:t>
-            </w:r>
-            <w:r>
-              <w:rPr>
-                <w:rFonts w:ascii="Vazirmatn" w:hAnsi="Vazirmatn" w:cs="Vazirmatn"/>
-                <w:sz w:val="20"/>
-                <w:szCs w:val="20"/>
-                <w:color w:val="2D2D2D"/>
-                <w:lang w:val="en-US" w:bidi="fa-IR"/>
-              </w:rPr>
-              <w:t>ms</w:t>
-            </w:r>
-          </w:p>
-        </w:tc>
-        <w:tc>
-          <w:tcPr>
-            <w:tcW w:type="dxa" w:w="1606"/>
-            <w:shd w:val="clear" w:color="auto" w:fill="FFFFFF"/>
-            <w:tcMar>
-              <w:top w:w="80" w:type="dxa"/>
-              <w:bottom w:w="80" w:type="dxa"/>
-              <w:left w:w="120" w:type="dxa"/>
-              <w:right w:w="120" w:type="dxa"/>
-            </w:tcMar>
-            <w:tcBorders>
-              <w:top w:val="single" w:sz="4" w:space="0" w:color="D8D8D8"/>
-              <w:bottom w:val="single" w:sz="4" w:space="0" w:color="D8D8D8"/>
-              <w:left w:val="single" w:sz="4" w:space="0" w:color="D8D8D8"/>
-              <w:right w:val="single" w:sz="4" w:space="0" w:color="D8D8D8"/>
-            </w:tcBorders>
-          </w:tcPr>
-          <w:p>
-            <w:pPr>
-              <w:jc w:val="start"/>
-            </w:pPr>
-            <w:r/>
-            <w:r>
-              <w:rPr>
-                <w:rFonts w:ascii="Vazirmatn" w:hAnsi="Vazirmatn" w:cs="Vazirmatn"/>
-                <w:sz w:val="20"/>
-                <w:szCs w:val="20"/>
-                <w:color w:val="2D2D2D"/>
-                <w:lang w:val="en-US" w:bidi="fa-IR"/>
-              </w:rPr>
-              <w:t>Quorum Active</w:t>
-            </w:r>
-          </w:p>
-        </w:tc>
-        <w:tc>
-          <w:tcPr>
-            <w:tcW w:type="dxa" w:w="1606"/>
-            <w:shd w:val="clear" w:color="auto" w:fill="FFFFFF"/>
-            <w:tcMar>
-              <w:top w:w="80" w:type="dxa"/>
-              <w:bottom w:w="80" w:type="dxa"/>
-              <w:left w:w="120" w:type="dxa"/>
-              <w:right w:w="120" w:type="dxa"/>
-            </w:tcMar>
-            <w:tcBorders>
-              <w:top w:val="single" w:sz="4" w:space="0" w:color="D8D8D8"/>
-              <w:bottom w:val="single" w:sz="4" w:space="0" w:color="D8D8D8"/>
-              <w:left w:val="single" w:sz="4" w:space="0" w:color="D8D8D8"/>
-              <w:right w:val="single" w:sz="4" w:space="0" w:color="D8D8D8"/>
-            </w:tcBorders>
-          </w:tcPr>
-          <w:p>
-            <w:pPr>
-              <w:jc w:val="start"/>
-            </w:pPr>
-            <w:r/>
-            <w:r>
-              <w:rPr>
-                <w:rFonts w:ascii="Vazirmatn" w:hAnsi="Vazirmatn" w:cs="Vazirmatn"/>
-                <w:sz w:val="20"/>
-                <w:szCs w:val="20"/>
-                <w:color w:val="2D2D2D"/>
-                <w:lang w:val="en-US" w:bidi="fa-IR"/>
-              </w:rPr>
               <w:t>Healthy</w:t>
             </w:r>
           </w:p>
@@ -8276,13 +10608,13 @@
     </w:p>
     <w:tbl>
       <w:tblPr>
-        <w:tblW w:type="auto" w:w="0"/>
+        <w:tblW w:type="dxa" w:w="9638"/>
         <w:tblLayout w:type="fixed"/>
         <w:tblLook w:firstColumn="1" w:firstRow="1" w:lastColumn="0" w:lastRow="0" w:noHBand="0" w:noVBand="1" w:val="04A0"/>
       </w:tblPr>
       <w:tblGrid>
-        <w:gridCol w:w="4819"/>
-        <w:gridCol w:w="4819"/>
+        <w:gridCol w:w="936"/>
+        <w:gridCol w:w="8702"/>
       </w:tblGrid>
       <w:tr>
         <w:tc>
@@ -8306,7 +10638,6 @@
             <w:pPr>
               <w:jc w:val="center"/>
             </w:pPr>
-            <w:r/>
             <w:r>
               <w:rPr>
                 <w:rFonts w:ascii="Vazirmatn" w:hAnsi="Vazirmatn" w:cs="Vazirmatn"/>
@@ -8341,7 +10672,6 @@
             <w:pPr>
               <w:jc w:val="start"/>
             </w:pPr>
-            <w:r/>
             <w:r>
               <w:rPr>
                 <w:rFonts w:ascii="Vazirmatn" w:hAnsi="Vazirmatn" w:cs="Vazirmatn"/>
@@ -8366,7 +10696,7 @@
     </w:p>
     <w:p>
       <w:pPr>
-        <w:spacing w:line="324" w:lineRule="auto" w:after="120"/>
+        <w:spacing w:line="336" w:lineRule="auto" w:after="120"/>
         <w:jc w:val="both"/>
       </w:pPr>
       <w:r>
@@ -8377,7 +10707,7 @@
           <w:color w:val="2D2D2D"/>
           <w:lang w:val="en-US" w:bidi="fa-IR"/>
         </w:rPr>
-        <w:t>All replica snapshots are streamed to cold storage buckets nightly</w:t>
+        <w:t>All</w:t>
       </w:r>
       <w:r>
         <w:rPr>
@@ -8387,7 +10717,7 @@
           <w:color w:val="2D2D2D"/>
           <w:lang w:val="en-US" w:bidi="fa-IR"/>
         </w:rPr>
-        <w:t xml:space="preserve">. </w:t>
+        <w:t xml:space="preserve"> </w:t>
       </w:r>
       <w:r>
         <w:rPr>
@@ -8397,7 +10727,7 @@
           <w:color w:val="2D2D2D"/>
           <w:lang w:val="en-US" w:bidi="fa-IR"/>
         </w:rPr>
-        <w:t>Automated verification ensures RPO</w:t>
+        <w:t>replica</w:t>
       </w:r>
       <w:r>
         <w:rPr>
@@ -8407,7 +10737,7 @@
           <w:color w:val="2D2D2D"/>
           <w:lang w:val="en-US" w:bidi="fa-IR"/>
         </w:rPr>
-        <w:t xml:space="preserve"> (</w:t>
+        <w:t xml:space="preserve"> </w:t>
       </w:r>
       <w:r>
         <w:rPr>
@@ -8417,7 +10747,7 @@
           <w:color w:val="2D2D2D"/>
           <w:lang w:val="en-US" w:bidi="fa-IR"/>
         </w:rPr>
-        <w:t>Recovery Point Objective</w:t>
+        <w:t>snapshots</w:t>
       </w:r>
       <w:r>
         <w:rPr>
@@ -8427,7 +10757,307 @@
           <w:color w:val="2D2D2D"/>
           <w:lang w:val="en-US" w:bidi="fa-IR"/>
         </w:rPr>
-        <w:t xml:space="preserve">) </w:t>
+        <w:t xml:space="preserve"> </w:t>
+      </w:r>
+      <w:r>
+        <w:rPr>
+          <w:rFonts w:ascii="Vazirmatn" w:hAnsi="Vazirmatn" w:cs="Vazirmatn"/>
+          <w:sz w:val="22"/>
+          <w:szCs w:val="22"/>
+          <w:color w:val="2D2D2D"/>
+          <w:lang w:val="en-US" w:bidi="fa-IR"/>
+        </w:rPr>
+        <w:t>are</w:t>
+      </w:r>
+      <w:r>
+        <w:rPr>
+          <w:rFonts w:ascii="Vazirmatn" w:hAnsi="Vazirmatn" w:cs="Vazirmatn"/>
+          <w:sz w:val="22"/>
+          <w:szCs w:val="22"/>
+          <w:color w:val="2D2D2D"/>
+          <w:lang w:val="en-US" w:bidi="fa-IR"/>
+        </w:rPr>
+        <w:t xml:space="preserve"> </w:t>
+      </w:r>
+      <w:r>
+        <w:rPr>
+          <w:rFonts w:ascii="Vazirmatn" w:hAnsi="Vazirmatn" w:cs="Vazirmatn"/>
+          <w:sz w:val="22"/>
+          <w:szCs w:val="22"/>
+          <w:color w:val="2D2D2D"/>
+          <w:lang w:val="en-US" w:bidi="fa-IR"/>
+        </w:rPr>
+        <w:t>streamed</w:t>
+      </w:r>
+      <w:r>
+        <w:rPr>
+          <w:rFonts w:ascii="Vazirmatn" w:hAnsi="Vazirmatn" w:cs="Vazirmatn"/>
+          <w:sz w:val="22"/>
+          <w:szCs w:val="22"/>
+          <w:color w:val="2D2D2D"/>
+          <w:lang w:val="en-US" w:bidi="fa-IR"/>
+        </w:rPr>
+        <w:t xml:space="preserve"> </w:t>
+      </w:r>
+      <w:r>
+        <w:rPr>
+          <w:rFonts w:ascii="Vazirmatn" w:hAnsi="Vazirmatn" w:cs="Vazirmatn"/>
+          <w:sz w:val="22"/>
+          <w:szCs w:val="22"/>
+          <w:color w:val="2D2D2D"/>
+          <w:lang w:val="en-US" w:bidi="fa-IR"/>
+        </w:rPr>
+        <w:t>to</w:t>
+      </w:r>
+      <w:r>
+        <w:rPr>
+          <w:rFonts w:ascii="Vazirmatn" w:hAnsi="Vazirmatn" w:cs="Vazirmatn"/>
+          <w:sz w:val="22"/>
+          <w:szCs w:val="22"/>
+          <w:color w:val="2D2D2D"/>
+          <w:lang w:val="en-US" w:bidi="fa-IR"/>
+        </w:rPr>
+        <w:t xml:space="preserve"> </w:t>
+      </w:r>
+      <w:r>
+        <w:rPr>
+          <w:rFonts w:ascii="Vazirmatn" w:hAnsi="Vazirmatn" w:cs="Vazirmatn"/>
+          <w:sz w:val="22"/>
+          <w:szCs w:val="22"/>
+          <w:color w:val="2D2D2D"/>
+          <w:lang w:val="en-US" w:bidi="fa-IR"/>
+        </w:rPr>
+        <w:t>cold</w:t>
+      </w:r>
+      <w:r>
+        <w:rPr>
+          <w:rFonts w:ascii="Vazirmatn" w:hAnsi="Vazirmatn" w:cs="Vazirmatn"/>
+          <w:sz w:val="22"/>
+          <w:szCs w:val="22"/>
+          <w:color w:val="2D2D2D"/>
+          <w:lang w:val="en-US" w:bidi="fa-IR"/>
+        </w:rPr>
+        <w:t xml:space="preserve"> </w:t>
+      </w:r>
+      <w:r>
+        <w:rPr>
+          <w:rFonts w:ascii="Vazirmatn" w:hAnsi="Vazirmatn" w:cs="Vazirmatn"/>
+          <w:sz w:val="22"/>
+          <w:szCs w:val="22"/>
+          <w:color w:val="2D2D2D"/>
+          <w:lang w:val="en-US" w:bidi="fa-IR"/>
+        </w:rPr>
+        <w:t>storage</w:t>
+      </w:r>
+      <w:r>
+        <w:rPr>
+          <w:rFonts w:ascii="Vazirmatn" w:hAnsi="Vazirmatn" w:cs="Vazirmatn"/>
+          <w:sz w:val="22"/>
+          <w:szCs w:val="22"/>
+          <w:color w:val="2D2D2D"/>
+          <w:lang w:val="en-US" w:bidi="fa-IR"/>
+        </w:rPr>
+        <w:t xml:space="preserve"> </w:t>
+      </w:r>
+      <w:r>
+        <w:rPr>
+          <w:rFonts w:ascii="Vazirmatn" w:hAnsi="Vazirmatn" w:cs="Vazirmatn"/>
+          <w:sz w:val="22"/>
+          <w:szCs w:val="22"/>
+          <w:color w:val="2D2D2D"/>
+          <w:lang w:val="en-US" w:bidi="fa-IR"/>
+        </w:rPr>
+        <w:t>buckets</w:t>
+      </w:r>
+      <w:r>
+        <w:rPr>
+          <w:rFonts w:ascii="Vazirmatn" w:hAnsi="Vazirmatn" w:cs="Vazirmatn"/>
+          <w:sz w:val="22"/>
+          <w:szCs w:val="22"/>
+          <w:color w:val="2D2D2D"/>
+          <w:lang w:val="en-US" w:bidi="fa-IR"/>
+        </w:rPr>
+        <w:t xml:space="preserve"> </w:t>
+      </w:r>
+      <w:r>
+        <w:rPr>
+          <w:rFonts w:ascii="Vazirmatn" w:hAnsi="Vazirmatn" w:cs="Vazirmatn"/>
+          <w:sz w:val="22"/>
+          <w:szCs w:val="22"/>
+          <w:color w:val="2D2D2D"/>
+          <w:lang w:val="en-US" w:bidi="fa-IR"/>
+        </w:rPr>
+        <w:t>nightly.</w:t>
+      </w:r>
+      <w:r>
+        <w:rPr>
+          <w:rFonts w:ascii="Vazirmatn" w:hAnsi="Vazirmatn" w:cs="Vazirmatn"/>
+          <w:sz w:val="22"/>
+          <w:szCs w:val="22"/>
+          <w:color w:val="2D2D2D"/>
+          <w:lang w:val="en-US" w:bidi="fa-IR"/>
+        </w:rPr>
+        <w:t xml:space="preserve"> </w:t>
+      </w:r>
+      <w:r>
+        <w:rPr>
+          <w:rFonts w:ascii="Vazirmatn" w:hAnsi="Vazirmatn" w:cs="Vazirmatn"/>
+          <w:sz w:val="22"/>
+          <w:szCs w:val="22"/>
+          <w:color w:val="2D2D2D"/>
+          <w:lang w:val="en-US" w:bidi="fa-IR"/>
+        </w:rPr>
+        <w:t>Automated</w:t>
+      </w:r>
+      <w:r>
+        <w:rPr>
+          <w:rFonts w:ascii="Vazirmatn" w:hAnsi="Vazirmatn" w:cs="Vazirmatn"/>
+          <w:sz w:val="22"/>
+          <w:szCs w:val="22"/>
+          <w:color w:val="2D2D2D"/>
+          <w:lang w:val="en-US" w:bidi="fa-IR"/>
+        </w:rPr>
+        <w:t xml:space="preserve"> </w:t>
+      </w:r>
+      <w:r>
+        <w:rPr>
+          <w:rFonts w:ascii="Vazirmatn" w:hAnsi="Vazirmatn" w:cs="Vazirmatn"/>
+          <w:sz w:val="22"/>
+          <w:szCs w:val="22"/>
+          <w:color w:val="2D2D2D"/>
+          <w:lang w:val="en-US" w:bidi="fa-IR"/>
+        </w:rPr>
+        <w:t>verification</w:t>
+      </w:r>
+      <w:r>
+        <w:rPr>
+          <w:rFonts w:ascii="Vazirmatn" w:hAnsi="Vazirmatn" w:cs="Vazirmatn"/>
+          <w:sz w:val="22"/>
+          <w:szCs w:val="22"/>
+          <w:color w:val="2D2D2D"/>
+          <w:lang w:val="en-US" w:bidi="fa-IR"/>
+        </w:rPr>
+        <w:t xml:space="preserve"> </w:t>
+      </w:r>
+      <w:r>
+        <w:rPr>
+          <w:rFonts w:ascii="Vazirmatn" w:hAnsi="Vazirmatn" w:cs="Vazirmatn"/>
+          <w:sz w:val="22"/>
+          <w:szCs w:val="22"/>
+          <w:color w:val="2D2D2D"/>
+          <w:lang w:val="en-US" w:bidi="fa-IR"/>
+        </w:rPr>
+        <w:t>ensures</w:t>
+      </w:r>
+      <w:r>
+        <w:rPr>
+          <w:rFonts w:ascii="Vazirmatn" w:hAnsi="Vazirmatn" w:cs="Vazirmatn"/>
+          <w:sz w:val="22"/>
+          <w:szCs w:val="22"/>
+          <w:color w:val="2D2D2D"/>
+          <w:lang w:val="en-US" w:bidi="fa-IR"/>
+        </w:rPr>
+        <w:t xml:space="preserve"> </w:t>
+      </w:r>
+      <w:r>
+        <w:rPr>
+          <w:rFonts w:ascii="Vazirmatn" w:hAnsi="Vazirmatn" w:cs="Vazirmatn"/>
+          <w:sz w:val="22"/>
+          <w:szCs w:val="22"/>
+          <w:color w:val="2D2D2D"/>
+          <w:lang w:val="en-US" w:bidi="fa-IR"/>
+        </w:rPr>
+        <w:t>RPO</w:t>
+      </w:r>
+      <w:r>
+        <w:rPr>
+          <w:rFonts w:ascii="Vazirmatn" w:hAnsi="Vazirmatn" w:cs="Vazirmatn"/>
+          <w:sz w:val="22"/>
+          <w:szCs w:val="22"/>
+          <w:color w:val="2D2D2D"/>
+          <w:lang w:val="en-US" w:bidi="fa-IR"/>
+        </w:rPr>
+        <w:t xml:space="preserve"> </w:t>
+      </w:r>
+      <w:r>
+        <w:rPr>
+          <w:rFonts w:ascii="Vazirmatn" w:hAnsi="Vazirmatn" w:cs="Vazirmatn"/>
+          <w:sz w:val="22"/>
+          <w:szCs w:val="22"/>
+          <w:color w:val="2D2D2D"/>
+          <w:lang w:val="en-US" w:bidi="fa-IR"/>
+        </w:rPr>
+        <w:t>(</w:t>
+      </w:r>
+      <w:r>
+        <w:rPr>
+          <w:rFonts w:ascii="Vazirmatn" w:hAnsi="Vazirmatn" w:cs="Vazirmatn"/>
+          <w:sz w:val="22"/>
+          <w:szCs w:val="22"/>
+          <w:color w:val="2D2D2D"/>
+          <w:lang w:val="en-US" w:bidi="fa-IR"/>
+        </w:rPr>
+        <w:t>Recovery</w:t>
+      </w:r>
+      <w:r>
+        <w:rPr>
+          <w:rFonts w:ascii="Vazirmatn" w:hAnsi="Vazirmatn" w:cs="Vazirmatn"/>
+          <w:sz w:val="22"/>
+          <w:szCs w:val="22"/>
+          <w:color w:val="2D2D2D"/>
+          <w:lang w:val="en-US" w:bidi="fa-IR"/>
+        </w:rPr>
+        <w:t xml:space="preserve"> </w:t>
+      </w:r>
+      <w:r>
+        <w:rPr>
+          <w:rFonts w:ascii="Vazirmatn" w:hAnsi="Vazirmatn" w:cs="Vazirmatn"/>
+          <w:sz w:val="22"/>
+          <w:szCs w:val="22"/>
+          <w:color w:val="2D2D2D"/>
+          <w:lang w:val="en-US" w:bidi="fa-IR"/>
+        </w:rPr>
+        <w:t>Point</w:t>
+      </w:r>
+      <w:r>
+        <w:rPr>
+          <w:rFonts w:ascii="Vazirmatn" w:hAnsi="Vazirmatn" w:cs="Vazirmatn"/>
+          <w:sz w:val="22"/>
+          <w:szCs w:val="22"/>
+          <w:color w:val="2D2D2D"/>
+          <w:lang w:val="en-US" w:bidi="fa-IR"/>
+        </w:rPr>
+        <w:t xml:space="preserve"> </w:t>
+      </w:r>
+      <w:r>
+        <w:rPr>
+          <w:rFonts w:ascii="Vazirmatn" w:hAnsi="Vazirmatn" w:cs="Vazirmatn"/>
+          <w:sz w:val="22"/>
+          <w:szCs w:val="22"/>
+          <w:color w:val="2D2D2D"/>
+          <w:lang w:val="en-US" w:bidi="fa-IR"/>
+        </w:rPr>
+        <w:t>Objective</w:t>
+      </w:r>
+      <w:r>
+        <w:rPr>
+          <w:rFonts w:ascii="Vazirmatn" w:hAnsi="Vazirmatn" w:cs="Vazirmatn"/>
+          <w:sz w:val="22"/>
+          <w:szCs w:val="22"/>
+          <w:color w:val="2D2D2D"/>
+          <w:lang w:val="en-US" w:bidi="fa-IR"/>
+        </w:rPr>
+        <w:t>)</w:t>
+      </w:r>
+      <w:r>
+        <w:rPr>
+          <w:rFonts w:ascii="Vazirmatn" w:hAnsi="Vazirmatn" w:cs="Vazirmatn"/>
+          <w:sz w:val="22"/>
+          <w:szCs w:val="22"/>
+          <w:color w:val="2D2D2D"/>
+          <w:lang w:val="en-US" w:bidi="fa-IR"/>
+        </w:rPr>
+        <w:t xml:space="preserve"> </w:t>
       </w:r>
       <w:r>
         <w:rPr>
@@ -8447,7 +11077,7 @@
           <w:color w:val="2D2D2D"/>
           <w:lang w:val="en-US" w:bidi="fa-IR"/>
         </w:rPr>
-        <w:t xml:space="preserve"> 15 </w:t>
+        <w:t xml:space="preserve"> </w:t>
       </w:r>
       <w:r>
         <w:rPr>
@@ -8457,7 +11087,7 @@
           <w:color w:val="2D2D2D"/>
           <w:lang w:val="en-US" w:bidi="fa-IR"/>
         </w:rPr>
-        <w:t>minutes and RTO</w:t>
+        <w:t>15</w:t>
       </w:r>
       <w:r>
         <w:rPr>
@@ -8467,7 +11097,7 @@
           <w:color w:val="2D2D2D"/>
           <w:lang w:val="en-US" w:bidi="fa-IR"/>
         </w:rPr>
-        <w:t xml:space="preserve"> (</w:t>
+        <w:t xml:space="preserve"> </w:t>
       </w:r>
       <w:r>
         <w:rPr>
@@ -8477,7 +11107,7 @@
           <w:color w:val="2D2D2D"/>
           <w:lang w:val="en-US" w:bidi="fa-IR"/>
         </w:rPr>
-        <w:t>Recovery Time Objective</w:t>
+        <w:t>minutes</w:t>
       </w:r>
       <w:r>
         <w:rPr>
@@ -8487,7 +11117,127 @@
           <w:color w:val="2D2D2D"/>
           <w:lang w:val="en-US" w:bidi="fa-IR"/>
         </w:rPr>
-        <w:t xml:space="preserve">) </w:t>
+        <w:t xml:space="preserve"> </w:t>
+      </w:r>
+      <w:r>
+        <w:rPr>
+          <w:rFonts w:ascii="Vazirmatn" w:hAnsi="Vazirmatn" w:cs="Vazirmatn"/>
+          <w:sz w:val="22"/>
+          <w:szCs w:val="22"/>
+          <w:color w:val="2D2D2D"/>
+          <w:lang w:val="en-US" w:bidi="fa-IR"/>
+        </w:rPr>
+        <w:t>and</w:t>
+      </w:r>
+      <w:r>
+        <w:rPr>
+          <w:rFonts w:ascii="Vazirmatn" w:hAnsi="Vazirmatn" w:cs="Vazirmatn"/>
+          <w:sz w:val="22"/>
+          <w:szCs w:val="22"/>
+          <w:color w:val="2D2D2D"/>
+          <w:lang w:val="en-US" w:bidi="fa-IR"/>
+        </w:rPr>
+        <w:t xml:space="preserve"> </w:t>
+      </w:r>
+      <w:r>
+        <w:rPr>
+          <w:rFonts w:ascii="Vazirmatn" w:hAnsi="Vazirmatn" w:cs="Vazirmatn"/>
+          <w:sz w:val="22"/>
+          <w:szCs w:val="22"/>
+          <w:color w:val="2D2D2D"/>
+          <w:lang w:val="en-US" w:bidi="fa-IR"/>
+        </w:rPr>
+        <w:t>RTO</w:t>
+      </w:r>
+      <w:r>
+        <w:rPr>
+          <w:rFonts w:ascii="Vazirmatn" w:hAnsi="Vazirmatn" w:cs="Vazirmatn"/>
+          <w:sz w:val="22"/>
+          <w:szCs w:val="22"/>
+          <w:color w:val="2D2D2D"/>
+          <w:lang w:val="en-US" w:bidi="fa-IR"/>
+        </w:rPr>
+        <w:t xml:space="preserve"> </w:t>
+      </w:r>
+      <w:r>
+        <w:rPr>
+          <w:rFonts w:ascii="Vazirmatn" w:hAnsi="Vazirmatn" w:cs="Vazirmatn"/>
+          <w:sz w:val="22"/>
+          <w:szCs w:val="22"/>
+          <w:color w:val="2D2D2D"/>
+          <w:lang w:val="en-US" w:bidi="fa-IR"/>
+        </w:rPr>
+        <w:t>(</w:t>
+      </w:r>
+      <w:r>
+        <w:rPr>
+          <w:rFonts w:ascii="Vazirmatn" w:hAnsi="Vazirmatn" w:cs="Vazirmatn"/>
+          <w:sz w:val="22"/>
+          <w:szCs w:val="22"/>
+          <w:color w:val="2D2D2D"/>
+          <w:lang w:val="en-US" w:bidi="fa-IR"/>
+        </w:rPr>
+        <w:t>Recovery</w:t>
+      </w:r>
+      <w:r>
+        <w:rPr>
+          <w:rFonts w:ascii="Vazirmatn" w:hAnsi="Vazirmatn" w:cs="Vazirmatn"/>
+          <w:sz w:val="22"/>
+          <w:szCs w:val="22"/>
+          <w:color w:val="2D2D2D"/>
+          <w:lang w:val="en-US" w:bidi="fa-IR"/>
+        </w:rPr>
+        <w:t xml:space="preserve"> </w:t>
+      </w:r>
+      <w:r>
+        <w:rPr>
+          <w:rFonts w:ascii="Vazirmatn" w:hAnsi="Vazirmatn" w:cs="Vazirmatn"/>
+          <w:sz w:val="22"/>
+          <w:szCs w:val="22"/>
+          <w:color w:val="2D2D2D"/>
+          <w:lang w:val="en-US" w:bidi="fa-IR"/>
+        </w:rPr>
+        <w:t>Time</w:t>
+      </w:r>
+      <w:r>
+        <w:rPr>
+          <w:rFonts w:ascii="Vazirmatn" w:hAnsi="Vazirmatn" w:cs="Vazirmatn"/>
+          <w:sz w:val="22"/>
+          <w:szCs w:val="22"/>
+          <w:color w:val="2D2D2D"/>
+          <w:lang w:val="en-US" w:bidi="fa-IR"/>
+        </w:rPr>
+        <w:t xml:space="preserve"> </w:t>
+      </w:r>
+      <w:r>
+        <w:rPr>
+          <w:rFonts w:ascii="Vazirmatn" w:hAnsi="Vazirmatn" w:cs="Vazirmatn"/>
+          <w:sz w:val="22"/>
+          <w:szCs w:val="22"/>
+          <w:color w:val="2D2D2D"/>
+          <w:lang w:val="en-US" w:bidi="fa-IR"/>
+        </w:rPr>
+        <w:t>Objective</w:t>
+      </w:r>
+      <w:r>
+        <w:rPr>
+          <w:rFonts w:ascii="Vazirmatn" w:hAnsi="Vazirmatn" w:cs="Vazirmatn"/>
+          <w:sz w:val="22"/>
+          <w:szCs w:val="22"/>
+          <w:color w:val="2D2D2D"/>
+          <w:lang w:val="en-US" w:bidi="fa-IR"/>
+        </w:rPr>
+        <w:t>)</w:t>
+      </w:r>
+      <w:r>
+        <w:rPr>
+          <w:rFonts w:ascii="Vazirmatn" w:hAnsi="Vazirmatn" w:cs="Vazirmatn"/>
+          <w:sz w:val="22"/>
+          <w:szCs w:val="22"/>
+          <w:color w:val="2D2D2D"/>
+          <w:lang w:val="en-US" w:bidi="fa-IR"/>
+        </w:rPr>
+        <w:t xml:space="preserve"> </w:t>
       </w:r>
       <w:r>
         <w:rPr>
@@ -8507,7 +11257,7 @@
           <w:color w:val="2D2D2D"/>
           <w:lang w:val="en-US" w:bidi="fa-IR"/>
         </w:rPr>
-        <w:t xml:space="preserve"> 5 </w:t>
+        <w:t xml:space="preserve"> </w:t>
       </w:r>
       <w:r>
         <w:rPr>
@@ -8517,7 +11267,7 @@
           <w:color w:val="2D2D2D"/>
           <w:lang w:val="en-US" w:bidi="fa-IR"/>
         </w:rPr>
-        <w:t>minutes</w:t>
+        <w:t>5</w:t>
       </w:r>
       <w:r>
         <w:rPr>
@@ -8527,7 +11277,17 @@
           <w:color w:val="2D2D2D"/>
           <w:lang w:val="en-US" w:bidi="fa-IR"/>
         </w:rPr>
-        <w:t>.</w:t>
+        <w:t xml:space="preserve"> </w:t>
+      </w:r>
+      <w:r>
+        <w:rPr>
+          <w:rFonts w:ascii="Vazirmatn" w:hAnsi="Vazirmatn" w:cs="Vazirmatn"/>
+          <w:sz w:val="22"/>
+          <w:szCs w:val="22"/>
+          <w:color w:val="2D2D2D"/>
+          <w:lang w:val="en-US" w:bidi="fa-IR"/>
+        </w:rPr>
+        <w:t>minutes.</w:t>
       </w:r>
     </w:p>
     <w:sectPr>
@@ -8904,8 +11664,15 @@
     <w:name w:val="Normal"/>
     <w:qFormat/>
     <w:rsid w:val="00FC693F"/>
+    <w:pPr>
+      <w:bidi/>
+      <w:jc w:val="both"/>
+    </w:pPr>
     <w:rPr>
       <w:rFonts w:ascii="Vazirmatn" w:hAnsi="Vazirmatn" w:cs="Vazirmatn"/>
+      <w:sz w:val="22"/>
+      <w:szCs w:val="22"/>
+      <w:lang w:val="en-US" w:bidi="fa-IR"/>
     </w:rPr>
   </w:style>
   <w:style w:type="paragraph" w:styleId="Header">

</xml_diff>

<commit_message>
fix(review-3): resolve defects R3-01 through R3-07 with strict TDD
</commit_message>
<xml_diff>
--- a/examples/english_technical_doc.docx
+++ b/examples/english_technical_doc.docx
@@ -97,7 +97,7 @@
       </w:pPr>
       <w:r>
         <w:rPr>
-          <w:rFonts w:ascii="Vazirmatn" w:hAnsi="Vazirmatn" w:cs="Vazirmatn"/>
+          <w:rFonts w:ascii="Segoe UI" w:hAnsi="Segoe UI" w:cs="Vazirmatn"/>
           <w:sz w:val="22"/>
           <w:szCs w:val="22"/>
           <w:color w:val="2D2D2D"/>
@@ -117,7 +117,7 @@
       </w:r>
       <w:r>
         <w:rPr>
-          <w:rFonts w:ascii="Vazirmatn" w:hAnsi="Vazirmatn" w:cs="Vazirmatn"/>
+          <w:rFonts w:ascii="Segoe UI" w:hAnsi="Segoe UI" w:cs="Vazirmatn"/>
           <w:sz w:val="22"/>
           <w:szCs w:val="22"/>
           <w:color w:val="2D2D2D"/>
@@ -137,7 +137,7 @@
       </w:r>
       <w:r>
         <w:rPr>
-          <w:rFonts w:ascii="Vazirmatn" w:hAnsi="Vazirmatn" w:cs="Vazirmatn"/>
+          <w:rFonts w:ascii="Segoe UI" w:hAnsi="Segoe UI" w:cs="Vazirmatn"/>
           <w:sz w:val="22"/>
           <w:szCs w:val="22"/>
           <w:color w:val="2D2D2D"/>
@@ -157,7 +157,7 @@
       </w:r>
       <w:r>
         <w:rPr>
-          <w:rFonts w:ascii="Vazirmatn" w:hAnsi="Vazirmatn" w:cs="Vazirmatn"/>
+          <w:rFonts w:ascii="Segoe UI" w:hAnsi="Segoe UI" w:cs="Vazirmatn"/>
           <w:sz w:val="22"/>
           <w:szCs w:val="22"/>
           <w:color w:val="2D2D2D"/>
@@ -177,7 +177,7 @@
       </w:r>
       <w:r>
         <w:rPr>
-          <w:rFonts w:ascii="Vazirmatn" w:hAnsi="Vazirmatn" w:cs="Vazirmatn"/>
+          <w:rFonts w:ascii="Segoe UI" w:hAnsi="Segoe UI" w:cs="Vazirmatn"/>
           <w:sz w:val="22"/>
           <w:szCs w:val="22"/>
           <w:color w:val="2D2D2D"/>
@@ -197,7 +197,7 @@
       </w:r>
       <w:r>
         <w:rPr>
-          <w:rFonts w:ascii="Vazirmatn" w:hAnsi="Vazirmatn" w:cs="Vazirmatn"/>
+          <w:rFonts w:ascii="Segoe UI" w:hAnsi="Segoe UI" w:cs="Vazirmatn"/>
           <w:sz w:val="22"/>
           <w:szCs w:val="22"/>
           <w:color w:val="2D2D2D"/>
@@ -217,7 +217,7 @@
       </w:r>
       <w:r>
         <w:rPr>
-          <w:rFonts w:ascii="Vazirmatn" w:hAnsi="Vazirmatn" w:cs="Vazirmatn"/>
+          <w:rFonts w:ascii="Segoe UI" w:hAnsi="Segoe UI" w:cs="Vazirmatn"/>
           <w:sz w:val="22"/>
           <w:szCs w:val="22"/>
           <w:color w:val="2D2D2D"/>
@@ -237,7 +237,7 @@
       </w:r>
       <w:r>
         <w:rPr>
-          <w:rFonts w:ascii="Vazirmatn" w:hAnsi="Vazirmatn" w:cs="Vazirmatn"/>
+          <w:rFonts w:ascii="Segoe UI" w:hAnsi="Segoe UI" w:cs="Vazirmatn"/>
           <w:sz w:val="22"/>
           <w:szCs w:val="22"/>
           <w:color w:val="2D2D2D"/>
@@ -257,7 +257,7 @@
       </w:r>
       <w:r>
         <w:rPr>
-          <w:rFonts w:ascii="Vazirmatn" w:hAnsi="Vazirmatn" w:cs="Vazirmatn"/>
+          <w:rFonts w:ascii="Segoe UI" w:hAnsi="Segoe UI" w:cs="Vazirmatn"/>
           <w:sz w:val="22"/>
           <w:szCs w:val="22"/>
           <w:color w:val="2D2D2D"/>
@@ -277,7 +277,7 @@
       </w:r>
       <w:r>
         <w:rPr>
-          <w:rFonts w:ascii="Vazirmatn" w:hAnsi="Vazirmatn" w:cs="Vazirmatn"/>
+          <w:rFonts w:ascii="Segoe UI" w:hAnsi="Segoe UI" w:cs="Vazirmatn"/>
           <w:sz w:val="22"/>
           <w:szCs w:val="22"/>
           <w:color w:val="2D2D2D"/>
@@ -297,7 +297,7 @@
       </w:r>
       <w:r>
         <w:rPr>
-          <w:rFonts w:ascii="Vazirmatn" w:hAnsi="Vazirmatn" w:cs="Vazirmatn"/>
+          <w:rFonts w:ascii="Segoe UI" w:hAnsi="Segoe UI" w:cs="Vazirmatn"/>
           <w:sz w:val="22"/>
           <w:szCs w:val="22"/>
           <w:color w:val="2D2D2D"/>
@@ -317,7 +317,7 @@
       </w:r>
       <w:r>
         <w:rPr>
-          <w:rFonts w:ascii="Vazirmatn" w:hAnsi="Vazirmatn" w:cs="Vazirmatn"/>
+          <w:rFonts w:ascii="Segoe UI" w:hAnsi="Segoe UI" w:cs="Vazirmatn"/>
           <w:sz w:val="22"/>
           <w:szCs w:val="22"/>
           <w:color w:val="2D2D2D"/>
@@ -337,7 +337,7 @@
       </w:r>
       <w:r>
         <w:rPr>
-          <w:rFonts w:ascii="Vazirmatn" w:hAnsi="Vazirmatn" w:cs="Vazirmatn"/>
+          <w:rFonts w:ascii="Segoe UI" w:hAnsi="Segoe UI" w:cs="Vazirmatn"/>
           <w:sz w:val="22"/>
           <w:szCs w:val="22"/>
           <w:color w:val="2D2D2D"/>
@@ -357,7 +357,7 @@
       </w:r>
       <w:r>
         <w:rPr>
-          <w:rFonts w:ascii="Vazirmatn" w:hAnsi="Vazirmatn" w:cs="Vazirmatn"/>
+          <w:rFonts w:ascii="Segoe UI" w:hAnsi="Segoe UI" w:cs="Vazirmatn"/>
           <w:sz w:val="22"/>
           <w:szCs w:val="22"/>
           <w:color w:val="2D2D2D"/>
@@ -377,7 +377,7 @@
       </w:r>
       <w:r>
         <w:rPr>
-          <w:rFonts w:ascii="Vazirmatn" w:hAnsi="Vazirmatn" w:cs="Vazirmatn"/>
+          <w:rFonts w:ascii="Segoe UI" w:hAnsi="Segoe UI" w:cs="Vazirmatn"/>
           <w:sz w:val="22"/>
           <w:szCs w:val="22"/>
           <w:color w:val="2D2D2D"/>
@@ -397,7 +397,7 @@
       </w:r>
       <w:r>
         <w:rPr>
-          <w:rFonts w:ascii="Vazirmatn" w:hAnsi="Vazirmatn" w:cs="Vazirmatn"/>
+          <w:rFonts w:ascii="Segoe UI" w:hAnsi="Segoe UI" w:cs="Vazirmatn"/>
           <w:sz w:val="22"/>
           <w:szCs w:val="22"/>
           <w:color w:val="2D2D2D"/>
@@ -417,7 +417,7 @@
       </w:r>
       <w:r>
         <w:rPr>
-          <w:rFonts w:ascii="Vazirmatn" w:hAnsi="Vazirmatn" w:cs="Vazirmatn"/>
+          <w:rFonts w:ascii="Segoe UI" w:hAnsi="Segoe UI" w:cs="Vazirmatn"/>
           <w:sz w:val="22"/>
           <w:szCs w:val="22"/>
           <w:color w:val="2D2D2D"/>
@@ -437,7 +437,7 @@
       </w:r>
       <w:r>
         <w:rPr>
-          <w:rFonts w:ascii="Vazirmatn" w:hAnsi="Vazirmatn" w:cs="Vazirmatn"/>
+          <w:rFonts w:ascii="Segoe UI" w:hAnsi="Segoe UI" w:cs="Vazirmatn"/>
           <w:sz w:val="22"/>
           <w:szCs w:val="22"/>
           <w:color w:val="2D2D2D"/>
@@ -457,7 +457,7 @@
       </w:r>
       <w:r>
         <w:rPr>
-          <w:rFonts w:ascii="Vazirmatn" w:hAnsi="Vazirmatn" w:cs="Vazirmatn"/>
+          <w:rFonts w:ascii="Segoe UI" w:hAnsi="Segoe UI" w:cs="Vazirmatn"/>
           <w:sz w:val="22"/>
           <w:szCs w:val="22"/>
           <w:color w:val="2D2D2D"/>
@@ -477,7 +477,7 @@
       </w:r>
       <w:r>
         <w:rPr>
-          <w:rFonts w:ascii="Vazirmatn" w:hAnsi="Vazirmatn" w:cs="Vazirmatn"/>
+          <w:rFonts w:ascii="Segoe UI" w:hAnsi="Segoe UI" w:cs="Vazirmatn"/>
           <w:sz w:val="22"/>
           <w:szCs w:val="22"/>
           <w:color w:val="2D2D2D"/>
@@ -581,7 +581,7 @@
       </w:pPr>
       <w:r>
         <w:rPr>
-          <w:rFonts w:ascii="Vazirmatn" w:hAnsi="Vazirmatn" w:cs="Vazirmatn"/>
+          <w:rFonts w:ascii="Segoe UI" w:hAnsi="Segoe UI" w:cs="Vazirmatn"/>
           <w:sz w:val="22"/>
           <w:szCs w:val="22"/>
           <w:color w:val="2D2D2D"/>
@@ -601,7 +601,7 @@
       </w:r>
       <w:r>
         <w:rPr>
-          <w:rFonts w:ascii="Vazirmatn" w:hAnsi="Vazirmatn" w:cs="Vazirmatn"/>
+          <w:rFonts w:ascii="Segoe UI" w:hAnsi="Segoe UI" w:cs="Vazirmatn"/>
           <w:sz w:val="22"/>
           <w:szCs w:val="22"/>
           <w:color w:val="2D2D2D"/>
@@ -621,7 +621,7 @@
       </w:r>
       <w:r>
         <w:rPr>
-          <w:rFonts w:ascii="Vazirmatn" w:hAnsi="Vazirmatn" w:cs="Vazirmatn"/>
+          <w:rFonts w:ascii="Segoe UI" w:hAnsi="Segoe UI" w:cs="Vazirmatn"/>
           <w:sz w:val="22"/>
           <w:szCs w:val="22"/>
           <w:color w:val="2D2D2D"/>
@@ -641,7 +641,7 @@
       </w:r>
       <w:r>
         <w:rPr>
-          <w:rFonts w:ascii="Vazirmatn" w:hAnsi="Vazirmatn" w:cs="Vazirmatn"/>
+          <w:rFonts w:ascii="Segoe UI" w:hAnsi="Segoe UI" w:cs="Vazirmatn"/>
           <w:sz w:val="22"/>
           <w:szCs w:val="22"/>
           <w:color w:val="2D2D2D"/>
@@ -661,7 +661,7 @@
       </w:r>
       <w:r>
         <w:rPr>
-          <w:rFonts w:ascii="Vazirmatn" w:hAnsi="Vazirmatn" w:cs="Vazirmatn"/>
+          <w:rFonts w:ascii="Segoe UI" w:hAnsi="Segoe UI" w:cs="Vazirmatn"/>
           <w:sz w:val="22"/>
           <w:szCs w:val="22"/>
           <w:color w:val="2D2D2D"/>
@@ -681,7 +681,7 @@
       </w:r>
       <w:r>
         <w:rPr>
-          <w:rFonts w:ascii="Vazirmatn" w:hAnsi="Vazirmatn" w:cs="Vazirmatn"/>
+          <w:rFonts w:ascii="Segoe UI" w:hAnsi="Segoe UI" w:cs="Vazirmatn"/>
           <w:sz w:val="22"/>
           <w:szCs w:val="22"/>
           <w:color w:val="2D2D2D"/>
@@ -701,7 +701,7 @@
       </w:r>
       <w:r>
         <w:rPr>
-          <w:rFonts w:ascii="Vazirmatn" w:hAnsi="Vazirmatn" w:cs="Vazirmatn"/>
+          <w:rFonts w:ascii="Segoe UI" w:hAnsi="Segoe UI" w:cs="Vazirmatn"/>
           <w:sz w:val="22"/>
           <w:szCs w:val="22"/>
           <w:color w:val="2D2D2D"/>
@@ -721,7 +721,7 @@
       </w:r>
       <w:r>
         <w:rPr>
-          <w:rFonts w:ascii="Vazirmatn" w:hAnsi="Vazirmatn" w:cs="Vazirmatn"/>
+          <w:rFonts w:ascii="Segoe UI" w:hAnsi="Segoe UI" w:cs="Vazirmatn"/>
           <w:sz w:val="22"/>
           <w:szCs w:val="22"/>
           <w:color w:val="2D2D2D"/>
@@ -741,7 +741,7 @@
       </w:r>
       <w:r>
         <w:rPr>
-          <w:rFonts w:ascii="Vazirmatn" w:hAnsi="Vazirmatn" w:cs="Vazirmatn"/>
+          <w:rFonts w:ascii="Segoe UI" w:hAnsi="Segoe UI" w:cs="Vazirmatn"/>
           <w:sz w:val="22"/>
           <w:szCs w:val="22"/>
           <w:color w:val="2D2D2D"/>
@@ -761,7 +761,7 @@
       </w:r>
       <w:r>
         <w:rPr>
-          <w:rFonts w:ascii="Vazirmatn" w:hAnsi="Vazirmatn" w:cs="Vazirmatn"/>
+          <w:rFonts w:ascii="Segoe UI" w:hAnsi="Segoe UI" w:cs="Vazirmatn"/>
           <w:sz w:val="22"/>
           <w:szCs w:val="22"/>
           <w:color w:val="2D2D2D"/>
@@ -781,7 +781,7 @@
       </w:r>
       <w:r>
         <w:rPr>
-          <w:rFonts w:ascii="Vazirmatn" w:hAnsi="Vazirmatn" w:cs="Vazirmatn"/>
+          <w:rFonts w:ascii="Segoe UI" w:hAnsi="Segoe UI" w:cs="Vazirmatn"/>
           <w:sz w:val="22"/>
           <w:szCs w:val="22"/>
           <w:color w:val="2D2D2D"/>
@@ -801,7 +801,7 @@
       </w:r>
       <w:r>
         <w:rPr>
-          <w:rFonts w:ascii="Vazirmatn" w:hAnsi="Vazirmatn" w:cs="Vazirmatn"/>
+          <w:rFonts w:ascii="Segoe UI" w:hAnsi="Segoe UI" w:cs="Vazirmatn"/>
           <w:sz w:val="22"/>
           <w:szCs w:val="22"/>
           <w:color w:val="2D2D2D"/>
@@ -821,7 +821,7 @@
       </w:r>
       <w:r>
         <w:rPr>
-          <w:rFonts w:ascii="Vazirmatn" w:hAnsi="Vazirmatn" w:cs="Vazirmatn"/>
+          <w:rFonts w:ascii="Segoe UI" w:hAnsi="Segoe UI" w:cs="Vazirmatn"/>
           <w:sz w:val="22"/>
           <w:szCs w:val="22"/>
           <w:color w:val="2D2D2D"/>
@@ -841,7 +841,7 @@
       </w:r>
       <w:r>
         <w:rPr>
-          <w:rFonts w:ascii="Vazirmatn" w:hAnsi="Vazirmatn" w:cs="Vazirmatn"/>
+          <w:rFonts w:ascii="Segoe UI" w:hAnsi="Segoe UI" w:cs="Vazirmatn"/>
           <w:sz w:val="22"/>
           <w:szCs w:val="22"/>
           <w:color w:val="2D2D2D"/>
@@ -861,7 +861,7 @@
       </w:r>
       <w:r>
         <w:rPr>
-          <w:rFonts w:ascii="Vazirmatn" w:hAnsi="Vazirmatn" w:cs="Vazirmatn"/>
+          <w:rFonts w:ascii="Segoe UI" w:hAnsi="Segoe UI" w:cs="Vazirmatn"/>
           <w:sz w:val="22"/>
           <w:szCs w:val="22"/>
           <w:color w:val="2D2D2D"/>
@@ -881,7 +881,7 @@
       </w:r>
       <w:r>
         <w:rPr>
-          <w:rFonts w:ascii="Vazirmatn" w:hAnsi="Vazirmatn" w:cs="Vazirmatn"/>
+          <w:rFonts w:ascii="Segoe UI" w:hAnsi="Segoe UI" w:cs="Vazirmatn"/>
           <w:sz w:val="22"/>
           <w:szCs w:val="22"/>
           <w:color w:val="2D2D2D"/>
@@ -901,7 +901,7 @@
       </w:r>
       <w:r>
         <w:rPr>
-          <w:rFonts w:ascii="Vazirmatn" w:hAnsi="Vazirmatn" w:cs="Vazirmatn"/>
+          <w:rFonts w:ascii="Segoe UI" w:hAnsi="Segoe UI" w:cs="Vazirmatn"/>
           <w:sz w:val="22"/>
           <w:szCs w:val="22"/>
           <w:color w:val="2D2D2D"/>
@@ -921,7 +921,7 @@
       </w:r>
       <w:r>
         <w:rPr>
-          <w:rFonts w:ascii="Vazirmatn" w:hAnsi="Vazirmatn" w:cs="Vazirmatn"/>
+          <w:rFonts w:ascii="Segoe UI" w:hAnsi="Segoe UI" w:cs="Vazirmatn"/>
           <w:sz w:val="22"/>
           <w:szCs w:val="22"/>
           <w:color w:val="2D2D2D"/>
@@ -941,7 +941,7 @@
       </w:r>
       <w:r>
         <w:rPr>
-          <w:rFonts w:ascii="Vazirmatn" w:hAnsi="Vazirmatn" w:cs="Vazirmatn"/>
+          <w:rFonts w:ascii="Segoe UI" w:hAnsi="Segoe UI" w:cs="Vazirmatn"/>
           <w:sz w:val="22"/>
           <w:szCs w:val="22"/>
           <w:color w:val="2D2D2D"/>
@@ -961,7 +961,7 @@
       </w:r>
       <w:r>
         <w:rPr>
-          <w:rFonts w:ascii="Vazirmatn" w:hAnsi="Vazirmatn" w:cs="Vazirmatn"/>
+          <w:rFonts w:ascii="Segoe UI" w:hAnsi="Segoe UI" w:cs="Vazirmatn"/>
           <w:sz w:val="22"/>
           <w:szCs w:val="22"/>
           <w:color w:val="2D2D2D"/>
@@ -981,7 +981,7 @@
       </w:r>
       <w:r>
         <w:rPr>
-          <w:rFonts w:ascii="Vazirmatn" w:hAnsi="Vazirmatn" w:cs="Vazirmatn"/>
+          <w:rFonts w:ascii="Segoe UI" w:hAnsi="Segoe UI" w:cs="Vazirmatn"/>
           <w:sz w:val="22"/>
           <w:szCs w:val="22"/>
           <w:color w:val="2D2D2D"/>
@@ -1073,13 +1073,33 @@
             </w:pPr>
             <w:r>
               <w:rPr>
+                <w:rFonts w:ascii="Segoe UI" w:hAnsi="Segoe UI" w:cs="Vazirmatn"/>
+                <w:sz w:val="21"/>
+                <w:szCs w:val="21"/>
+                <w:color w:val="2D2D2D"/>
+                <w:lang w:val="en-US" w:bidi="fa-IR"/>
+              </w:rPr>
+              <w:t>Read</w:t>
+            </w:r>
+            <w:r>
+              <w:rPr>
                 <w:rFonts w:ascii="Vazirmatn" w:hAnsi="Vazirmatn" w:cs="Vazirmatn"/>
                 <w:sz w:val="21"/>
                 <w:szCs w:val="21"/>
                 <w:color w:val="2D2D2D"/>
                 <w:lang w:val="en-US" w:bidi="fa-IR"/>
               </w:rPr>
-              <w:t>Read</w:t>
+              <w:t xml:space="preserve"> </w:t>
+            </w:r>
+            <w:r>
+              <w:rPr>
+                <w:rFonts w:ascii="Segoe UI" w:hAnsi="Segoe UI" w:cs="Vazirmatn"/>
+                <w:sz w:val="21"/>
+                <w:szCs w:val="21"/>
+                <w:color w:val="2D2D2D"/>
+                <w:lang w:val="en-US" w:bidi="fa-IR"/>
+              </w:rPr>
+              <w:t>replicas</w:t>
             </w:r>
             <w:r>
               <w:rPr>
@@ -1093,13 +1113,33 @@
             </w:r>
             <w:r>
               <w:rPr>
+                <w:rFonts w:ascii="Segoe UI" w:hAnsi="Segoe UI" w:cs="Vazirmatn"/>
+                <w:sz w:val="21"/>
+                <w:szCs w:val="21"/>
+                <w:color w:val="2D2D2D"/>
+                <w:lang w:val="en-US" w:bidi="fa-IR"/>
+              </w:rPr>
+              <w:t>can</w:t>
+            </w:r>
+            <w:r>
+              <w:rPr>
                 <w:rFonts w:ascii="Vazirmatn" w:hAnsi="Vazirmatn" w:cs="Vazirmatn"/>
                 <w:sz w:val="21"/>
                 <w:szCs w:val="21"/>
                 <w:color w:val="2D2D2D"/>
                 <w:lang w:val="en-US" w:bidi="fa-IR"/>
               </w:rPr>
-              <w:t>replicas</w:t>
+              <w:t xml:space="preserve"> </w:t>
+            </w:r>
+            <w:r>
+              <w:rPr>
+                <w:rFonts w:ascii="Segoe UI" w:hAnsi="Segoe UI" w:cs="Vazirmatn"/>
+                <w:sz w:val="21"/>
+                <w:szCs w:val="21"/>
+                <w:color w:val="2D2D2D"/>
+                <w:lang w:val="en-US" w:bidi="fa-IR"/>
+              </w:rPr>
+              <w:t>experience</w:t>
             </w:r>
             <w:r>
               <w:rPr>
@@ -1113,13 +1153,33 @@
             </w:r>
             <w:r>
               <w:rPr>
+                <w:rFonts w:ascii="Segoe UI" w:hAnsi="Segoe UI" w:cs="Vazirmatn"/>
+                <w:sz w:val="21"/>
+                <w:szCs w:val="21"/>
+                <w:color w:val="2D2D2D"/>
+                <w:lang w:val="en-US" w:bidi="fa-IR"/>
+              </w:rPr>
+              <w:t>brief</w:t>
+            </w:r>
+            <w:r>
+              <w:rPr>
                 <w:rFonts w:ascii="Vazirmatn" w:hAnsi="Vazirmatn" w:cs="Vazirmatn"/>
                 <w:sz w:val="21"/>
                 <w:szCs w:val="21"/>
                 <w:color w:val="2D2D2D"/>
                 <w:lang w:val="en-US" w:bidi="fa-IR"/>
               </w:rPr>
-              <w:t>can</w:t>
+              <w:t xml:space="preserve"> </w:t>
+            </w:r>
+            <w:r>
+              <w:rPr>
+                <w:rFonts w:ascii="Segoe UI" w:hAnsi="Segoe UI" w:cs="Vazirmatn"/>
+                <w:sz w:val="21"/>
+                <w:szCs w:val="21"/>
+                <w:color w:val="2D2D2D"/>
+                <w:lang w:val="en-US" w:bidi="fa-IR"/>
+              </w:rPr>
+              <w:t>replication</w:t>
             </w:r>
             <w:r>
               <w:rPr>
@@ -1133,13 +1193,33 @@
             </w:r>
             <w:r>
               <w:rPr>
+                <w:rFonts w:ascii="Segoe UI" w:hAnsi="Segoe UI" w:cs="Vazirmatn"/>
+                <w:sz w:val="21"/>
+                <w:szCs w:val="21"/>
+                <w:color w:val="2D2D2D"/>
+                <w:lang w:val="en-US" w:bidi="fa-IR"/>
+              </w:rPr>
+              <w:t>lag</w:t>
+            </w:r>
+            <w:r>
+              <w:rPr>
                 <w:rFonts w:ascii="Vazirmatn" w:hAnsi="Vazirmatn" w:cs="Vazirmatn"/>
                 <w:sz w:val="21"/>
                 <w:szCs w:val="21"/>
                 <w:color w:val="2D2D2D"/>
                 <w:lang w:val="en-US" w:bidi="fa-IR"/>
               </w:rPr>
-              <w:t>experience</w:t>
+              <w:t xml:space="preserve"> </w:t>
+            </w:r>
+            <w:r>
+              <w:rPr>
+                <w:rFonts w:ascii="Segoe UI" w:hAnsi="Segoe UI" w:cs="Vazirmatn"/>
+                <w:sz w:val="21"/>
+                <w:szCs w:val="21"/>
+                <w:color w:val="2D2D2D"/>
+                <w:lang w:val="en-US" w:bidi="fa-IR"/>
+              </w:rPr>
+              <w:t>during</w:t>
             </w:r>
             <w:r>
               <w:rPr>
@@ -1153,13 +1233,33 @@
             </w:r>
             <w:r>
               <w:rPr>
+                <w:rFonts w:ascii="Segoe UI" w:hAnsi="Segoe UI" w:cs="Vazirmatn"/>
+                <w:sz w:val="21"/>
+                <w:szCs w:val="21"/>
+                <w:color w:val="2D2D2D"/>
+                <w:lang w:val="en-US" w:bidi="fa-IR"/>
+              </w:rPr>
+              <w:t>heavy</w:t>
+            </w:r>
+            <w:r>
+              <w:rPr>
                 <w:rFonts w:ascii="Vazirmatn" w:hAnsi="Vazirmatn" w:cs="Vazirmatn"/>
                 <w:sz w:val="21"/>
                 <w:szCs w:val="21"/>
                 <w:color w:val="2D2D2D"/>
                 <w:lang w:val="en-US" w:bidi="fa-IR"/>
               </w:rPr>
-              <w:t>brief</w:t>
+              <w:t xml:space="preserve"> </w:t>
+            </w:r>
+            <w:r>
+              <w:rPr>
+                <w:rFonts w:ascii="Segoe UI" w:hAnsi="Segoe UI" w:cs="Vazirmatn"/>
+                <w:sz w:val="21"/>
+                <w:szCs w:val="21"/>
+                <w:color w:val="2D2D2D"/>
+                <w:lang w:val="en-US" w:bidi="fa-IR"/>
+              </w:rPr>
+              <w:t>write</w:t>
             </w:r>
             <w:r>
               <w:rPr>
@@ -1173,13 +1273,33 @@
             </w:r>
             <w:r>
               <w:rPr>
+                <w:rFonts w:ascii="Segoe UI" w:hAnsi="Segoe UI" w:cs="Vazirmatn"/>
+                <w:sz w:val="21"/>
+                <w:szCs w:val="21"/>
+                <w:color w:val="2D2D2D"/>
+                <w:lang w:val="en-US" w:bidi="fa-IR"/>
+              </w:rPr>
+              <w:t>spikes.</w:t>
+            </w:r>
+            <w:r>
+              <w:rPr>
                 <w:rFonts w:ascii="Vazirmatn" w:hAnsi="Vazirmatn" w:cs="Vazirmatn"/>
                 <w:sz w:val="21"/>
                 <w:szCs w:val="21"/>
                 <w:color w:val="2D2D2D"/>
                 <w:lang w:val="en-US" w:bidi="fa-IR"/>
               </w:rPr>
-              <w:t>replication</w:t>
+              <w:t xml:space="preserve"> </w:t>
+            </w:r>
+            <w:r>
+              <w:rPr>
+                <w:rFonts w:ascii="Segoe UI" w:hAnsi="Segoe UI" w:cs="Vazirmatn"/>
+                <w:sz w:val="21"/>
+                <w:szCs w:val="21"/>
+                <w:color w:val="2D2D2D"/>
+                <w:lang w:val="en-US" w:bidi="fa-IR"/>
+              </w:rPr>
+              <w:t>For</w:t>
             </w:r>
             <w:r>
               <w:rPr>
@@ -1193,13 +1313,33 @@
             </w:r>
             <w:r>
               <w:rPr>
+                <w:rFonts w:ascii="Segoe UI" w:hAnsi="Segoe UI" w:cs="Vazirmatn"/>
+                <w:sz w:val="21"/>
+                <w:szCs w:val="21"/>
+                <w:color w:val="2D2D2D"/>
+                <w:lang w:val="en-US" w:bidi="fa-IR"/>
+              </w:rPr>
+              <w:t>strictly</w:t>
+            </w:r>
+            <w:r>
+              <w:rPr>
                 <w:rFonts w:ascii="Vazirmatn" w:hAnsi="Vazirmatn" w:cs="Vazirmatn"/>
                 <w:sz w:val="21"/>
                 <w:szCs w:val="21"/>
                 <w:color w:val="2D2D2D"/>
                 <w:lang w:val="en-US" w:bidi="fa-IR"/>
               </w:rPr>
-              <w:t>lag</w:t>
+              <w:t xml:space="preserve"> </w:t>
+            </w:r>
+            <w:r>
+              <w:rPr>
+                <w:rFonts w:ascii="Segoe UI" w:hAnsi="Segoe UI" w:cs="Vazirmatn"/>
+                <w:sz w:val="21"/>
+                <w:szCs w:val="21"/>
+                <w:color w:val="2D2D2D"/>
+                <w:lang w:val="en-US" w:bidi="fa-IR"/>
+              </w:rPr>
+              <w:t>consistent</w:t>
             </w:r>
             <w:r>
               <w:rPr>
@@ -1213,13 +1353,33 @@
             </w:r>
             <w:r>
               <w:rPr>
+                <w:rFonts w:ascii="Segoe UI" w:hAnsi="Segoe UI" w:cs="Vazirmatn"/>
+                <w:sz w:val="21"/>
+                <w:szCs w:val="21"/>
+                <w:color w:val="2D2D2D"/>
+                <w:lang w:val="en-US" w:bidi="fa-IR"/>
+              </w:rPr>
+              <w:t>read</w:t>
+            </w:r>
+            <w:r>
+              <w:rPr>
                 <w:rFonts w:ascii="Vazirmatn" w:hAnsi="Vazirmatn" w:cs="Vazirmatn"/>
                 <w:sz w:val="21"/>
                 <w:szCs w:val="21"/>
                 <w:color w:val="2D2D2D"/>
                 <w:lang w:val="en-US" w:bidi="fa-IR"/>
               </w:rPr>
-              <w:t>during</w:t>
+              <w:t xml:space="preserve"> </w:t>
+            </w:r>
+            <w:r>
+              <w:rPr>
+                <w:rFonts w:ascii="Segoe UI" w:hAnsi="Segoe UI" w:cs="Vazirmatn"/>
+                <w:sz w:val="21"/>
+                <w:szCs w:val="21"/>
+                <w:color w:val="2D2D2D"/>
+                <w:lang w:val="en-US" w:bidi="fa-IR"/>
+              </w:rPr>
+              <w:t>operations</w:t>
             </w:r>
             <w:r>
               <w:rPr>
@@ -1229,7 +1389,7 @@
                 <w:color w:val="2D2D2D"/>
                 <w:lang w:val="en-US" w:bidi="fa-IR"/>
               </w:rPr>
-              <w:t xml:space="preserve"> </w:t>
+              <w:t>,</w:t>
             </w:r>
             <w:r>
               <w:rPr>
@@ -1239,7 +1399,17 @@
                 <w:color w:val="2D2D2D"/>
                 <w:lang w:val="en-US" w:bidi="fa-IR"/>
               </w:rPr>
-              <w:t>heavy</w:t>
+              <w:t xml:space="preserve"> </w:t>
+            </w:r>
+            <w:r>
+              <w:rPr>
+                <w:rFonts w:ascii="Segoe UI" w:hAnsi="Segoe UI" w:cs="Vazirmatn"/>
+                <w:sz w:val="21"/>
+                <w:szCs w:val="21"/>
+                <w:color w:val="2D2D2D"/>
+                <w:lang w:val="en-US" w:bidi="fa-IR"/>
+              </w:rPr>
+              <w:t>route</w:t>
             </w:r>
             <w:r>
               <w:rPr>
@@ -1253,13 +1423,33 @@
             </w:r>
             <w:r>
               <w:rPr>
+                <w:rFonts w:ascii="Segoe UI" w:hAnsi="Segoe UI" w:cs="Vazirmatn"/>
+                <w:sz w:val="21"/>
+                <w:szCs w:val="21"/>
+                <w:color w:val="2D2D2D"/>
+                <w:lang w:val="en-US" w:bidi="fa-IR"/>
+              </w:rPr>
+              <w:t>queries</w:t>
+            </w:r>
+            <w:r>
+              <w:rPr>
                 <w:rFonts w:ascii="Vazirmatn" w:hAnsi="Vazirmatn" w:cs="Vazirmatn"/>
                 <w:sz w:val="21"/>
                 <w:szCs w:val="21"/>
                 <w:color w:val="2D2D2D"/>
                 <w:lang w:val="en-US" w:bidi="fa-IR"/>
               </w:rPr>
-              <w:t>write</w:t>
+              <w:t xml:space="preserve"> </w:t>
+            </w:r>
+            <w:r>
+              <w:rPr>
+                <w:rFonts w:ascii="Segoe UI" w:hAnsi="Segoe UI" w:cs="Vazirmatn"/>
+                <w:sz w:val="21"/>
+                <w:szCs w:val="21"/>
+                <w:color w:val="2D2D2D"/>
+                <w:lang w:val="en-US" w:bidi="fa-IR"/>
+              </w:rPr>
+              <w:t>to</w:t>
             </w:r>
             <w:r>
               <w:rPr>
@@ -1273,13 +1463,33 @@
             </w:r>
             <w:r>
               <w:rPr>
+                <w:rFonts w:ascii="Segoe UI" w:hAnsi="Segoe UI" w:cs="Vazirmatn"/>
+                <w:sz w:val="21"/>
+                <w:szCs w:val="21"/>
+                <w:color w:val="2D2D2D"/>
+                <w:lang w:val="en-US" w:bidi="fa-IR"/>
+              </w:rPr>
+              <w:t>the</w:t>
+            </w:r>
+            <w:r>
+              <w:rPr>
                 <w:rFonts w:ascii="Vazirmatn" w:hAnsi="Vazirmatn" w:cs="Vazirmatn"/>
                 <w:sz w:val="21"/>
                 <w:szCs w:val="21"/>
                 <w:color w:val="2D2D2D"/>
                 <w:lang w:val="en-US" w:bidi="fa-IR"/>
               </w:rPr>
-              <w:t>spikes.</w:t>
+              <w:t xml:space="preserve"> </w:t>
+            </w:r>
+            <w:r>
+              <w:rPr>
+                <w:rFonts w:ascii="Segoe UI" w:hAnsi="Segoe UI" w:cs="Vazirmatn"/>
+                <w:sz w:val="21"/>
+                <w:szCs w:val="21"/>
+                <w:color w:val="2D2D2D"/>
+                <w:lang w:val="en-US" w:bidi="fa-IR"/>
+              </w:rPr>
+              <w:t>primary</w:t>
             </w:r>
             <w:r>
               <w:rPr>
@@ -1293,237 +1503,27 @@
             </w:r>
             <w:r>
               <w:rPr>
+                <w:rFonts w:ascii="Segoe UI" w:hAnsi="Segoe UI" w:cs="Vazirmatn"/>
+                <w:sz w:val="21"/>
+                <w:szCs w:val="21"/>
+                <w:color w:val="2D2D2D"/>
+                <w:lang w:val="en-US" w:bidi="fa-IR"/>
+              </w:rPr>
+              <w:t>database</w:t>
+            </w:r>
+            <w:r>
+              <w:rPr>
                 <w:rFonts w:ascii="Vazirmatn" w:hAnsi="Vazirmatn" w:cs="Vazirmatn"/>
                 <w:sz w:val="21"/>
                 <w:szCs w:val="21"/>
                 <w:color w:val="2D2D2D"/>
                 <w:lang w:val="en-US" w:bidi="fa-IR"/>
               </w:rPr>
-              <w:t>For</w:t>
-            </w:r>
-            <w:r>
-              <w:rPr>
-                <w:rFonts w:ascii="Vazirmatn" w:hAnsi="Vazirmatn" w:cs="Vazirmatn"/>
-                <w:sz w:val="21"/>
-                <w:szCs w:val="21"/>
-                <w:color w:val="2D2D2D"/>
-                <w:lang w:val="en-US" w:bidi="fa-IR"/>
-              </w:rPr>
               <w:t xml:space="preserve"> </w:t>
             </w:r>
             <w:r>
               <w:rPr>
-                <w:rFonts w:ascii="Vazirmatn" w:hAnsi="Vazirmatn" w:cs="Vazirmatn"/>
-                <w:sz w:val="21"/>
-                <w:szCs w:val="21"/>
-                <w:color w:val="2D2D2D"/>
-                <w:lang w:val="en-US" w:bidi="fa-IR"/>
-              </w:rPr>
-              <w:t>strictly</w:t>
-            </w:r>
-            <w:r>
-              <w:rPr>
-                <w:rFonts w:ascii="Vazirmatn" w:hAnsi="Vazirmatn" w:cs="Vazirmatn"/>
-                <w:sz w:val="21"/>
-                <w:szCs w:val="21"/>
-                <w:color w:val="2D2D2D"/>
-                <w:lang w:val="en-US" w:bidi="fa-IR"/>
-              </w:rPr>
-              <w:t xml:space="preserve"> </w:t>
-            </w:r>
-            <w:r>
-              <w:rPr>
-                <w:rFonts w:ascii="Vazirmatn" w:hAnsi="Vazirmatn" w:cs="Vazirmatn"/>
-                <w:sz w:val="21"/>
-                <w:szCs w:val="21"/>
-                <w:color w:val="2D2D2D"/>
-                <w:lang w:val="en-US" w:bidi="fa-IR"/>
-              </w:rPr>
-              <w:t>consistent</w:t>
-            </w:r>
-            <w:r>
-              <w:rPr>
-                <w:rFonts w:ascii="Vazirmatn" w:hAnsi="Vazirmatn" w:cs="Vazirmatn"/>
-                <w:sz w:val="21"/>
-                <w:szCs w:val="21"/>
-                <w:color w:val="2D2D2D"/>
-                <w:lang w:val="en-US" w:bidi="fa-IR"/>
-              </w:rPr>
-              <w:t xml:space="preserve"> </w:t>
-            </w:r>
-            <w:r>
-              <w:rPr>
-                <w:rFonts w:ascii="Vazirmatn" w:hAnsi="Vazirmatn" w:cs="Vazirmatn"/>
-                <w:sz w:val="21"/>
-                <w:szCs w:val="21"/>
-                <w:color w:val="2D2D2D"/>
-                <w:lang w:val="en-US" w:bidi="fa-IR"/>
-              </w:rPr>
-              <w:t>read</w:t>
-            </w:r>
-            <w:r>
-              <w:rPr>
-                <w:rFonts w:ascii="Vazirmatn" w:hAnsi="Vazirmatn" w:cs="Vazirmatn"/>
-                <w:sz w:val="21"/>
-                <w:szCs w:val="21"/>
-                <w:color w:val="2D2D2D"/>
-                <w:lang w:val="en-US" w:bidi="fa-IR"/>
-              </w:rPr>
-              <w:t xml:space="preserve"> </w:t>
-            </w:r>
-            <w:r>
-              <w:rPr>
-                <w:rFonts w:ascii="Vazirmatn" w:hAnsi="Vazirmatn" w:cs="Vazirmatn"/>
-                <w:sz w:val="21"/>
-                <w:szCs w:val="21"/>
-                <w:color w:val="2D2D2D"/>
-                <w:lang w:val="en-US" w:bidi="fa-IR"/>
-              </w:rPr>
-              <w:t>operations</w:t>
-            </w:r>
-            <w:r>
-              <w:rPr>
-                <w:rFonts w:ascii="Vazirmatn" w:hAnsi="Vazirmatn" w:cs="Vazirmatn"/>
-                <w:sz w:val="21"/>
-                <w:szCs w:val="21"/>
-                <w:color w:val="2D2D2D"/>
-                <w:lang w:val="en-US" w:bidi="fa-IR"/>
-              </w:rPr>
-              <w:t>,</w:t>
-            </w:r>
-            <w:r>
-              <w:rPr>
-                <w:rFonts w:ascii="Vazirmatn" w:hAnsi="Vazirmatn" w:cs="Vazirmatn"/>
-                <w:sz w:val="21"/>
-                <w:szCs w:val="21"/>
-                <w:color w:val="2D2D2D"/>
-                <w:lang w:val="en-US" w:bidi="fa-IR"/>
-              </w:rPr>
-              <w:t xml:space="preserve"> </w:t>
-            </w:r>
-            <w:r>
-              <w:rPr>
-                <w:rFonts w:ascii="Vazirmatn" w:hAnsi="Vazirmatn" w:cs="Vazirmatn"/>
-                <w:sz w:val="21"/>
-                <w:szCs w:val="21"/>
-                <w:color w:val="2D2D2D"/>
-                <w:lang w:val="en-US" w:bidi="fa-IR"/>
-              </w:rPr>
-              <w:t>route</w:t>
-            </w:r>
-            <w:r>
-              <w:rPr>
-                <w:rFonts w:ascii="Vazirmatn" w:hAnsi="Vazirmatn" w:cs="Vazirmatn"/>
-                <w:sz w:val="21"/>
-                <w:szCs w:val="21"/>
-                <w:color w:val="2D2D2D"/>
-                <w:lang w:val="en-US" w:bidi="fa-IR"/>
-              </w:rPr>
-              <w:t xml:space="preserve"> </w:t>
-            </w:r>
-            <w:r>
-              <w:rPr>
-                <w:rFonts w:ascii="Vazirmatn" w:hAnsi="Vazirmatn" w:cs="Vazirmatn"/>
-                <w:sz w:val="21"/>
-                <w:szCs w:val="21"/>
-                <w:color w:val="2D2D2D"/>
-                <w:lang w:val="en-US" w:bidi="fa-IR"/>
-              </w:rPr>
-              <w:t>queries</w:t>
-            </w:r>
-            <w:r>
-              <w:rPr>
-                <w:rFonts w:ascii="Vazirmatn" w:hAnsi="Vazirmatn" w:cs="Vazirmatn"/>
-                <w:sz w:val="21"/>
-                <w:szCs w:val="21"/>
-                <w:color w:val="2D2D2D"/>
-                <w:lang w:val="en-US" w:bidi="fa-IR"/>
-              </w:rPr>
-              <w:t xml:space="preserve"> </w:t>
-            </w:r>
-            <w:r>
-              <w:rPr>
-                <w:rFonts w:ascii="Vazirmatn" w:hAnsi="Vazirmatn" w:cs="Vazirmatn"/>
-                <w:sz w:val="21"/>
-                <w:szCs w:val="21"/>
-                <w:color w:val="2D2D2D"/>
-                <w:lang w:val="en-US" w:bidi="fa-IR"/>
-              </w:rPr>
-              <w:t>to</w:t>
-            </w:r>
-            <w:r>
-              <w:rPr>
-                <w:rFonts w:ascii="Vazirmatn" w:hAnsi="Vazirmatn" w:cs="Vazirmatn"/>
-                <w:sz w:val="21"/>
-                <w:szCs w:val="21"/>
-                <w:color w:val="2D2D2D"/>
-                <w:lang w:val="en-US" w:bidi="fa-IR"/>
-              </w:rPr>
-              <w:t xml:space="preserve"> </w:t>
-            </w:r>
-            <w:r>
-              <w:rPr>
-                <w:rFonts w:ascii="Vazirmatn" w:hAnsi="Vazirmatn" w:cs="Vazirmatn"/>
-                <w:sz w:val="21"/>
-                <w:szCs w:val="21"/>
-                <w:color w:val="2D2D2D"/>
-                <w:lang w:val="en-US" w:bidi="fa-IR"/>
-              </w:rPr>
-              <w:t>the</w:t>
-            </w:r>
-            <w:r>
-              <w:rPr>
-                <w:rFonts w:ascii="Vazirmatn" w:hAnsi="Vazirmatn" w:cs="Vazirmatn"/>
-                <w:sz w:val="21"/>
-                <w:szCs w:val="21"/>
-                <w:color w:val="2D2D2D"/>
-                <w:lang w:val="en-US" w:bidi="fa-IR"/>
-              </w:rPr>
-              <w:t xml:space="preserve"> </w:t>
-            </w:r>
-            <w:r>
-              <w:rPr>
-                <w:rFonts w:ascii="Vazirmatn" w:hAnsi="Vazirmatn" w:cs="Vazirmatn"/>
-                <w:sz w:val="21"/>
-                <w:szCs w:val="21"/>
-                <w:color w:val="2D2D2D"/>
-                <w:lang w:val="en-US" w:bidi="fa-IR"/>
-              </w:rPr>
-              <w:t>primary</w:t>
-            </w:r>
-            <w:r>
-              <w:rPr>
-                <w:rFonts w:ascii="Vazirmatn" w:hAnsi="Vazirmatn" w:cs="Vazirmatn"/>
-                <w:sz w:val="21"/>
-                <w:szCs w:val="21"/>
-                <w:color w:val="2D2D2D"/>
-                <w:lang w:val="en-US" w:bidi="fa-IR"/>
-              </w:rPr>
-              <w:t xml:space="preserve"> </w:t>
-            </w:r>
-            <w:r>
-              <w:rPr>
-                <w:rFonts w:ascii="Vazirmatn" w:hAnsi="Vazirmatn" w:cs="Vazirmatn"/>
-                <w:sz w:val="21"/>
-                <w:szCs w:val="21"/>
-                <w:color w:val="2D2D2D"/>
-                <w:lang w:val="en-US" w:bidi="fa-IR"/>
-              </w:rPr>
-              <w:t>database</w:t>
-            </w:r>
-            <w:r>
-              <w:rPr>
-                <w:rFonts w:ascii="Vazirmatn" w:hAnsi="Vazirmatn" w:cs="Vazirmatn"/>
-                <w:sz w:val="21"/>
-                <w:szCs w:val="21"/>
-                <w:color w:val="2D2D2D"/>
-                <w:lang w:val="en-US" w:bidi="fa-IR"/>
-              </w:rPr>
-              <w:t xml:space="preserve"> </w:t>
-            </w:r>
-            <w:r>
-              <w:rPr>
-                <w:rFonts w:ascii="Vazirmatn" w:hAnsi="Vazirmatn" w:cs="Vazirmatn"/>
+                <w:rFonts w:ascii="Segoe UI" w:hAnsi="Segoe UI" w:cs="Vazirmatn"/>
                 <w:sz w:val="21"/>
                 <w:szCs w:val="21"/>
                 <w:color w:val="2D2D2D"/>
@@ -1612,13 +1612,33 @@
             </w:pPr>
             <w:r>
               <w:rPr>
+                <w:rFonts w:ascii="Segoe UI" w:hAnsi="Segoe UI" w:cs="Vazirmatn"/>
+                <w:sz w:val="21"/>
+                <w:szCs w:val="21"/>
+                <w:color w:val="2D2D2D"/>
+                <w:lang w:val="en-US" w:bidi="fa-IR"/>
+              </w:rPr>
+              <w:t>Ensure</w:t>
+            </w:r>
+            <w:r>
+              <w:rPr>
                 <w:rFonts w:ascii="Vazirmatn" w:hAnsi="Vazirmatn" w:cs="Vazirmatn"/>
                 <w:sz w:val="21"/>
                 <w:szCs w:val="21"/>
                 <w:color w:val="2D2D2D"/>
                 <w:lang w:val="en-US" w:bidi="fa-IR"/>
               </w:rPr>
-              <w:t>Ensure</w:t>
+              <w:t xml:space="preserve"> </w:t>
+            </w:r>
+            <w:r>
+              <w:rPr>
+                <w:rFonts w:ascii="Segoe UI" w:hAnsi="Segoe UI" w:cs="Vazirmatn"/>
+                <w:sz w:val="21"/>
+                <w:szCs w:val="21"/>
+                <w:color w:val="2D2D2D"/>
+                <w:lang w:val="en-US" w:bidi="fa-IR"/>
+              </w:rPr>
+              <w:t>that</w:t>
             </w:r>
             <w:r>
               <w:rPr>
@@ -1632,13 +1652,33 @@
             </w:r>
             <w:r>
               <w:rPr>
+                <w:rFonts w:ascii="Courier New" w:hAnsi="Courier New" w:cs="Courier New"/>
+                <w:sz w:val="21"/>
+                <w:szCs w:val="21"/>
+                <w:color w:val="2D2D2D"/>
+                <w:lang w:val="en-US" w:bidi="fa-IR"/>
+              </w:rPr>
+              <w:t>maxmemory-policy</w:t>
+            </w:r>
+            <w:r>
+              <w:rPr>
                 <w:rFonts w:ascii="Vazirmatn" w:hAnsi="Vazirmatn" w:cs="Vazirmatn"/>
                 <w:sz w:val="21"/>
                 <w:szCs w:val="21"/>
                 <w:color w:val="2D2D2D"/>
                 <w:lang w:val="en-US" w:bidi="fa-IR"/>
               </w:rPr>
-              <w:t>that</w:t>
+              <w:t xml:space="preserve"> </w:t>
+            </w:r>
+            <w:r>
+              <w:rPr>
+                <w:rFonts w:ascii="Segoe UI" w:hAnsi="Segoe UI" w:cs="Vazirmatn"/>
+                <w:sz w:val="21"/>
+                <w:szCs w:val="21"/>
+                <w:color w:val="2D2D2D"/>
+                <w:lang w:val="en-US" w:bidi="fa-IR"/>
+              </w:rPr>
+              <w:t>is</w:t>
             </w:r>
             <w:r>
               <w:rPr>
@@ -1652,13 +1692,53 @@
             </w:r>
             <w:r>
               <w:rPr>
+                <w:rFonts w:ascii="Segoe UI" w:hAnsi="Segoe UI" w:cs="Vazirmatn"/>
+                <w:sz w:val="21"/>
+                <w:szCs w:val="21"/>
+                <w:color w:val="2D2D2D"/>
+                <w:lang w:val="en-US" w:bidi="fa-IR"/>
+              </w:rPr>
+              <w:t>configured</w:t>
+            </w:r>
+            <w:r>
+              <w:rPr>
+                <w:rFonts w:ascii="Vazirmatn" w:hAnsi="Vazirmatn" w:cs="Vazirmatn"/>
+                <w:sz w:val="21"/>
+                <w:szCs w:val="21"/>
+                <w:color w:val="2D2D2D"/>
+                <w:lang w:val="en-US" w:bidi="fa-IR"/>
+              </w:rPr>
+              <w:t xml:space="preserve"> </w:t>
+            </w:r>
+            <w:r>
+              <w:rPr>
+                <w:rFonts w:ascii="Segoe UI" w:hAnsi="Segoe UI" w:cs="Vazirmatn"/>
+                <w:sz w:val="21"/>
+                <w:szCs w:val="21"/>
+                <w:color w:val="2D2D2D"/>
+                <w:lang w:val="en-US" w:bidi="fa-IR"/>
+              </w:rPr>
+              <w:t>to</w:t>
+            </w:r>
+            <w:r>
+              <w:rPr>
+                <w:rFonts w:ascii="Vazirmatn" w:hAnsi="Vazirmatn" w:cs="Vazirmatn"/>
+                <w:sz w:val="21"/>
+                <w:szCs w:val="21"/>
+                <w:color w:val="2D2D2D"/>
+                <w:lang w:val="en-US" w:bidi="fa-IR"/>
+              </w:rPr>
+              <w:t xml:space="preserve"> </w:t>
+            </w:r>
+            <w:r>
+              <w:rPr>
                 <w:rFonts w:ascii="Courier New" w:hAnsi="Courier New" w:cs="Courier New"/>
                 <w:sz w:val="21"/>
                 <w:szCs w:val="21"/>
                 <w:color w:val="2D2D2D"/>
                 <w:lang w:val="en-US" w:bidi="fa-IR"/>
               </w:rPr>
-              <w:t>maxmemory-policy</w:t>
+              <w:t>volatile-lru</w:t>
             </w:r>
             <w:r>
               <w:rPr>
@@ -1672,13 +1752,33 @@
             </w:r>
             <w:r>
               <w:rPr>
+                <w:rFonts w:ascii="Segoe UI" w:hAnsi="Segoe UI" w:cs="Vazirmatn"/>
+                <w:sz w:val="21"/>
+                <w:szCs w:val="21"/>
+                <w:color w:val="2D2D2D"/>
+                <w:lang w:val="en-US" w:bidi="fa-IR"/>
+              </w:rPr>
+              <w:t>in</w:t>
+            </w:r>
+            <w:r>
+              <w:rPr>
                 <w:rFonts w:ascii="Vazirmatn" w:hAnsi="Vazirmatn" w:cs="Vazirmatn"/>
                 <w:sz w:val="21"/>
                 <w:szCs w:val="21"/>
                 <w:color w:val="2D2D2D"/>
                 <w:lang w:val="en-US" w:bidi="fa-IR"/>
               </w:rPr>
-              <w:t>is</w:t>
+              <w:t xml:space="preserve"> </w:t>
+            </w:r>
+            <w:r>
+              <w:rPr>
+                <w:rFonts w:ascii="Segoe UI" w:hAnsi="Segoe UI" w:cs="Vazirmatn"/>
+                <w:sz w:val="21"/>
+                <w:szCs w:val="21"/>
+                <w:color w:val="2D2D2D"/>
+                <w:lang w:val="en-US" w:bidi="fa-IR"/>
+              </w:rPr>
+              <w:t>production</w:t>
             </w:r>
             <w:r>
               <w:rPr>
@@ -1692,13 +1792,33 @@
             </w:r>
             <w:r>
               <w:rPr>
+                <w:rFonts w:ascii="Segoe UI" w:hAnsi="Segoe UI" w:cs="Vazirmatn"/>
+                <w:sz w:val="21"/>
+                <w:szCs w:val="21"/>
+                <w:color w:val="2D2D2D"/>
+                <w:lang w:val="en-US" w:bidi="fa-IR"/>
+              </w:rPr>
+              <w:t>so</w:t>
+            </w:r>
+            <w:r>
+              <w:rPr>
                 <w:rFonts w:ascii="Vazirmatn" w:hAnsi="Vazirmatn" w:cs="Vazirmatn"/>
                 <w:sz w:val="21"/>
                 <w:szCs w:val="21"/>
                 <w:color w:val="2D2D2D"/>
                 <w:lang w:val="en-US" w:bidi="fa-IR"/>
               </w:rPr>
-              <w:t>configured</w:t>
+              <w:t xml:space="preserve"> </w:t>
+            </w:r>
+            <w:r>
+              <w:rPr>
+                <w:rFonts w:ascii="Segoe UI" w:hAnsi="Segoe UI" w:cs="Vazirmatn"/>
+                <w:sz w:val="21"/>
+                <w:szCs w:val="21"/>
+                <w:color w:val="2D2D2D"/>
+                <w:lang w:val="en-US" w:bidi="fa-IR"/>
+              </w:rPr>
+              <w:t>that</w:t>
             </w:r>
             <w:r>
               <w:rPr>
@@ -1712,13 +1832,33 @@
             </w:r>
             <w:r>
               <w:rPr>
+                <w:rFonts w:ascii="Segoe UI" w:hAnsi="Segoe UI" w:cs="Vazirmatn"/>
+                <w:sz w:val="21"/>
+                <w:szCs w:val="21"/>
+                <w:color w:val="2D2D2D"/>
+                <w:lang w:val="en-US" w:bidi="fa-IR"/>
+              </w:rPr>
+              <w:t>persistent</w:t>
+            </w:r>
+            <w:r>
+              <w:rPr>
                 <w:rFonts w:ascii="Vazirmatn" w:hAnsi="Vazirmatn" w:cs="Vazirmatn"/>
                 <w:sz w:val="21"/>
                 <w:szCs w:val="21"/>
                 <w:color w:val="2D2D2D"/>
                 <w:lang w:val="en-US" w:bidi="fa-IR"/>
               </w:rPr>
-              <w:t>to</w:t>
+              <w:t xml:space="preserve"> </w:t>
+            </w:r>
+            <w:r>
+              <w:rPr>
+                <w:rFonts w:ascii="Segoe UI" w:hAnsi="Segoe UI" w:cs="Vazirmatn"/>
+                <w:sz w:val="21"/>
+                <w:szCs w:val="21"/>
+                <w:color w:val="2D2D2D"/>
+                <w:lang w:val="en-US" w:bidi="fa-IR"/>
+              </w:rPr>
+              <w:t>auth</w:t>
             </w:r>
             <w:r>
               <w:rPr>
@@ -1732,13 +1872,13 @@
             </w:r>
             <w:r>
               <w:rPr>
-                <w:rFonts w:ascii="Courier New" w:hAnsi="Courier New" w:cs="Courier New"/>
+                <w:rFonts w:ascii="Segoe UI" w:hAnsi="Segoe UI" w:cs="Vazirmatn"/>
                 <w:sz w:val="21"/>
                 <w:szCs w:val="21"/>
                 <w:color w:val="2D2D2D"/>
                 <w:lang w:val="en-US" w:bidi="fa-IR"/>
               </w:rPr>
-              <w:t>volatile-lru</w:t>
+              <w:t>tokens</w:t>
             </w:r>
             <w:r>
               <w:rPr>
@@ -1752,13 +1892,33 @@
             </w:r>
             <w:r>
               <w:rPr>
+                <w:rFonts w:ascii="Segoe UI" w:hAnsi="Segoe UI" w:cs="Vazirmatn"/>
+                <w:sz w:val="21"/>
+                <w:szCs w:val="21"/>
+                <w:color w:val="2D2D2D"/>
+                <w:lang w:val="en-US" w:bidi="fa-IR"/>
+              </w:rPr>
+              <w:t>are</w:t>
+            </w:r>
+            <w:r>
+              <w:rPr>
                 <w:rFonts w:ascii="Vazirmatn" w:hAnsi="Vazirmatn" w:cs="Vazirmatn"/>
                 <w:sz w:val="21"/>
                 <w:szCs w:val="21"/>
                 <w:color w:val="2D2D2D"/>
                 <w:lang w:val="en-US" w:bidi="fa-IR"/>
               </w:rPr>
-              <w:t>in</w:t>
+              <w:t xml:space="preserve"> </w:t>
+            </w:r>
+            <w:r>
+              <w:rPr>
+                <w:rFonts w:ascii="Segoe UI" w:hAnsi="Segoe UI" w:cs="Vazirmatn"/>
+                <w:sz w:val="21"/>
+                <w:szCs w:val="21"/>
+                <w:color w:val="2D2D2D"/>
+                <w:lang w:val="en-US" w:bidi="fa-IR"/>
+              </w:rPr>
+              <w:t>never</w:t>
             </w:r>
             <w:r>
               <w:rPr>
@@ -1772,187 +1932,27 @@
             </w:r>
             <w:r>
               <w:rPr>
+                <w:rFonts w:ascii="Segoe UI" w:hAnsi="Segoe UI" w:cs="Vazirmatn"/>
+                <w:sz w:val="21"/>
+                <w:szCs w:val="21"/>
+                <w:color w:val="2D2D2D"/>
+                <w:lang w:val="en-US" w:bidi="fa-IR"/>
+              </w:rPr>
+              <w:t>evicted</w:t>
+            </w:r>
+            <w:r>
+              <w:rPr>
                 <w:rFonts w:ascii="Vazirmatn" w:hAnsi="Vazirmatn" w:cs="Vazirmatn"/>
                 <w:sz w:val="21"/>
                 <w:szCs w:val="21"/>
                 <w:color w:val="2D2D2D"/>
                 <w:lang w:val="en-US" w:bidi="fa-IR"/>
               </w:rPr>
-              <w:t>production</w:t>
-            </w:r>
-            <w:r>
-              <w:rPr>
-                <w:rFonts w:ascii="Vazirmatn" w:hAnsi="Vazirmatn" w:cs="Vazirmatn"/>
-                <w:sz w:val="21"/>
-                <w:szCs w:val="21"/>
-                <w:color w:val="2D2D2D"/>
-                <w:lang w:val="en-US" w:bidi="fa-IR"/>
-              </w:rPr>
               <w:t xml:space="preserve"> </w:t>
             </w:r>
             <w:r>
               <w:rPr>
-                <w:rFonts w:ascii="Vazirmatn" w:hAnsi="Vazirmatn" w:cs="Vazirmatn"/>
-                <w:sz w:val="21"/>
-                <w:szCs w:val="21"/>
-                <w:color w:val="2D2D2D"/>
-                <w:lang w:val="en-US" w:bidi="fa-IR"/>
-              </w:rPr>
-              <w:t>so</w:t>
-            </w:r>
-            <w:r>
-              <w:rPr>
-                <w:rFonts w:ascii="Vazirmatn" w:hAnsi="Vazirmatn" w:cs="Vazirmatn"/>
-                <w:sz w:val="21"/>
-                <w:szCs w:val="21"/>
-                <w:color w:val="2D2D2D"/>
-                <w:lang w:val="en-US" w:bidi="fa-IR"/>
-              </w:rPr>
-              <w:t xml:space="preserve"> </w:t>
-            </w:r>
-            <w:r>
-              <w:rPr>
-                <w:rFonts w:ascii="Vazirmatn" w:hAnsi="Vazirmatn" w:cs="Vazirmatn"/>
-                <w:sz w:val="21"/>
-                <w:szCs w:val="21"/>
-                <w:color w:val="2D2D2D"/>
-                <w:lang w:val="en-US" w:bidi="fa-IR"/>
-              </w:rPr>
-              <w:t>that</w:t>
-            </w:r>
-            <w:r>
-              <w:rPr>
-                <w:rFonts w:ascii="Vazirmatn" w:hAnsi="Vazirmatn" w:cs="Vazirmatn"/>
-                <w:sz w:val="21"/>
-                <w:szCs w:val="21"/>
-                <w:color w:val="2D2D2D"/>
-                <w:lang w:val="en-US" w:bidi="fa-IR"/>
-              </w:rPr>
-              <w:t xml:space="preserve"> </w:t>
-            </w:r>
-            <w:r>
-              <w:rPr>
-                <w:rFonts w:ascii="Vazirmatn" w:hAnsi="Vazirmatn" w:cs="Vazirmatn"/>
-                <w:sz w:val="21"/>
-                <w:szCs w:val="21"/>
-                <w:color w:val="2D2D2D"/>
-                <w:lang w:val="en-US" w:bidi="fa-IR"/>
-              </w:rPr>
-              <w:t>persistent</w:t>
-            </w:r>
-            <w:r>
-              <w:rPr>
-                <w:rFonts w:ascii="Vazirmatn" w:hAnsi="Vazirmatn" w:cs="Vazirmatn"/>
-                <w:sz w:val="21"/>
-                <w:szCs w:val="21"/>
-                <w:color w:val="2D2D2D"/>
-                <w:lang w:val="en-US" w:bidi="fa-IR"/>
-              </w:rPr>
-              <w:t xml:space="preserve"> </w:t>
-            </w:r>
-            <w:r>
-              <w:rPr>
-                <w:rFonts w:ascii="Vazirmatn" w:hAnsi="Vazirmatn" w:cs="Vazirmatn"/>
-                <w:sz w:val="21"/>
-                <w:szCs w:val="21"/>
-                <w:color w:val="2D2D2D"/>
-                <w:lang w:val="en-US" w:bidi="fa-IR"/>
-              </w:rPr>
-              <w:t>auth</w:t>
-            </w:r>
-            <w:r>
-              <w:rPr>
-                <w:rFonts w:ascii="Vazirmatn" w:hAnsi="Vazirmatn" w:cs="Vazirmatn"/>
-                <w:sz w:val="21"/>
-                <w:szCs w:val="21"/>
-                <w:color w:val="2D2D2D"/>
-                <w:lang w:val="en-US" w:bidi="fa-IR"/>
-              </w:rPr>
-              <w:t xml:space="preserve"> </w:t>
-            </w:r>
-            <w:r>
-              <w:rPr>
-                <w:rFonts w:ascii="Vazirmatn" w:hAnsi="Vazirmatn" w:cs="Vazirmatn"/>
-                <w:sz w:val="21"/>
-                <w:szCs w:val="21"/>
-                <w:color w:val="2D2D2D"/>
-                <w:lang w:val="en-US" w:bidi="fa-IR"/>
-              </w:rPr>
-              <w:t>tokens</w:t>
-            </w:r>
-            <w:r>
-              <w:rPr>
-                <w:rFonts w:ascii="Vazirmatn" w:hAnsi="Vazirmatn" w:cs="Vazirmatn"/>
-                <w:sz w:val="21"/>
-                <w:szCs w:val="21"/>
-                <w:color w:val="2D2D2D"/>
-                <w:lang w:val="en-US" w:bidi="fa-IR"/>
-              </w:rPr>
-              <w:t xml:space="preserve"> </w:t>
-            </w:r>
-            <w:r>
-              <w:rPr>
-                <w:rFonts w:ascii="Vazirmatn" w:hAnsi="Vazirmatn" w:cs="Vazirmatn"/>
-                <w:sz w:val="21"/>
-                <w:szCs w:val="21"/>
-                <w:color w:val="2D2D2D"/>
-                <w:lang w:val="en-US" w:bidi="fa-IR"/>
-              </w:rPr>
-              <w:t>are</w:t>
-            </w:r>
-            <w:r>
-              <w:rPr>
-                <w:rFonts w:ascii="Vazirmatn" w:hAnsi="Vazirmatn" w:cs="Vazirmatn"/>
-                <w:sz w:val="21"/>
-                <w:szCs w:val="21"/>
-                <w:color w:val="2D2D2D"/>
-                <w:lang w:val="en-US" w:bidi="fa-IR"/>
-              </w:rPr>
-              <w:t xml:space="preserve"> </w:t>
-            </w:r>
-            <w:r>
-              <w:rPr>
-                <w:rFonts w:ascii="Vazirmatn" w:hAnsi="Vazirmatn" w:cs="Vazirmatn"/>
-                <w:sz w:val="21"/>
-                <w:szCs w:val="21"/>
-                <w:color w:val="2D2D2D"/>
-                <w:lang w:val="en-US" w:bidi="fa-IR"/>
-              </w:rPr>
-              <w:t>never</w:t>
-            </w:r>
-            <w:r>
-              <w:rPr>
-                <w:rFonts w:ascii="Vazirmatn" w:hAnsi="Vazirmatn" w:cs="Vazirmatn"/>
-                <w:sz w:val="21"/>
-                <w:szCs w:val="21"/>
-                <w:color w:val="2D2D2D"/>
-                <w:lang w:val="en-US" w:bidi="fa-IR"/>
-              </w:rPr>
-              <w:t xml:space="preserve"> </w:t>
-            </w:r>
-            <w:r>
-              <w:rPr>
-                <w:rFonts w:ascii="Vazirmatn" w:hAnsi="Vazirmatn" w:cs="Vazirmatn"/>
-                <w:sz w:val="21"/>
-                <w:szCs w:val="21"/>
-                <w:color w:val="2D2D2D"/>
-                <w:lang w:val="en-US" w:bidi="fa-IR"/>
-              </w:rPr>
-              <w:t>evicted</w:t>
-            </w:r>
-            <w:r>
-              <w:rPr>
-                <w:rFonts w:ascii="Vazirmatn" w:hAnsi="Vazirmatn" w:cs="Vazirmatn"/>
-                <w:sz w:val="21"/>
-                <w:szCs w:val="21"/>
-                <w:color w:val="2D2D2D"/>
-                <w:lang w:val="en-US" w:bidi="fa-IR"/>
-              </w:rPr>
-              <w:t xml:space="preserve"> </w:t>
-            </w:r>
-            <w:r>
-              <w:rPr>
-                <w:rFonts w:ascii="Vazirmatn" w:hAnsi="Vazirmatn" w:cs="Vazirmatn"/>
+                <w:rFonts w:ascii="Segoe UI" w:hAnsi="Segoe UI" w:cs="Vazirmatn"/>
                 <w:sz w:val="21"/>
                 <w:szCs w:val="21"/>
                 <w:color w:val="2D2D2D"/>
@@ -2093,7 +2093,7 @@
       </w:pPr>
       <w:r>
         <w:rPr>
-          <w:rFonts w:ascii="Vazirmatn" w:hAnsi="Vazirmatn" w:cs="Vazirmatn"/>
+          <w:rFonts w:ascii="Segoe UI" w:hAnsi="Segoe UI" w:cs="Vazirmatn"/>
           <w:sz w:val="22"/>
           <w:szCs w:val="22"/>
           <w:color w:val="2D2D2D"/>
@@ -2113,7 +2113,7 @@
       </w:r>
       <w:r>
         <w:rPr>
-          <w:rFonts w:ascii="Vazirmatn" w:hAnsi="Vazirmatn" w:cs="Vazirmatn"/>
+          <w:rFonts w:ascii="Segoe UI" w:hAnsi="Segoe UI" w:cs="Vazirmatn"/>
           <w:sz w:val="22"/>
           <w:szCs w:val="22"/>
           <w:color w:val="2D2D2D"/>
@@ -2133,7 +2133,7 @@
       </w:r>
       <w:r>
         <w:rPr>
-          <w:rFonts w:ascii="Vazirmatn" w:hAnsi="Vazirmatn" w:cs="Vazirmatn"/>
+          <w:rFonts w:ascii="Segoe UI" w:hAnsi="Segoe UI" w:cs="Vazirmatn"/>
           <w:sz w:val="22"/>
           <w:szCs w:val="22"/>
           <w:color w:val="2D2D2D"/>
@@ -2153,7 +2153,7 @@
       </w:r>
       <w:r>
         <w:rPr>
-          <w:rFonts w:ascii="Vazirmatn" w:hAnsi="Vazirmatn" w:cs="Vazirmatn"/>
+          <w:rFonts w:ascii="Segoe UI" w:hAnsi="Segoe UI" w:cs="Vazirmatn"/>
           <w:sz w:val="22"/>
           <w:szCs w:val="22"/>
           <w:color w:val="2D2D2D"/>
@@ -2173,7 +2173,7 @@
       </w:r>
       <w:r>
         <w:rPr>
-          <w:rFonts w:ascii="Vazirmatn" w:hAnsi="Vazirmatn" w:cs="Vazirmatn"/>
+          <w:rFonts w:ascii="Segoe UI" w:hAnsi="Segoe UI" w:cs="Vazirmatn"/>
           <w:sz w:val="22"/>
           <w:szCs w:val="22"/>
           <w:color w:val="2D2D2D"/>
@@ -2193,7 +2193,7 @@
       </w:r>
       <w:r>
         <w:rPr>
-          <w:rFonts w:ascii="Vazirmatn" w:hAnsi="Vazirmatn" w:cs="Vazirmatn"/>
+          <w:rFonts w:ascii="Segoe UI" w:hAnsi="Segoe UI" w:cs="Vazirmatn"/>
           <w:sz w:val="22"/>
           <w:szCs w:val="22"/>
           <w:color w:val="2D2D2D"/>
@@ -2213,7 +2213,7 @@
       </w:r>
       <w:r>
         <w:rPr>
-          <w:rFonts w:ascii="Vazirmatn" w:hAnsi="Vazirmatn" w:cs="Vazirmatn"/>
+          <w:rFonts w:ascii="Segoe UI" w:hAnsi="Segoe UI" w:cs="Vazirmatn"/>
           <w:sz w:val="22"/>
           <w:szCs w:val="22"/>
           <w:color w:val="2D2D2D"/>
@@ -2233,7 +2233,7 @@
       </w:r>
       <w:r>
         <w:rPr>
-          <w:rFonts w:ascii="Vazirmatn" w:hAnsi="Vazirmatn" w:cs="Vazirmatn"/>
+          <w:rFonts w:ascii="Segoe UI" w:hAnsi="Segoe UI" w:cs="Vazirmatn"/>
           <w:sz w:val="22"/>
           <w:szCs w:val="22"/>
           <w:color w:val="2D2D2D"/>
@@ -2253,7 +2253,7 @@
       </w:r>
       <w:r>
         <w:rPr>
-          <w:rFonts w:ascii="Vazirmatn" w:hAnsi="Vazirmatn" w:cs="Vazirmatn"/>
+          <w:rFonts w:ascii="Segoe UI" w:hAnsi="Segoe UI" w:cs="Vazirmatn"/>
           <w:sz w:val="22"/>
           <w:szCs w:val="22"/>
           <w:color w:val="2D2D2D"/>
@@ -2273,7 +2273,7 @@
       </w:r>
       <w:r>
         <w:rPr>
-          <w:rFonts w:ascii="Vazirmatn" w:hAnsi="Vazirmatn" w:cs="Vazirmatn"/>
+          <w:rFonts w:ascii="Segoe UI" w:hAnsi="Segoe UI" w:cs="Vazirmatn"/>
           <w:sz w:val="22"/>
           <w:szCs w:val="22"/>
           <w:color w:val="2D2D2D"/>
@@ -2293,7 +2293,7 @@
       </w:r>
       <w:r>
         <w:rPr>
-          <w:rFonts w:ascii="Vazirmatn" w:hAnsi="Vazirmatn" w:cs="Vazirmatn"/>
+          <w:rFonts w:ascii="Segoe UI" w:hAnsi="Segoe UI" w:cs="Vazirmatn"/>
           <w:sz w:val="22"/>
           <w:szCs w:val="22"/>
           <w:color w:val="2D2D2D"/>
@@ -2313,7 +2313,7 @@
       </w:r>
       <w:r>
         <w:rPr>
-          <w:rFonts w:ascii="Vazirmatn" w:hAnsi="Vazirmatn" w:cs="Vazirmatn"/>
+          <w:rFonts w:ascii="Segoe UI" w:hAnsi="Segoe UI" w:cs="Vazirmatn"/>
           <w:sz w:val="22"/>
           <w:szCs w:val="22"/>
           <w:color w:val="2D2D2D"/>
@@ -2333,7 +2333,7 @@
       </w:r>
       <w:r>
         <w:rPr>
-          <w:rFonts w:ascii="Vazirmatn" w:hAnsi="Vazirmatn" w:cs="Vazirmatn"/>
+          <w:rFonts w:ascii="Segoe UI" w:hAnsi="Segoe UI" w:cs="Vazirmatn"/>
           <w:sz w:val="22"/>
           <w:szCs w:val="22"/>
           <w:color w:val="2D2D2D"/>
@@ -2353,7 +2353,7 @@
       </w:r>
       <w:r>
         <w:rPr>
-          <w:rFonts w:ascii="Vazirmatn" w:hAnsi="Vazirmatn" w:cs="Vazirmatn"/>
+          <w:rFonts w:ascii="Segoe UI" w:hAnsi="Segoe UI" w:cs="Vazirmatn"/>
           <w:sz w:val="22"/>
           <w:szCs w:val="22"/>
           <w:color w:val="2D2D2D"/>
@@ -4156,7 +4156,7 @@
       </w:pPr>
       <w:r>
         <w:rPr>
-          <w:rFonts w:ascii="Vazirmatn" w:hAnsi="Vazirmatn" w:cs="Vazirmatn"/>
+          <w:rFonts w:ascii="Segoe UI" w:hAnsi="Segoe UI" w:cs="Vazirmatn"/>
           <w:sz w:val="22"/>
           <w:szCs w:val="22"/>
           <w:color w:val="2D2D2D"/>
@@ -4176,7 +4176,7 @@
       </w:r>
       <w:r>
         <w:rPr>
-          <w:rFonts w:ascii="Vazirmatn" w:hAnsi="Vazirmatn" w:cs="Vazirmatn"/>
+          <w:rFonts w:ascii="Segoe UI" w:hAnsi="Segoe UI" w:cs="Vazirmatn"/>
           <w:sz w:val="22"/>
           <w:szCs w:val="22"/>
           <w:color w:val="2D2D2D"/>
@@ -4196,7 +4196,7 @@
       </w:r>
       <w:r>
         <w:rPr>
-          <w:rFonts w:ascii="Vazirmatn" w:hAnsi="Vazirmatn" w:cs="Vazirmatn"/>
+          <w:rFonts w:ascii="Segoe UI" w:hAnsi="Segoe UI" w:cs="Vazirmatn"/>
           <w:sz w:val="22"/>
           <w:szCs w:val="22"/>
           <w:color w:val="2D2D2D"/>
@@ -4216,7 +4216,7 @@
       </w:r>
       <w:r>
         <w:rPr>
-          <w:rFonts w:ascii="Vazirmatn" w:hAnsi="Vazirmatn" w:cs="Vazirmatn"/>
+          <w:rFonts w:ascii="Segoe UI" w:hAnsi="Segoe UI" w:cs="Vazirmatn"/>
           <w:sz w:val="22"/>
           <w:szCs w:val="22"/>
           <w:color w:val="2D2D2D"/>
@@ -4236,7 +4236,7 @@
       </w:r>
       <w:r>
         <w:rPr>
-          <w:rFonts w:ascii="Vazirmatn" w:hAnsi="Vazirmatn" w:cs="Vazirmatn"/>
+          <w:rFonts w:ascii="Segoe UI" w:hAnsi="Segoe UI" w:cs="Vazirmatn"/>
           <w:sz w:val="22"/>
           <w:szCs w:val="22"/>
           <w:color w:val="2D2D2D"/>
@@ -4256,7 +4256,7 @@
       </w:r>
       <w:r>
         <w:rPr>
-          <w:rFonts w:ascii="Vazirmatn" w:hAnsi="Vazirmatn" w:cs="Vazirmatn"/>
+          <w:rFonts w:ascii="Segoe UI" w:hAnsi="Segoe UI" w:cs="Vazirmatn"/>
           <w:sz w:val="22"/>
           <w:szCs w:val="22"/>
           <w:color w:val="2D2D2D"/>
@@ -4276,7 +4276,7 @@
       </w:r>
       <w:r>
         <w:rPr>
-          <w:rFonts w:ascii="Vazirmatn" w:hAnsi="Vazirmatn" w:cs="Vazirmatn"/>
+          <w:rFonts w:ascii="Segoe UI" w:hAnsi="Segoe UI" w:cs="Vazirmatn"/>
           <w:sz w:val="22"/>
           <w:szCs w:val="22"/>
           <w:color w:val="2D2D2D"/>
@@ -4296,7 +4296,7 @@
       </w:r>
       <w:r>
         <w:rPr>
-          <w:rFonts w:ascii="Vazirmatn" w:hAnsi="Vazirmatn" w:cs="Vazirmatn"/>
+          <w:rFonts w:ascii="Segoe UI" w:hAnsi="Segoe UI" w:cs="Vazirmatn"/>
           <w:sz w:val="22"/>
           <w:szCs w:val="22"/>
           <w:color w:val="2D2D2D"/>
@@ -4316,7 +4316,7 @@
       </w:r>
       <w:r>
         <w:rPr>
-          <w:rFonts w:ascii="Vazirmatn" w:hAnsi="Vazirmatn" w:cs="Vazirmatn"/>
+          <w:rFonts w:ascii="Segoe UI" w:hAnsi="Segoe UI" w:cs="Vazirmatn"/>
           <w:sz w:val="22"/>
           <w:szCs w:val="22"/>
           <w:color w:val="2D2D2D"/>
@@ -4336,7 +4336,7 @@
       </w:r>
       <w:r>
         <w:rPr>
-          <w:rFonts w:ascii="Vazirmatn" w:hAnsi="Vazirmatn" w:cs="Vazirmatn"/>
+          <w:rFonts w:ascii="Segoe UI" w:hAnsi="Segoe UI" w:cs="Vazirmatn"/>
           <w:sz w:val="22"/>
           <w:szCs w:val="22"/>
           <w:color w:val="2D2D2D"/>
@@ -4356,7 +4356,7 @@
       </w:r>
       <w:r>
         <w:rPr>
-          <w:rFonts w:ascii="Vazirmatn" w:hAnsi="Vazirmatn" w:cs="Vazirmatn"/>
+          <w:rFonts w:ascii="Segoe UI" w:hAnsi="Segoe UI" w:cs="Vazirmatn"/>
           <w:sz w:val="22"/>
           <w:szCs w:val="22"/>
           <w:color w:val="2D2D2D"/>
@@ -4376,7 +4376,7 @@
       </w:r>
       <w:r>
         <w:rPr>
-          <w:rFonts w:ascii="Vazirmatn" w:hAnsi="Vazirmatn" w:cs="Vazirmatn"/>
+          <w:rFonts w:ascii="Segoe UI" w:hAnsi="Segoe UI" w:cs="Vazirmatn"/>
           <w:sz w:val="22"/>
           <w:szCs w:val="22"/>
           <w:color w:val="2D2D2D"/>
@@ -4396,7 +4396,7 @@
       </w:r>
       <w:r>
         <w:rPr>
-          <w:rFonts w:ascii="Vazirmatn" w:hAnsi="Vazirmatn" w:cs="Vazirmatn"/>
+          <w:rFonts w:ascii="Segoe UI" w:hAnsi="Segoe UI" w:cs="Vazirmatn"/>
           <w:sz w:val="22"/>
           <w:szCs w:val="22"/>
           <w:color w:val="2D2D2D"/>
@@ -4416,7 +4416,7 @@
       </w:r>
       <w:r>
         <w:rPr>
-          <w:rFonts w:ascii="Vazirmatn" w:hAnsi="Vazirmatn" w:cs="Vazirmatn"/>
+          <w:rFonts w:ascii="Segoe UI" w:hAnsi="Segoe UI" w:cs="Vazirmatn"/>
           <w:sz w:val="22"/>
           <w:szCs w:val="22"/>
           <w:color w:val="2D2D2D"/>
@@ -4436,7 +4436,7 @@
       </w:r>
       <w:r>
         <w:rPr>
-          <w:rFonts w:ascii="Vazirmatn" w:hAnsi="Vazirmatn" w:cs="Vazirmatn"/>
+          <w:rFonts w:ascii="Segoe UI" w:hAnsi="Segoe UI" w:cs="Vazirmatn"/>
           <w:sz w:val="22"/>
           <w:szCs w:val="22"/>
           <w:color w:val="2D2D2D"/>
@@ -4456,7 +4456,7 @@
       </w:r>
       <w:r>
         <w:rPr>
-          <w:rFonts w:ascii="Vazirmatn" w:hAnsi="Vazirmatn" w:cs="Vazirmatn"/>
+          <w:rFonts w:ascii="Segoe UI" w:hAnsi="Segoe UI" w:cs="Vazirmatn"/>
           <w:sz w:val="22"/>
           <w:szCs w:val="22"/>
           <w:color w:val="2D2D2D"/>
@@ -6009,7 +6009,7 @@
       </w:pPr>
       <w:r>
         <w:rPr>
-          <w:rFonts w:ascii="Vazirmatn" w:hAnsi="Vazirmatn" w:cs="Vazirmatn"/>
+          <w:rFonts w:ascii="Segoe UI" w:hAnsi="Segoe UI" w:cs="Vazirmatn"/>
           <w:sz w:val="22"/>
           <w:szCs w:val="22"/>
           <w:color w:val="2D2D2D"/>
@@ -6029,7 +6029,7 @@
       </w:r>
       <w:r>
         <w:rPr>
-          <w:rFonts w:ascii="Vazirmatn" w:hAnsi="Vazirmatn" w:cs="Vazirmatn"/>
+          <w:rFonts w:ascii="Segoe UI" w:hAnsi="Segoe UI" w:cs="Vazirmatn"/>
           <w:sz w:val="22"/>
           <w:szCs w:val="22"/>
           <w:color w:val="2D2D2D"/>
@@ -6049,7 +6049,7 @@
       </w:r>
       <w:r>
         <w:rPr>
-          <w:rFonts w:ascii="Vazirmatn" w:hAnsi="Vazirmatn" w:cs="Vazirmatn"/>
+          <w:rFonts w:ascii="Segoe UI" w:hAnsi="Segoe UI" w:cs="Vazirmatn"/>
           <w:sz w:val="22"/>
           <w:szCs w:val="22"/>
           <w:color w:val="2D2D2D"/>
@@ -6069,7 +6069,7 @@
       </w:r>
       <w:r>
         <w:rPr>
-          <w:rFonts w:ascii="Vazirmatn" w:hAnsi="Vazirmatn" w:cs="Vazirmatn"/>
+          <w:rFonts w:ascii="Segoe UI" w:hAnsi="Segoe UI" w:cs="Vazirmatn"/>
           <w:sz w:val="22"/>
           <w:szCs w:val="22"/>
           <w:color w:val="2D2D2D"/>
@@ -6089,7 +6089,7 @@
       </w:r>
       <w:r>
         <w:rPr>
-          <w:rFonts w:ascii="Vazirmatn" w:hAnsi="Vazirmatn" w:cs="Vazirmatn"/>
+          <w:rFonts w:ascii="Segoe UI" w:hAnsi="Segoe UI" w:cs="Vazirmatn"/>
           <w:sz w:val="22"/>
           <w:szCs w:val="22"/>
           <w:color w:val="2D2D2D"/>
@@ -6109,7 +6109,7 @@
       </w:r>
       <w:r>
         <w:rPr>
-          <w:rFonts w:ascii="Vazirmatn" w:hAnsi="Vazirmatn" w:cs="Vazirmatn"/>
+          <w:rFonts w:ascii="Segoe UI" w:hAnsi="Segoe UI" w:cs="Vazirmatn"/>
           <w:sz w:val="22"/>
           <w:szCs w:val="22"/>
           <w:color w:val="2D2D2D"/>
@@ -6129,7 +6129,7 @@
       </w:r>
       <w:r>
         <w:rPr>
-          <w:rFonts w:ascii="Vazirmatn" w:hAnsi="Vazirmatn" w:cs="Vazirmatn"/>
+          <w:rFonts w:ascii="Segoe UI" w:hAnsi="Segoe UI" w:cs="Vazirmatn"/>
           <w:sz w:val="22"/>
           <w:szCs w:val="22"/>
           <w:color w:val="2D2D2D"/>
@@ -6149,7 +6149,7 @@
       </w:r>
       <w:r>
         <w:rPr>
-          <w:rFonts w:ascii="Vazirmatn" w:hAnsi="Vazirmatn" w:cs="Vazirmatn"/>
+          <w:rFonts w:ascii="Segoe UI" w:hAnsi="Segoe UI" w:cs="Vazirmatn"/>
           <w:sz w:val="22"/>
           <w:szCs w:val="22"/>
           <w:color w:val="2D2D2D"/>
@@ -6169,7 +6169,7 @@
       </w:r>
       <w:r>
         <w:rPr>
-          <w:rFonts w:ascii="Vazirmatn" w:hAnsi="Vazirmatn" w:cs="Vazirmatn"/>
+          <w:rFonts w:ascii="Segoe UI" w:hAnsi="Segoe UI" w:cs="Vazirmatn"/>
           <w:sz w:val="22"/>
           <w:szCs w:val="22"/>
           <w:color w:val="2D2D2D"/>
@@ -6189,7 +6189,7 @@
       </w:r>
       <w:r>
         <w:rPr>
-          <w:rFonts w:ascii="Vazirmatn" w:hAnsi="Vazirmatn" w:cs="Vazirmatn"/>
+          <w:rFonts w:ascii="Segoe UI" w:hAnsi="Segoe UI" w:cs="Vazirmatn"/>
           <w:sz w:val="22"/>
           <w:szCs w:val="22"/>
           <w:color w:val="2D2D2D"/>
@@ -6209,7 +6209,7 @@
       </w:r>
       <w:r>
         <w:rPr>
-          <w:rFonts w:ascii="Vazirmatn" w:hAnsi="Vazirmatn" w:cs="Vazirmatn"/>
+          <w:rFonts w:ascii="Segoe UI" w:hAnsi="Segoe UI" w:cs="Vazirmatn"/>
           <w:sz w:val="22"/>
           <w:szCs w:val="22"/>
           <w:color w:val="2D2D2D"/>
@@ -6229,7 +6229,7 @@
       </w:r>
       <w:r>
         <w:rPr>
-          <w:rFonts w:ascii="Vazirmatn" w:hAnsi="Vazirmatn" w:cs="Vazirmatn"/>
+          <w:rFonts w:ascii="Segoe UI" w:hAnsi="Segoe UI" w:cs="Vazirmatn"/>
           <w:sz w:val="22"/>
           <w:szCs w:val="22"/>
           <w:color w:val="2D2D2D"/>
@@ -6249,7 +6249,7 @@
       </w:r>
       <w:r>
         <w:rPr>
-          <w:rFonts w:ascii="Vazirmatn" w:hAnsi="Vazirmatn" w:cs="Vazirmatn"/>
+          <w:rFonts w:ascii="Segoe UI" w:hAnsi="Segoe UI" w:cs="Vazirmatn"/>
           <w:sz w:val="22"/>
           <w:szCs w:val="22"/>
           <w:color w:val="2D2D2D"/>
@@ -7825,7 +7825,7 @@
       </w:pPr>
       <w:r>
         <w:rPr>
-          <w:rFonts w:ascii="Vazirmatn" w:hAnsi="Vazirmatn" w:cs="Vazirmatn"/>
+          <w:rFonts w:ascii="Segoe UI" w:hAnsi="Segoe UI" w:cs="Vazirmatn"/>
           <w:sz w:val="22"/>
           <w:szCs w:val="22"/>
           <w:color w:val="2D2D2D"/>
@@ -7845,7 +7845,7 @@
       </w:r>
       <w:r>
         <w:rPr>
-          <w:rFonts w:ascii="Vazirmatn" w:hAnsi="Vazirmatn" w:cs="Vazirmatn"/>
+          <w:rFonts w:ascii="Segoe UI" w:hAnsi="Segoe UI" w:cs="Vazirmatn"/>
           <w:sz w:val="22"/>
           <w:szCs w:val="22"/>
           <w:color w:val="2D2D2D"/>
@@ -7865,7 +7865,7 @@
       </w:r>
       <w:r>
         <w:rPr>
-          <w:rFonts w:ascii="Vazirmatn" w:hAnsi="Vazirmatn" w:cs="Vazirmatn"/>
+          <w:rFonts w:ascii="Segoe UI" w:hAnsi="Segoe UI" w:cs="Vazirmatn"/>
           <w:sz w:val="22"/>
           <w:szCs w:val="22"/>
           <w:color w:val="2D2D2D"/>
@@ -7885,7 +7885,7 @@
       </w:r>
       <w:r>
         <w:rPr>
-          <w:rFonts w:ascii="Vazirmatn" w:hAnsi="Vazirmatn" w:cs="Vazirmatn"/>
+          <w:rFonts w:ascii="Segoe UI" w:hAnsi="Segoe UI" w:cs="Vazirmatn"/>
           <w:sz w:val="22"/>
           <w:szCs w:val="22"/>
           <w:color w:val="2D2D2D"/>
@@ -7905,7 +7905,7 @@
       </w:r>
       <w:r>
         <w:rPr>
-          <w:rFonts w:ascii="Vazirmatn" w:hAnsi="Vazirmatn" w:cs="Vazirmatn"/>
+          <w:rFonts w:ascii="Segoe UI" w:hAnsi="Segoe UI" w:cs="Vazirmatn"/>
           <w:sz w:val="22"/>
           <w:szCs w:val="22"/>
           <w:color w:val="2D2D2D"/>
@@ -7935,7 +7935,7 @@
       </w:r>
       <w:r>
         <w:rPr>
-          <w:rFonts w:ascii="Vazirmatn" w:hAnsi="Vazirmatn" w:cs="Vazirmatn"/>
+          <w:rFonts w:ascii="Segoe UI" w:hAnsi="Segoe UI" w:cs="Vazirmatn"/>
           <w:sz w:val="22"/>
           <w:szCs w:val="22"/>
           <w:color w:val="2D2D2D"/>
@@ -7955,7 +7955,7 @@
       </w:r>
       <w:r>
         <w:rPr>
-          <w:rFonts w:ascii="Vazirmatn" w:hAnsi="Vazirmatn" w:cs="Vazirmatn"/>
+          <w:rFonts w:ascii="Segoe UI" w:hAnsi="Segoe UI" w:cs="Vazirmatn"/>
           <w:sz w:val="22"/>
           <w:szCs w:val="22"/>
           <w:color w:val="2D2D2D"/>
@@ -7985,7 +7985,7 @@
       </w:r>
       <w:r>
         <w:rPr>
-          <w:rFonts w:ascii="Vazirmatn" w:hAnsi="Vazirmatn" w:cs="Vazirmatn"/>
+          <w:rFonts w:ascii="Segoe UI" w:hAnsi="Segoe UI" w:cs="Vazirmatn"/>
           <w:sz w:val="22"/>
           <w:szCs w:val="22"/>
           <w:color w:val="2D2D2D"/>
@@ -8005,7 +8005,7 @@
       </w:r>
       <w:r>
         <w:rPr>
-          <w:rFonts w:ascii="Vazirmatn" w:hAnsi="Vazirmatn" w:cs="Vazirmatn"/>
+          <w:rFonts w:ascii="Segoe UI" w:hAnsi="Segoe UI" w:cs="Vazirmatn"/>
           <w:sz w:val="22"/>
           <w:szCs w:val="22"/>
           <w:color w:val="2D2D2D"/>
@@ -8025,7 +8025,7 @@
       </w:r>
       <w:r>
         <w:rPr>
-          <w:rFonts w:ascii="Vazirmatn" w:hAnsi="Vazirmatn" w:cs="Vazirmatn"/>
+          <w:rFonts w:ascii="Segoe UI" w:hAnsi="Segoe UI" w:cs="Vazirmatn"/>
           <w:sz w:val="22"/>
           <w:szCs w:val="22"/>
           <w:color w:val="2D2D2D"/>
@@ -8045,7 +8045,7 @@
       </w:r>
       <w:r>
         <w:rPr>
-          <w:rFonts w:ascii="Vazirmatn" w:hAnsi="Vazirmatn" w:cs="Vazirmatn"/>
+          <w:rFonts w:ascii="Segoe UI" w:hAnsi="Segoe UI" w:cs="Vazirmatn"/>
           <w:sz w:val="22"/>
           <w:szCs w:val="22"/>
           <w:color w:val="2D2D2D"/>
@@ -8065,7 +8065,7 @@
       </w:r>
       <w:r>
         <w:rPr>
-          <w:rFonts w:ascii="Vazirmatn" w:hAnsi="Vazirmatn" w:cs="Vazirmatn"/>
+          <w:rFonts w:ascii="Segoe UI" w:hAnsi="Segoe UI" w:cs="Vazirmatn"/>
           <w:sz w:val="22"/>
           <w:szCs w:val="22"/>
           <w:color w:val="2D2D2D"/>
@@ -8085,7 +8085,7 @@
       </w:r>
       <w:r>
         <w:rPr>
-          <w:rFonts w:ascii="Vazirmatn" w:hAnsi="Vazirmatn" w:cs="Vazirmatn"/>
+          <w:rFonts w:ascii="Segoe UI" w:hAnsi="Segoe UI" w:cs="Vazirmatn"/>
           <w:sz w:val="22"/>
           <w:szCs w:val="22"/>
           <w:color w:val="2D2D2D"/>
@@ -8105,7 +8105,7 @@
       </w:r>
       <w:r>
         <w:rPr>
-          <w:rFonts w:ascii="Vazirmatn" w:hAnsi="Vazirmatn" w:cs="Vazirmatn"/>
+          <w:rFonts w:ascii="Segoe UI" w:hAnsi="Segoe UI" w:cs="Vazirmatn"/>
           <w:sz w:val="22"/>
           <w:szCs w:val="22"/>
           <w:color w:val="2D2D2D"/>
@@ -8121,7 +8121,7 @@
       </w:pPr>
       <w:r>
         <w:rPr>
-          <w:rFonts w:ascii="Vazirmatn" w:hAnsi="Vazirmatn" w:cs="Vazirmatn"/>
+          <w:rFonts w:ascii="Segoe UI" w:hAnsi="Segoe UI" w:cs="Vazirmatn"/>
           <w:sz w:val="22"/>
           <w:szCs w:val="22"/>
           <w:color w:val="2D2D2D"/>
@@ -8141,7 +8141,7 @@
       </w:r>
       <w:r>
         <w:rPr>
-          <w:rFonts w:ascii="Vazirmatn" w:hAnsi="Vazirmatn" w:cs="Vazirmatn"/>
+          <w:rFonts w:ascii="Segoe UI" w:hAnsi="Segoe UI" w:cs="Vazirmatn"/>
           <w:sz w:val="22"/>
           <w:szCs w:val="22"/>
           <w:color w:val="2D2D2D"/>
@@ -8161,7 +8161,7 @@
       </w:r>
       <w:r>
         <w:rPr>
-          <w:rFonts w:ascii="Vazirmatn" w:hAnsi="Vazirmatn" w:cs="Vazirmatn"/>
+          <w:rFonts w:ascii="Segoe UI" w:hAnsi="Segoe UI" w:cs="Vazirmatn"/>
           <w:sz w:val="22"/>
           <w:szCs w:val="22"/>
           <w:color w:val="2D2D2D"/>
@@ -8181,7 +8181,7 @@
       </w:r>
       <w:r>
         <w:rPr>
-          <w:rFonts w:ascii="Vazirmatn" w:hAnsi="Vazirmatn" w:cs="Vazirmatn"/>
+          <w:rFonts w:ascii="Segoe UI" w:hAnsi="Segoe UI" w:cs="Vazirmatn"/>
           <w:sz w:val="22"/>
           <w:szCs w:val="22"/>
           <w:color w:val="2D2D2D"/>
@@ -8201,7 +8201,7 @@
       </w:r>
       <w:r>
         <w:rPr>
-          <w:rFonts w:ascii="Vazirmatn" w:hAnsi="Vazirmatn" w:cs="Vazirmatn"/>
+          <w:rFonts w:ascii="Segoe UI" w:hAnsi="Segoe UI" w:cs="Vazirmatn"/>
           <w:sz w:val="22"/>
           <w:szCs w:val="22"/>
           <w:color w:val="2D2D2D"/>
@@ -8221,7 +8221,7 @@
       </w:r>
       <w:r>
         <w:rPr>
-          <w:rFonts w:ascii="Vazirmatn" w:hAnsi="Vazirmatn" w:cs="Vazirmatn"/>
+          <w:rFonts w:ascii="Segoe UI" w:hAnsi="Segoe UI" w:cs="Vazirmatn"/>
           <w:sz w:val="22"/>
           <w:szCs w:val="22"/>
           <w:color w:val="2D2D2D"/>
@@ -8241,7 +8241,7 @@
       </w:r>
       <w:r>
         <w:rPr>
-          <w:rFonts w:ascii="Vazirmatn" w:hAnsi="Vazirmatn" w:cs="Vazirmatn"/>
+          <w:rFonts w:ascii="Segoe UI" w:hAnsi="Segoe UI" w:cs="Vazirmatn"/>
           <w:sz w:val="22"/>
           <w:szCs w:val="22"/>
           <w:color w:val="2D2D2D"/>
@@ -8261,7 +8261,7 @@
       </w:r>
       <w:r>
         <w:rPr>
-          <w:rFonts w:ascii="Vazirmatn" w:hAnsi="Vazirmatn" w:cs="Vazirmatn"/>
+          <w:rFonts w:ascii="Segoe UI" w:hAnsi="Segoe UI" w:cs="Vazirmatn"/>
           <w:sz w:val="22"/>
           <w:szCs w:val="22"/>
           <w:color w:val="2D2D2D"/>
@@ -8281,7 +8281,7 @@
       </w:r>
       <w:r>
         <w:rPr>
-          <w:rFonts w:ascii="Vazirmatn" w:hAnsi="Vazirmatn" w:cs="Vazirmatn"/>
+          <w:rFonts w:ascii="Segoe UI" w:hAnsi="Segoe UI" w:cs="Vazirmatn"/>
           <w:sz w:val="22"/>
           <w:szCs w:val="22"/>
           <w:color w:val="2D2D2D"/>
@@ -8301,7 +8301,7 @@
       </w:r>
       <w:r>
         <w:rPr>
-          <w:rFonts w:ascii="Vazirmatn" w:hAnsi="Vazirmatn" w:cs="Vazirmatn"/>
+          <w:rFonts w:ascii="Segoe UI" w:hAnsi="Segoe UI" w:cs="Vazirmatn"/>
           <w:sz w:val="22"/>
           <w:szCs w:val="22"/>
           <w:color w:val="2D2D2D"/>
@@ -8321,7 +8321,7 @@
       </w:r>
       <w:r>
         <w:rPr>
-          <w:rFonts w:ascii="Vazirmatn" w:hAnsi="Vazirmatn" w:cs="Vazirmatn"/>
+          <w:rFonts w:ascii="Segoe UI" w:hAnsi="Segoe UI" w:cs="Vazirmatn"/>
           <w:sz w:val="22"/>
           <w:szCs w:val="22"/>
           <w:color w:val="2D2D2D"/>
@@ -8341,7 +8341,7 @@
       </w:r>
       <w:r>
         <w:rPr>
-          <w:rFonts w:ascii="Vazirmatn" w:hAnsi="Vazirmatn" w:cs="Vazirmatn"/>
+          <w:rFonts w:ascii="Segoe UI" w:hAnsi="Segoe UI" w:cs="Vazirmatn"/>
           <w:sz w:val="22"/>
           <w:szCs w:val="22"/>
           <w:color w:val="2D2D2D"/>
@@ -8361,7 +8361,7 @@
       </w:r>
       <w:r>
         <w:rPr>
-          <w:rFonts w:ascii="Vazirmatn" w:hAnsi="Vazirmatn" w:cs="Vazirmatn"/>
+          <w:rFonts w:ascii="Segoe UI" w:hAnsi="Segoe UI" w:cs="Vazirmatn"/>
           <w:sz w:val="22"/>
           <w:szCs w:val="22"/>
           <w:color w:val="2D2D2D"/>
@@ -9066,7 +9066,7 @@
         <w:drawing>
           <wp:inline xmlns:a="http://schemas.openxmlformats.org/drawingml/2006/main" xmlns:pic="http://schemas.openxmlformats.org/drawingml/2006/picture">
             <wp:extent cx="5760720" cy="2606547"/>
-            <wp:docPr id="2" name="Picture 2"/>
+            <wp:docPr id="2" name="Picture 2" descr="Primary cluster topology and network routing map" title="Primary cluster topology and network routing map"/>
             <wp:cNvGraphicFramePr>
               <a:graphicFrameLocks noChangeAspect="1"/>
             </wp:cNvGraphicFramePr>
@@ -9095,22 +9095,6 @@
             </a:graphic>
           </wp:inline>
         </w:drawing>
-      </w:r>
-    </w:p>
-    <w:p>
-      <w:pPr>
-        <w:spacing w:before="40" w:after="200"/>
-        <w:jc w:val="center"/>
-      </w:pPr>
-      <w:r>
-        <w:rPr>
-          <w:rFonts w:ascii="Vazirmatn" w:hAnsi="Vazirmatn" w:cs="Vazirmatn"/>
-          <w:sz w:val="19"/>
-          <w:szCs w:val="19"/>
-          <w:color w:val="5A5A5A"/>
-          <w:lang w:val="en-US" w:bidi="fa-IR"/>
-        </w:rPr>
-        <w:t>Primary cluster topology and network routing map</w:t>
       </w:r>
     </w:p>
     <w:tbl>
@@ -9208,7 +9192,7 @@
       </w:pPr>
       <w:r>
         <w:rPr>
-          <w:rFonts w:ascii="Vazirmatn" w:hAnsi="Vazirmatn" w:cs="Vazirmatn"/>
+          <w:rFonts w:ascii="Segoe UI" w:hAnsi="Segoe UI" w:cs="Vazirmatn"/>
           <w:sz w:val="22"/>
           <w:szCs w:val="22"/>
           <w:color w:val="2D2D2D"/>
@@ -9228,7 +9212,7 @@
       </w:r>
       <w:r>
         <w:rPr>
-          <w:rFonts w:ascii="Vazirmatn" w:hAnsi="Vazirmatn" w:cs="Vazirmatn"/>
+          <w:rFonts w:ascii="Segoe UI" w:hAnsi="Segoe UI" w:cs="Vazirmatn"/>
           <w:sz w:val="22"/>
           <w:szCs w:val="22"/>
           <w:color w:val="2D2D2D"/>
@@ -9248,7 +9232,7 @@
       </w:r>
       <w:r>
         <w:rPr>
-          <w:rFonts w:ascii="Vazirmatn" w:hAnsi="Vazirmatn" w:cs="Vazirmatn"/>
+          <w:rFonts w:ascii="Segoe UI" w:hAnsi="Segoe UI" w:cs="Vazirmatn"/>
           <w:sz w:val="22"/>
           <w:szCs w:val="22"/>
           <w:color w:val="2D2D2D"/>
@@ -9268,7 +9252,7 @@
       </w:r>
       <w:r>
         <w:rPr>
-          <w:rFonts w:ascii="Vazirmatn" w:hAnsi="Vazirmatn" w:cs="Vazirmatn"/>
+          <w:rFonts w:ascii="Segoe UI" w:hAnsi="Segoe UI" w:cs="Vazirmatn"/>
           <w:sz w:val="22"/>
           <w:szCs w:val="22"/>
           <w:color w:val="2D2D2D"/>
@@ -9288,7 +9272,7 @@
       </w:r>
       <w:r>
         <w:rPr>
-          <w:rFonts w:ascii="Vazirmatn" w:hAnsi="Vazirmatn" w:cs="Vazirmatn"/>
+          <w:rFonts w:ascii="Segoe UI" w:hAnsi="Segoe UI" w:cs="Vazirmatn"/>
           <w:sz w:val="22"/>
           <w:szCs w:val="22"/>
           <w:color w:val="2D2D2D"/>
@@ -9308,7 +9292,7 @@
       </w:r>
       <w:r>
         <w:rPr>
-          <w:rFonts w:ascii="Vazirmatn" w:hAnsi="Vazirmatn" w:cs="Vazirmatn"/>
+          <w:rFonts w:ascii="Segoe UI" w:hAnsi="Segoe UI" w:cs="Vazirmatn"/>
           <w:sz w:val="22"/>
           <w:szCs w:val="22"/>
           <w:color w:val="2D2D2D"/>
@@ -9338,7 +9322,7 @@
       </w:r>
       <w:r>
         <w:rPr>
-          <w:rFonts w:ascii="Vazirmatn" w:hAnsi="Vazirmatn" w:cs="Vazirmatn"/>
+          <w:rFonts w:ascii="Segoe UI" w:hAnsi="Segoe UI" w:cs="Vazirmatn"/>
           <w:sz w:val="22"/>
           <w:szCs w:val="22"/>
           <w:color w:val="2D2D2D"/>
@@ -9358,7 +9342,7 @@
       </w:r>
       <w:r>
         <w:rPr>
-          <w:rFonts w:ascii="Vazirmatn" w:hAnsi="Vazirmatn" w:cs="Vazirmatn"/>
+          <w:rFonts w:ascii="Segoe UI" w:hAnsi="Segoe UI" w:cs="Vazirmatn"/>
           <w:sz w:val="22"/>
           <w:szCs w:val="22"/>
           <w:color w:val="2D2D2D"/>
@@ -9388,7 +9372,7 @@
       </w:r>
       <w:r>
         <w:rPr>
-          <w:rFonts w:ascii="Vazirmatn" w:hAnsi="Vazirmatn" w:cs="Vazirmatn"/>
+          <w:rFonts w:ascii="Segoe UI" w:hAnsi="Segoe UI" w:cs="Vazirmatn"/>
           <w:sz w:val="22"/>
           <w:szCs w:val="22"/>
           <w:color w:val="2D2D2D"/>
@@ -9408,7 +9392,7 @@
       </w:r>
       <w:r>
         <w:rPr>
-          <w:rFonts w:ascii="Vazirmatn" w:hAnsi="Vazirmatn" w:cs="Vazirmatn"/>
+          <w:rFonts w:ascii="Segoe UI" w:hAnsi="Segoe UI" w:cs="Vazirmatn"/>
           <w:sz w:val="22"/>
           <w:szCs w:val="22"/>
           <w:color w:val="2D2D2D"/>
@@ -9428,7 +9412,7 @@
       </w:r>
       <w:r>
         <w:rPr>
-          <w:rFonts w:ascii="Vazirmatn" w:hAnsi="Vazirmatn" w:cs="Vazirmatn"/>
+          <w:rFonts w:ascii="Segoe UI" w:hAnsi="Segoe UI" w:cs="Vazirmatn"/>
           <w:sz w:val="22"/>
           <w:szCs w:val="22"/>
           <w:color w:val="2D2D2D"/>
@@ -9463,8 +9447,8 @@
       </w:tblGrid>
       <w:tr>
         <w:trPr>
+          <w:cantSplit/>
           <w:tblHeader/>
-          <w:cantSplit/>
         </w:trPr>
         <w:tc>
           <w:tcPr>
@@ -9485,9 +9469,21 @@
           </w:tcPr>
           <w:p>
             <w:pPr>
-              <w:jc w:val="start"/>
+              <w:spacing w:line="276" w:lineRule="auto" w:after="80"/>
+              <w:jc w:val="left"/>
             </w:pPr>
-            <w:r/>
+            <w:r>
+              <w:rPr>
+                <w:rFonts w:ascii="Segoe UI" w:hAnsi="Segoe UI" w:cs="Vazirmatn"/>
+                <w:sz w:val="21"/>
+                <w:szCs w:val="21"/>
+                <w:b/>
+                <w:bCs/>
+                <w:color w:val="FFFFFF"/>
+                <w:lang w:val="en-US" w:bidi="fa-IR"/>
+              </w:rPr>
+              <w:t>Node</w:t>
+            </w:r>
             <w:r>
               <w:rPr>
                 <w:rFonts w:ascii="Vazirmatn" w:hAnsi="Vazirmatn" w:cs="Vazirmatn"/>
@@ -9498,7 +9494,19 @@
                 <w:color w:val="FFFFFF"/>
                 <w:lang w:val="en-US" w:bidi="fa-IR"/>
               </w:rPr>
-              <w:t>Node Identifier</w:t>
+              <w:t xml:space="preserve"> </w:t>
+            </w:r>
+            <w:r>
+              <w:rPr>
+                <w:rFonts w:ascii="Segoe UI" w:hAnsi="Segoe UI" w:cs="Vazirmatn"/>
+                <w:sz w:val="21"/>
+                <w:szCs w:val="21"/>
+                <w:b/>
+                <w:bCs/>
+                <w:color w:val="FFFFFF"/>
+                <w:lang w:val="en-US" w:bidi="fa-IR"/>
+              </w:rPr>
+              <w:t>Identifier</w:t>
             </w:r>
           </w:p>
         </w:tc>
@@ -9521,12 +9529,12 @@
           </w:tcPr>
           <w:p>
             <w:pPr>
-              <w:jc w:val="start"/>
+              <w:spacing w:line="276" w:lineRule="auto" w:after="80"/>
+              <w:jc w:val="left"/>
             </w:pPr>
-            <w:r/>
-            <w:r>
-              <w:rPr>
-                <w:rFonts w:ascii="Vazirmatn" w:hAnsi="Vazirmatn" w:cs="Vazirmatn"/>
+            <w:r>
+              <w:rPr>
+                <w:rFonts w:ascii="Segoe UI" w:hAnsi="Segoe UI" w:cs="Vazirmatn"/>
                 <w:sz w:val="21"/>
                 <w:szCs w:val="21"/>
                 <w:b/>
@@ -9557,9 +9565,21 @@
           </w:tcPr>
           <w:p>
             <w:pPr>
-              <w:jc w:val="start"/>
+              <w:spacing w:line="276" w:lineRule="auto" w:after="80"/>
+              <w:jc w:val="left"/>
             </w:pPr>
-            <w:r/>
+            <w:r>
+              <w:rPr>
+                <w:rFonts w:ascii="Segoe UI" w:hAnsi="Segoe UI" w:cs="Vazirmatn"/>
+                <w:sz w:val="21"/>
+                <w:szCs w:val="21"/>
+                <w:b/>
+                <w:bCs/>
+                <w:color w:val="FFFFFF"/>
+                <w:lang w:val="en-US" w:bidi="fa-IR"/>
+              </w:rPr>
+              <w:t>Memory</w:t>
+            </w:r>
             <w:r>
               <w:rPr>
                 <w:rFonts w:ascii="Vazirmatn" w:hAnsi="Vazirmatn" w:cs="Vazirmatn"/>
@@ -9570,7 +9590,19 @@
                 <w:color w:val="FFFFFF"/>
                 <w:lang w:val="en-US" w:bidi="fa-IR"/>
               </w:rPr>
-              <w:t>Memory Allocated</w:t>
+              <w:t xml:space="preserve"> </w:t>
+            </w:r>
+            <w:r>
+              <w:rPr>
+                <w:rFonts w:ascii="Segoe UI" w:hAnsi="Segoe UI" w:cs="Vazirmatn"/>
+                <w:sz w:val="21"/>
+                <w:szCs w:val="21"/>
+                <w:b/>
+                <w:bCs/>
+                <w:color w:val="FFFFFF"/>
+                <w:lang w:val="en-US" w:bidi="fa-IR"/>
+              </w:rPr>
+              <w:t>Allocated</w:t>
             </w:r>
           </w:p>
         </w:tc>
@@ -9593,9 +9625,21 @@
           </w:tcPr>
           <w:p>
             <w:pPr>
-              <w:jc w:val="start"/>
+              <w:spacing w:line="276" w:lineRule="auto" w:after="80"/>
+              <w:jc w:val="left"/>
             </w:pPr>
-            <w:r/>
+            <w:r>
+              <w:rPr>
+                <w:rFonts w:ascii="Segoe UI" w:hAnsi="Segoe UI" w:cs="Vazirmatn"/>
+                <w:sz w:val="21"/>
+                <w:szCs w:val="21"/>
+                <w:b/>
+                <w:bCs/>
+                <w:color w:val="FFFFFF"/>
+                <w:lang w:val="en-US" w:bidi="fa-IR"/>
+              </w:rPr>
+              <w:t>Latency</w:t>
+            </w:r>
             <w:r>
               <w:rPr>
                 <w:rFonts w:ascii="Vazirmatn" w:hAnsi="Vazirmatn" w:cs="Vazirmatn"/>
@@ -9606,7 +9650,19 @@
                 <w:color w:val="FFFFFF"/>
                 <w:lang w:val="en-US" w:bidi="fa-IR"/>
               </w:rPr>
-              <w:t>Latency (p99)</w:t>
+              <w:t xml:space="preserve"> </w:t>
+            </w:r>
+            <w:r>
+              <w:rPr>
+                <w:rFonts w:ascii="Segoe UI" w:hAnsi="Segoe UI" w:cs="Vazirmatn"/>
+                <w:sz w:val="21"/>
+                <w:szCs w:val="21"/>
+                <w:b/>
+                <w:bCs/>
+                <w:color w:val="FFFFFF"/>
+                <w:lang w:val="en-US" w:bidi="fa-IR"/>
+              </w:rPr>
+              <w:t>(p99)</w:t>
             </w:r>
           </w:p>
         </w:tc>
@@ -9629,9 +9685,21 @@
           </w:tcPr>
           <w:p>
             <w:pPr>
-              <w:jc w:val="start"/>
+              <w:spacing w:line="276" w:lineRule="auto" w:after="80"/>
+              <w:jc w:val="left"/>
             </w:pPr>
-            <w:r/>
+            <w:r>
+              <w:rPr>
+                <w:rFonts w:ascii="Segoe UI" w:hAnsi="Segoe UI" w:cs="Vazirmatn"/>
+                <w:sz w:val="21"/>
+                <w:szCs w:val="21"/>
+                <w:b/>
+                <w:bCs/>
+                <w:color w:val="FFFFFF"/>
+                <w:lang w:val="en-US" w:bidi="fa-IR"/>
+              </w:rPr>
+              <w:t>Replication</w:t>
+            </w:r>
             <w:r>
               <w:rPr>
                 <w:rFonts w:ascii="Vazirmatn" w:hAnsi="Vazirmatn" w:cs="Vazirmatn"/>
@@ -9642,7 +9710,19 @@
                 <w:color w:val="FFFFFF"/>
                 <w:lang w:val="en-US" w:bidi="fa-IR"/>
               </w:rPr>
-              <w:t>Replication Status</w:t>
+              <w:t xml:space="preserve"> </w:t>
+            </w:r>
+            <w:r>
+              <w:rPr>
+                <w:rFonts w:ascii="Segoe UI" w:hAnsi="Segoe UI" w:cs="Vazirmatn"/>
+                <w:sz w:val="21"/>
+                <w:szCs w:val="21"/>
+                <w:b/>
+                <w:bCs/>
+                <w:color w:val="FFFFFF"/>
+                <w:lang w:val="en-US" w:bidi="fa-IR"/>
+              </w:rPr>
+              <w:t>Status</w:t>
             </w:r>
           </w:p>
         </w:tc>
@@ -9665,12 +9745,12 @@
           </w:tcPr>
           <w:p>
             <w:pPr>
-              <w:jc w:val="start"/>
+              <w:spacing w:line="276" w:lineRule="auto" w:after="80"/>
+              <w:jc w:val="left"/>
             </w:pPr>
-            <w:r/>
-            <w:r>
-              <w:rPr>
-                <w:rFonts w:ascii="Vazirmatn" w:hAnsi="Vazirmatn" w:cs="Vazirmatn"/>
+            <w:r>
+              <w:rPr>
+                <w:rFonts w:ascii="Segoe UI" w:hAnsi="Segoe UI" w:cs="Vazirmatn"/>
                 <w:sz w:val="21"/>
                 <w:szCs w:val="21"/>
                 <w:b/>
@@ -9706,14 +9786,14 @@
           </w:tcPr>
           <w:p>
             <w:pPr>
-              <w:jc w:val="start"/>
+              <w:spacing w:line="276" w:lineRule="auto" w:after="80"/>
+              <w:jc w:val="left"/>
             </w:pPr>
-            <w:r/>
-            <w:r>
-              <w:rPr>
-                <w:rFonts w:ascii="Vazirmatn" w:hAnsi="Vazirmatn" w:cs="Vazirmatn"/>
-                <w:sz w:val="20"/>
-                <w:szCs w:val="20"/>
+            <w:r>
+              <w:rPr>
+                <w:rFonts w:ascii="Segoe UI" w:hAnsi="Segoe UI" w:cs="Vazirmatn"/>
+                <w:sz w:val="21"/>
+                <w:szCs w:val="21"/>
                 <w:color w:val="2D2D2D"/>
                 <w:lang w:val="en-US" w:bidi="fa-IR"/>
               </w:rPr>
@@ -9740,14 +9820,14 @@
           </w:tcPr>
           <w:p>
             <w:pPr>
-              <w:jc w:val="start"/>
+              <w:spacing w:line="276" w:lineRule="auto" w:after="80"/>
+              <w:jc w:val="left"/>
             </w:pPr>
-            <w:r/>
-            <w:r>
-              <w:rPr>
-                <w:rFonts w:ascii="Vazirmatn" w:hAnsi="Vazirmatn" w:cs="Vazirmatn"/>
-                <w:sz w:val="20"/>
-                <w:szCs w:val="20"/>
+            <w:r>
+              <w:rPr>
+                <w:rFonts w:ascii="Segoe UI" w:hAnsi="Segoe UI" w:cs="Vazirmatn"/>
+                <w:sz w:val="21"/>
+                <w:szCs w:val="21"/>
                 <w:color w:val="2D2D2D"/>
                 <w:lang w:val="en-US" w:bidi="fa-IR"/>
               </w:rPr>
@@ -9774,24 +9854,34 @@
           </w:tcPr>
           <w:p>
             <w:pPr>
-              <w:jc w:val="start"/>
+              <w:spacing w:line="276" w:lineRule="auto" w:after="80"/>
+              <w:jc w:val="left"/>
             </w:pPr>
-            <w:r/>
             <w:r>
               <w:rPr>
                 <w:rFonts w:ascii="Vazirmatn" w:hAnsi="Vazirmatn" w:cs="Vazirmatn"/>
-                <w:sz w:val="20"/>
-                <w:szCs w:val="20"/>
+                <w:sz w:val="21"/>
+                <w:szCs w:val="21"/>
                 <w:color w:val="2D2D2D"/>
                 <w:lang w:val="en-US" w:bidi="fa-IR"/>
               </w:rPr>
-              <w:t xml:space="preserve">32 </w:t>
+              <w:t>32</w:t>
             </w:r>
             <w:r>
               <w:rPr>
                 <w:rFonts w:ascii="Vazirmatn" w:hAnsi="Vazirmatn" w:cs="Vazirmatn"/>
-                <w:sz w:val="20"/>
-                <w:szCs w:val="20"/>
+                <w:sz w:val="21"/>
+                <w:szCs w:val="21"/>
+                <w:color w:val="2D2D2D"/>
+                <w:lang w:val="en-US" w:bidi="fa-IR"/>
+              </w:rPr>
+              <w:t xml:space="preserve"> </w:t>
+            </w:r>
+            <w:r>
+              <w:rPr>
+                <w:rFonts w:ascii="Segoe UI" w:hAnsi="Segoe UI" w:cs="Vazirmatn"/>
+                <w:sz w:val="21"/>
+                <w:szCs w:val="21"/>
                 <w:color w:val="2D2D2D"/>
                 <w:lang w:val="en-US" w:bidi="fa-IR"/>
               </w:rPr>
@@ -9818,24 +9908,34 @@
           </w:tcPr>
           <w:p>
             <w:pPr>
-              <w:jc w:val="start"/>
+              <w:spacing w:line="276" w:lineRule="auto" w:after="80"/>
+              <w:jc w:val="left"/>
             </w:pPr>
-            <w:r/>
             <w:r>
               <w:rPr>
                 <w:rFonts w:ascii="Vazirmatn" w:hAnsi="Vazirmatn" w:cs="Vazirmatn"/>
-                <w:sz w:val="20"/>
-                <w:szCs w:val="20"/>
+                <w:sz w:val="21"/>
+                <w:szCs w:val="21"/>
                 <w:color w:val="2D2D2D"/>
                 <w:lang w:val="en-US" w:bidi="fa-IR"/>
               </w:rPr>
-              <w:t xml:space="preserve">0.8 </w:t>
+              <w:t>0.8</w:t>
             </w:r>
             <w:r>
               <w:rPr>
                 <w:rFonts w:ascii="Vazirmatn" w:hAnsi="Vazirmatn" w:cs="Vazirmatn"/>
-                <w:sz w:val="20"/>
-                <w:szCs w:val="20"/>
+                <w:sz w:val="21"/>
+                <w:szCs w:val="21"/>
+                <w:color w:val="2D2D2D"/>
+                <w:lang w:val="en-US" w:bidi="fa-IR"/>
+              </w:rPr>
+              <w:t xml:space="preserve"> </w:t>
+            </w:r>
+            <w:r>
+              <w:rPr>
+                <w:rFonts w:ascii="Segoe UI" w:hAnsi="Segoe UI" w:cs="Vazirmatn"/>
+                <w:sz w:val="21"/>
+                <w:szCs w:val="21"/>
                 <w:color w:val="2D2D2D"/>
                 <w:lang w:val="en-US" w:bidi="fa-IR"/>
               </w:rPr>
@@ -9862,18 +9962,38 @@
           </w:tcPr>
           <w:p>
             <w:pPr>
-              <w:jc w:val="start"/>
+              <w:spacing w:line="276" w:lineRule="auto" w:after="80"/>
+              <w:jc w:val="left"/>
             </w:pPr>
-            <w:r/>
+            <w:r>
+              <w:rPr>
+                <w:rFonts w:ascii="Segoe UI" w:hAnsi="Segoe UI" w:cs="Vazirmatn"/>
+                <w:sz w:val="21"/>
+                <w:szCs w:val="21"/>
+                <w:color w:val="2D2D2D"/>
+                <w:lang w:val="en-US" w:bidi="fa-IR"/>
+              </w:rPr>
+              <w:t>Primary</w:t>
+            </w:r>
             <w:r>
               <w:rPr>
                 <w:rFonts w:ascii="Vazirmatn" w:hAnsi="Vazirmatn" w:cs="Vazirmatn"/>
-                <w:sz w:val="20"/>
-                <w:szCs w:val="20"/>
+                <w:sz w:val="21"/>
+                <w:szCs w:val="21"/>
                 <w:color w:val="2D2D2D"/>
                 <w:lang w:val="en-US" w:bidi="fa-IR"/>
               </w:rPr>
-              <w:t>Primary Master</w:t>
+              <w:t xml:space="preserve"> </w:t>
+            </w:r>
+            <w:r>
+              <w:rPr>
+                <w:rFonts w:ascii="Segoe UI" w:hAnsi="Segoe UI" w:cs="Vazirmatn"/>
+                <w:sz w:val="21"/>
+                <w:szCs w:val="21"/>
+                <w:color w:val="2D2D2D"/>
+                <w:lang w:val="en-US" w:bidi="fa-IR"/>
+              </w:rPr>
+              <w:t>Master</w:t>
             </w:r>
           </w:p>
         </w:tc>
@@ -9896,14 +10016,14 @@
           </w:tcPr>
           <w:p>
             <w:pPr>
-              <w:jc w:val="start"/>
+              <w:spacing w:line="276" w:lineRule="auto" w:after="80"/>
+              <w:jc w:val="left"/>
             </w:pPr>
-            <w:r/>
-            <w:r>
-              <w:rPr>
-                <w:rFonts w:ascii="Vazirmatn" w:hAnsi="Vazirmatn" w:cs="Vazirmatn"/>
-                <w:sz w:val="20"/>
-                <w:szCs w:val="20"/>
+            <w:r>
+              <w:rPr>
+                <w:rFonts w:ascii="Segoe UI" w:hAnsi="Segoe UI" w:cs="Vazirmatn"/>
+                <w:sz w:val="21"/>
+                <w:szCs w:val="21"/>
                 <w:color w:val="2D2D2D"/>
                 <w:lang w:val="en-US" w:bidi="fa-IR"/>
               </w:rPr>
@@ -9935,14 +10055,14 @@
           </w:tcPr>
           <w:p>
             <w:pPr>
-              <w:jc w:val="start"/>
+              <w:spacing w:line="276" w:lineRule="auto" w:after="80"/>
+              <w:jc w:val="left"/>
             </w:pPr>
-            <w:r/>
-            <w:r>
-              <w:rPr>
-                <w:rFonts w:ascii="Vazirmatn" w:hAnsi="Vazirmatn" w:cs="Vazirmatn"/>
-                <w:sz w:val="20"/>
-                <w:szCs w:val="20"/>
+            <w:r>
+              <w:rPr>
+                <w:rFonts w:ascii="Segoe UI" w:hAnsi="Segoe UI" w:cs="Vazirmatn"/>
+                <w:sz w:val="21"/>
+                <w:szCs w:val="21"/>
                 <w:color w:val="2D2D2D"/>
                 <w:lang w:val="en-US" w:bidi="fa-IR"/>
               </w:rPr>
@@ -9969,14 +10089,14 @@
           </w:tcPr>
           <w:p>
             <w:pPr>
-              <w:jc w:val="start"/>
+              <w:spacing w:line="276" w:lineRule="auto" w:after="80"/>
+              <w:jc w:val="left"/>
             </w:pPr>
-            <w:r/>
-            <w:r>
-              <w:rPr>
-                <w:rFonts w:ascii="Vazirmatn" w:hAnsi="Vazirmatn" w:cs="Vazirmatn"/>
-                <w:sz w:val="20"/>
-                <w:szCs w:val="20"/>
+            <w:r>
+              <w:rPr>
+                <w:rFonts w:ascii="Segoe UI" w:hAnsi="Segoe UI" w:cs="Vazirmatn"/>
+                <w:sz w:val="21"/>
+                <w:szCs w:val="21"/>
                 <w:color w:val="2D2D2D"/>
                 <w:lang w:val="en-US" w:bidi="fa-IR"/>
               </w:rPr>
@@ -10003,24 +10123,34 @@
           </w:tcPr>
           <w:p>
             <w:pPr>
-              <w:jc w:val="start"/>
+              <w:spacing w:line="276" w:lineRule="auto" w:after="80"/>
+              <w:jc w:val="left"/>
             </w:pPr>
-            <w:r/>
             <w:r>
               <w:rPr>
                 <w:rFonts w:ascii="Vazirmatn" w:hAnsi="Vazirmatn" w:cs="Vazirmatn"/>
-                <w:sz w:val="20"/>
-                <w:szCs w:val="20"/>
+                <w:sz w:val="21"/>
+                <w:szCs w:val="21"/>
                 <w:color w:val="2D2D2D"/>
                 <w:lang w:val="en-US" w:bidi="fa-IR"/>
               </w:rPr>
-              <w:t xml:space="preserve">32 </w:t>
+              <w:t>32</w:t>
             </w:r>
             <w:r>
               <w:rPr>
                 <w:rFonts w:ascii="Vazirmatn" w:hAnsi="Vazirmatn" w:cs="Vazirmatn"/>
-                <w:sz w:val="20"/>
-                <w:szCs w:val="20"/>
+                <w:sz w:val="21"/>
+                <w:szCs w:val="21"/>
+                <w:color w:val="2D2D2D"/>
+                <w:lang w:val="en-US" w:bidi="fa-IR"/>
+              </w:rPr>
+              <w:t xml:space="preserve"> </w:t>
+            </w:r>
+            <w:r>
+              <w:rPr>
+                <w:rFonts w:ascii="Segoe UI" w:hAnsi="Segoe UI" w:cs="Vazirmatn"/>
+                <w:sz w:val="21"/>
+                <w:szCs w:val="21"/>
                 <w:color w:val="2D2D2D"/>
                 <w:lang w:val="en-US" w:bidi="fa-IR"/>
               </w:rPr>
@@ -10047,24 +10177,34 @@
           </w:tcPr>
           <w:p>
             <w:pPr>
-              <w:jc w:val="start"/>
+              <w:spacing w:line="276" w:lineRule="auto" w:after="80"/>
+              <w:jc w:val="left"/>
             </w:pPr>
-            <w:r/>
             <w:r>
               <w:rPr>
                 <w:rFonts w:ascii="Vazirmatn" w:hAnsi="Vazirmatn" w:cs="Vazirmatn"/>
-                <w:sz w:val="20"/>
-                <w:szCs w:val="20"/>
+                <w:sz w:val="21"/>
+                <w:szCs w:val="21"/>
                 <w:color w:val="2D2D2D"/>
                 <w:lang w:val="en-US" w:bidi="fa-IR"/>
               </w:rPr>
-              <w:t xml:space="preserve">1.1 </w:t>
+              <w:t>1.1</w:t>
             </w:r>
             <w:r>
               <w:rPr>
                 <w:rFonts w:ascii="Vazirmatn" w:hAnsi="Vazirmatn" w:cs="Vazirmatn"/>
-                <w:sz w:val="20"/>
-                <w:szCs w:val="20"/>
+                <w:sz w:val="21"/>
+                <w:szCs w:val="21"/>
+                <w:color w:val="2D2D2D"/>
+                <w:lang w:val="en-US" w:bidi="fa-IR"/>
+              </w:rPr>
+              <w:t xml:space="preserve"> </w:t>
+            </w:r>
+            <w:r>
+              <w:rPr>
+                <w:rFonts w:ascii="Segoe UI" w:hAnsi="Segoe UI" w:cs="Vazirmatn"/>
+                <w:sz w:val="21"/>
+                <w:szCs w:val="21"/>
                 <w:color w:val="2D2D2D"/>
                 <w:lang w:val="en-US" w:bidi="fa-IR"/>
               </w:rPr>
@@ -10091,18 +10231,78 @@
           </w:tcPr>
           <w:p>
             <w:pPr>
-              <w:jc w:val="start"/>
+              <w:spacing w:line="276" w:lineRule="auto" w:after="80"/>
+              <w:jc w:val="left"/>
             </w:pPr>
-            <w:r/>
+            <w:r>
+              <w:rPr>
+                <w:rFonts w:ascii="Segoe UI" w:hAnsi="Segoe UI" w:cs="Vazirmatn"/>
+                <w:sz w:val="21"/>
+                <w:szCs w:val="21"/>
+                <w:color w:val="2D2D2D"/>
+                <w:lang w:val="en-US" w:bidi="fa-IR"/>
+              </w:rPr>
+              <w:t>In-Sync</w:t>
+            </w:r>
             <w:r>
               <w:rPr>
                 <w:rFonts w:ascii="Vazirmatn" w:hAnsi="Vazirmatn" w:cs="Vazirmatn"/>
-                <w:sz w:val="20"/>
-                <w:szCs w:val="20"/>
+                <w:sz w:val="21"/>
+                <w:szCs w:val="21"/>
                 <w:color w:val="2D2D2D"/>
                 <w:lang w:val="en-US" w:bidi="fa-IR"/>
               </w:rPr>
-              <w:t>In-Sync (Lag 0ms)</w:t>
+              <w:t xml:space="preserve"> </w:t>
+            </w:r>
+            <w:r>
+              <w:rPr>
+                <w:rFonts w:ascii="Vazirmatn" w:hAnsi="Vazirmatn" w:cs="Vazirmatn"/>
+                <w:sz w:val="21"/>
+                <w:szCs w:val="21"/>
+                <w:color w:val="2D2D2D"/>
+                <w:lang w:val="en-US" w:bidi="fa-IR"/>
+              </w:rPr>
+              <w:t>(</w:t>
+            </w:r>
+            <w:r>
+              <w:rPr>
+                <w:rFonts w:ascii="Segoe UI" w:hAnsi="Segoe UI" w:cs="Vazirmatn"/>
+                <w:sz w:val="21"/>
+                <w:szCs w:val="21"/>
+                <w:color w:val="2D2D2D"/>
+                <w:lang w:val="en-US" w:bidi="fa-IR"/>
+              </w:rPr>
+              <w:t>Lag</w:t>
+            </w:r>
+            <w:r>
+              <w:rPr>
+                <w:rFonts w:ascii="Vazirmatn" w:hAnsi="Vazirmatn" w:cs="Vazirmatn"/>
+                <w:sz w:val="21"/>
+                <w:szCs w:val="21"/>
+                <w:color w:val="2D2D2D"/>
+                <w:lang w:val="en-US" w:bidi="fa-IR"/>
+              </w:rPr>
+              <w:t xml:space="preserve"> </w:t>
+            </w:r>
+            <w:r>
+              <w:rPr>
+                <w:rFonts w:ascii="Segoe UI" w:hAnsi="Segoe UI" w:cs="Vazirmatn"/>
+                <w:sz w:val="21"/>
+                <w:szCs w:val="21"/>
+                <w:color w:val="2D2D2D"/>
+                <w:lang w:val="en-US" w:bidi="fa-IR"/>
+              </w:rPr>
+              <w:t>0ms</w:t>
+            </w:r>
+            <w:r>
+              <w:rPr>
+                <w:rFonts w:ascii="Vazirmatn" w:hAnsi="Vazirmatn" w:cs="Vazirmatn"/>
+                <w:sz w:val="21"/>
+                <w:szCs w:val="21"/>
+                <w:color w:val="2D2D2D"/>
+                <w:lang w:val="en-US" w:bidi="fa-IR"/>
+              </w:rPr>
+              <w:t>)</w:t>
             </w:r>
           </w:p>
         </w:tc>
@@ -10125,14 +10325,14 @@
           </w:tcPr>
           <w:p>
             <w:pPr>
-              <w:jc w:val="start"/>
+              <w:spacing w:line="276" w:lineRule="auto" w:after="80"/>
+              <w:jc w:val="left"/>
             </w:pPr>
-            <w:r/>
-            <w:r>
-              <w:rPr>
-                <w:rFonts w:ascii="Vazirmatn" w:hAnsi="Vazirmatn" w:cs="Vazirmatn"/>
-                <w:sz w:val="20"/>
-                <w:szCs w:val="20"/>
+            <w:r>
+              <w:rPr>
+                <w:rFonts w:ascii="Segoe UI" w:hAnsi="Segoe UI" w:cs="Vazirmatn"/>
+                <w:sz w:val="21"/>
+                <w:szCs w:val="21"/>
                 <w:color w:val="2D2D2D"/>
                 <w:lang w:val="en-US" w:bidi="fa-IR"/>
               </w:rPr>
@@ -10164,14 +10364,14 @@
           </w:tcPr>
           <w:p>
             <w:pPr>
-              <w:jc w:val="start"/>
+              <w:spacing w:line="276" w:lineRule="auto" w:after="80"/>
+              <w:jc w:val="left"/>
             </w:pPr>
-            <w:r/>
-            <w:r>
-              <w:rPr>
-                <w:rFonts w:ascii="Vazirmatn" w:hAnsi="Vazirmatn" w:cs="Vazirmatn"/>
-                <w:sz w:val="20"/>
-                <w:szCs w:val="20"/>
+            <w:r>
+              <w:rPr>
+                <w:rFonts w:ascii="Segoe UI" w:hAnsi="Segoe UI" w:cs="Vazirmatn"/>
+                <w:sz w:val="21"/>
+                <w:szCs w:val="21"/>
                 <w:color w:val="2D2D2D"/>
                 <w:lang w:val="en-US" w:bidi="fa-IR"/>
               </w:rPr>
@@ -10198,14 +10398,14 @@
           </w:tcPr>
           <w:p>
             <w:pPr>
-              <w:jc w:val="start"/>
+              <w:spacing w:line="276" w:lineRule="auto" w:after="80"/>
+              <w:jc w:val="left"/>
             </w:pPr>
-            <w:r/>
-            <w:r>
-              <w:rPr>
-                <w:rFonts w:ascii="Vazirmatn" w:hAnsi="Vazirmatn" w:cs="Vazirmatn"/>
-                <w:sz w:val="20"/>
-                <w:szCs w:val="20"/>
+            <w:r>
+              <w:rPr>
+                <w:rFonts w:ascii="Segoe UI" w:hAnsi="Segoe UI" w:cs="Vazirmatn"/>
+                <w:sz w:val="21"/>
+                <w:szCs w:val="21"/>
                 <w:color w:val="2D2D2D"/>
                 <w:lang w:val="en-US" w:bidi="fa-IR"/>
               </w:rPr>
@@ -10232,24 +10432,34 @@
           </w:tcPr>
           <w:p>
             <w:pPr>
-              <w:jc w:val="start"/>
+              <w:spacing w:line="276" w:lineRule="auto" w:after="80"/>
+              <w:jc w:val="left"/>
             </w:pPr>
-            <w:r/>
             <w:r>
               <w:rPr>
                 <w:rFonts w:ascii="Vazirmatn" w:hAnsi="Vazirmatn" w:cs="Vazirmatn"/>
-                <w:sz w:val="20"/>
-                <w:szCs w:val="20"/>
+                <w:sz w:val="21"/>
+                <w:szCs w:val="21"/>
                 <w:color w:val="2D2D2D"/>
                 <w:lang w:val="en-US" w:bidi="fa-IR"/>
               </w:rPr>
-              <w:t xml:space="preserve">32 </w:t>
+              <w:t>32</w:t>
             </w:r>
             <w:r>
               <w:rPr>
                 <w:rFonts w:ascii="Vazirmatn" w:hAnsi="Vazirmatn" w:cs="Vazirmatn"/>
-                <w:sz w:val="20"/>
-                <w:szCs w:val="20"/>
+                <w:sz w:val="21"/>
+                <w:szCs w:val="21"/>
+                <w:color w:val="2D2D2D"/>
+                <w:lang w:val="en-US" w:bidi="fa-IR"/>
+              </w:rPr>
+              <w:t xml:space="preserve"> </w:t>
+            </w:r>
+            <w:r>
+              <w:rPr>
+                <w:rFonts w:ascii="Segoe UI" w:hAnsi="Segoe UI" w:cs="Vazirmatn"/>
+                <w:sz w:val="21"/>
+                <w:szCs w:val="21"/>
                 <w:color w:val="2D2D2D"/>
                 <w:lang w:val="en-US" w:bidi="fa-IR"/>
               </w:rPr>
@@ -10276,24 +10486,34 @@
           </w:tcPr>
           <w:p>
             <w:pPr>
-              <w:jc w:val="start"/>
+              <w:spacing w:line="276" w:lineRule="auto" w:after="80"/>
+              <w:jc w:val="left"/>
             </w:pPr>
-            <w:r/>
             <w:r>
               <w:rPr>
                 <w:rFonts w:ascii="Vazirmatn" w:hAnsi="Vazirmatn" w:cs="Vazirmatn"/>
-                <w:sz w:val="20"/>
-                <w:szCs w:val="20"/>
+                <w:sz w:val="21"/>
+                <w:szCs w:val="21"/>
                 <w:color w:val="2D2D2D"/>
                 <w:lang w:val="en-US" w:bidi="fa-IR"/>
               </w:rPr>
-              <w:t xml:space="preserve">1.2 </w:t>
+              <w:t>1.2</w:t>
             </w:r>
             <w:r>
               <w:rPr>
                 <w:rFonts w:ascii="Vazirmatn" w:hAnsi="Vazirmatn" w:cs="Vazirmatn"/>
-                <w:sz w:val="20"/>
-                <w:szCs w:val="20"/>
+                <w:sz w:val="21"/>
+                <w:szCs w:val="21"/>
+                <w:color w:val="2D2D2D"/>
+                <w:lang w:val="en-US" w:bidi="fa-IR"/>
+              </w:rPr>
+              <w:t xml:space="preserve"> </w:t>
+            </w:r>
+            <w:r>
+              <w:rPr>
+                <w:rFonts w:ascii="Segoe UI" w:hAnsi="Segoe UI" w:cs="Vazirmatn"/>
+                <w:sz w:val="21"/>
+                <w:szCs w:val="21"/>
                 <w:color w:val="2D2D2D"/>
                 <w:lang w:val="en-US" w:bidi="fa-IR"/>
               </w:rPr>
@@ -10320,18 +10540,78 @@
           </w:tcPr>
           <w:p>
             <w:pPr>
-              <w:jc w:val="start"/>
+              <w:spacing w:line="276" w:lineRule="auto" w:after="80"/>
+              <w:jc w:val="left"/>
             </w:pPr>
-            <w:r/>
+            <w:r>
+              <w:rPr>
+                <w:rFonts w:ascii="Segoe UI" w:hAnsi="Segoe UI" w:cs="Vazirmatn"/>
+                <w:sz w:val="21"/>
+                <w:szCs w:val="21"/>
+                <w:color w:val="2D2D2D"/>
+                <w:lang w:val="en-US" w:bidi="fa-IR"/>
+              </w:rPr>
+              <w:t>In-Sync</w:t>
+            </w:r>
             <w:r>
               <w:rPr>
                 <w:rFonts w:ascii="Vazirmatn" w:hAnsi="Vazirmatn" w:cs="Vazirmatn"/>
-                <w:sz w:val="20"/>
-                <w:szCs w:val="20"/>
+                <w:sz w:val="21"/>
+                <w:szCs w:val="21"/>
                 <w:color w:val="2D2D2D"/>
                 <w:lang w:val="en-US" w:bidi="fa-IR"/>
               </w:rPr>
-              <w:t>In-Sync (Lag 1ms)</w:t>
+              <w:t xml:space="preserve"> </w:t>
+            </w:r>
+            <w:r>
+              <w:rPr>
+                <w:rFonts w:ascii="Vazirmatn" w:hAnsi="Vazirmatn" w:cs="Vazirmatn"/>
+                <w:sz w:val="21"/>
+                <w:szCs w:val="21"/>
+                <w:color w:val="2D2D2D"/>
+                <w:lang w:val="en-US" w:bidi="fa-IR"/>
+              </w:rPr>
+              <w:t>(</w:t>
+            </w:r>
+            <w:r>
+              <w:rPr>
+                <w:rFonts w:ascii="Segoe UI" w:hAnsi="Segoe UI" w:cs="Vazirmatn"/>
+                <w:sz w:val="21"/>
+                <w:szCs w:val="21"/>
+                <w:color w:val="2D2D2D"/>
+                <w:lang w:val="en-US" w:bidi="fa-IR"/>
+              </w:rPr>
+              <w:t>Lag</w:t>
+            </w:r>
+            <w:r>
+              <w:rPr>
+                <w:rFonts w:ascii="Vazirmatn" w:hAnsi="Vazirmatn" w:cs="Vazirmatn"/>
+                <w:sz w:val="21"/>
+                <w:szCs w:val="21"/>
+                <w:color w:val="2D2D2D"/>
+                <w:lang w:val="en-US" w:bidi="fa-IR"/>
+              </w:rPr>
+              <w:t xml:space="preserve"> </w:t>
+            </w:r>
+            <w:r>
+              <w:rPr>
+                <w:rFonts w:ascii="Segoe UI" w:hAnsi="Segoe UI" w:cs="Vazirmatn"/>
+                <w:sz w:val="21"/>
+                <w:szCs w:val="21"/>
+                <w:color w:val="2D2D2D"/>
+                <w:lang w:val="en-US" w:bidi="fa-IR"/>
+              </w:rPr>
+              <w:t>1ms</w:t>
+            </w:r>
+            <w:r>
+              <w:rPr>
+                <w:rFonts w:ascii="Vazirmatn" w:hAnsi="Vazirmatn" w:cs="Vazirmatn"/>
+                <w:sz w:val="21"/>
+                <w:szCs w:val="21"/>
+                <w:color w:val="2D2D2D"/>
+                <w:lang w:val="en-US" w:bidi="fa-IR"/>
+              </w:rPr>
+              <w:t>)</w:t>
             </w:r>
           </w:p>
         </w:tc>
@@ -10354,14 +10634,14 @@
           </w:tcPr>
           <w:p>
             <w:pPr>
-              <w:jc w:val="start"/>
+              <w:spacing w:line="276" w:lineRule="auto" w:after="80"/>
+              <w:jc w:val="left"/>
             </w:pPr>
-            <w:r/>
-            <w:r>
-              <w:rPr>
-                <w:rFonts w:ascii="Vazirmatn" w:hAnsi="Vazirmatn" w:cs="Vazirmatn"/>
-                <w:sz w:val="20"/>
-                <w:szCs w:val="20"/>
+            <w:r>
+              <w:rPr>
+                <w:rFonts w:ascii="Segoe UI" w:hAnsi="Segoe UI" w:cs="Vazirmatn"/>
+                <w:sz w:val="21"/>
+                <w:szCs w:val="21"/>
                 <w:color w:val="2D2D2D"/>
                 <w:lang w:val="en-US" w:bidi="fa-IR"/>
               </w:rPr>
@@ -10393,14 +10673,14 @@
           </w:tcPr>
           <w:p>
             <w:pPr>
-              <w:jc w:val="start"/>
+              <w:spacing w:line="276" w:lineRule="auto" w:after="80"/>
+              <w:jc w:val="left"/>
             </w:pPr>
-            <w:r/>
-            <w:r>
-              <w:rPr>
-                <w:rFonts w:ascii="Vazirmatn" w:hAnsi="Vazirmatn" w:cs="Vazirmatn"/>
-                <w:sz w:val="20"/>
-                <w:szCs w:val="20"/>
+            <w:r>
+              <w:rPr>
+                <w:rFonts w:ascii="Segoe UI" w:hAnsi="Segoe UI" w:cs="Vazirmatn"/>
+                <w:sz w:val="21"/>
+                <w:szCs w:val="21"/>
                 <w:color w:val="2D2D2D"/>
                 <w:lang w:val="en-US" w:bidi="fa-IR"/>
               </w:rPr>
@@ -10427,14 +10707,14 @@
           </w:tcPr>
           <w:p>
             <w:pPr>
-              <w:jc w:val="start"/>
+              <w:spacing w:line="276" w:lineRule="auto" w:after="80"/>
+              <w:jc w:val="left"/>
             </w:pPr>
-            <w:r/>
-            <w:r>
-              <w:rPr>
-                <w:rFonts w:ascii="Vazirmatn" w:hAnsi="Vazirmatn" w:cs="Vazirmatn"/>
-                <w:sz w:val="20"/>
-                <w:szCs w:val="20"/>
+            <w:r>
+              <w:rPr>
+                <w:rFonts w:ascii="Segoe UI" w:hAnsi="Segoe UI" w:cs="Vazirmatn"/>
+                <w:sz w:val="21"/>
+                <w:szCs w:val="21"/>
                 <w:color w:val="2D2D2D"/>
                 <w:lang w:val="en-US" w:bidi="fa-IR"/>
               </w:rPr>
@@ -10461,24 +10741,34 @@
           </w:tcPr>
           <w:p>
             <w:pPr>
-              <w:jc w:val="start"/>
+              <w:spacing w:line="276" w:lineRule="auto" w:after="80"/>
+              <w:jc w:val="left"/>
             </w:pPr>
-            <w:r/>
             <w:r>
               <w:rPr>
                 <w:rFonts w:ascii="Vazirmatn" w:hAnsi="Vazirmatn" w:cs="Vazirmatn"/>
-                <w:sz w:val="20"/>
-                <w:szCs w:val="20"/>
+                <w:sz w:val="21"/>
+                <w:szCs w:val="21"/>
                 <w:color w:val="2D2D2D"/>
                 <w:lang w:val="en-US" w:bidi="fa-IR"/>
               </w:rPr>
-              <w:t xml:space="preserve">512 </w:t>
+              <w:t>512</w:t>
             </w:r>
             <w:r>
               <w:rPr>
                 <w:rFonts w:ascii="Vazirmatn" w:hAnsi="Vazirmatn" w:cs="Vazirmatn"/>
-                <w:sz w:val="20"/>
-                <w:szCs w:val="20"/>
+                <w:sz w:val="21"/>
+                <w:szCs w:val="21"/>
+                <w:color w:val="2D2D2D"/>
+                <w:lang w:val="en-US" w:bidi="fa-IR"/>
+              </w:rPr>
+              <w:t xml:space="preserve"> </w:t>
+            </w:r>
+            <w:r>
+              <w:rPr>
+                <w:rFonts w:ascii="Segoe UI" w:hAnsi="Segoe UI" w:cs="Vazirmatn"/>
+                <w:sz w:val="21"/>
+                <w:szCs w:val="21"/>
                 <w:color w:val="2D2D2D"/>
                 <w:lang w:val="en-US" w:bidi="fa-IR"/>
               </w:rPr>
@@ -10505,24 +10795,34 @@
           </w:tcPr>
           <w:p>
             <w:pPr>
-              <w:jc w:val="start"/>
+              <w:spacing w:line="276" w:lineRule="auto" w:after="80"/>
+              <w:jc w:val="left"/>
             </w:pPr>
-            <w:r/>
             <w:r>
               <w:rPr>
                 <w:rFonts w:ascii="Vazirmatn" w:hAnsi="Vazirmatn" w:cs="Vazirmatn"/>
-                <w:sz w:val="20"/>
-                <w:szCs w:val="20"/>
+                <w:sz w:val="21"/>
+                <w:szCs w:val="21"/>
                 <w:color w:val="2D2D2D"/>
                 <w:lang w:val="en-US" w:bidi="fa-IR"/>
               </w:rPr>
-              <w:t xml:space="preserve">0.2 </w:t>
+              <w:t>0.2</w:t>
             </w:r>
             <w:r>
               <w:rPr>
                 <w:rFonts w:ascii="Vazirmatn" w:hAnsi="Vazirmatn" w:cs="Vazirmatn"/>
-                <w:sz w:val="20"/>
-                <w:szCs w:val="20"/>
+                <w:sz w:val="21"/>
+                <w:szCs w:val="21"/>
+                <w:color w:val="2D2D2D"/>
+                <w:lang w:val="en-US" w:bidi="fa-IR"/>
+              </w:rPr>
+              <w:t xml:space="preserve"> </w:t>
+            </w:r>
+            <w:r>
+              <w:rPr>
+                <w:rFonts w:ascii="Segoe UI" w:hAnsi="Segoe UI" w:cs="Vazirmatn"/>
+                <w:sz w:val="21"/>
+                <w:szCs w:val="21"/>
                 <w:color w:val="2D2D2D"/>
                 <w:lang w:val="en-US" w:bidi="fa-IR"/>
               </w:rPr>
@@ -10549,18 +10849,38 @@
           </w:tcPr>
           <w:p>
             <w:pPr>
-              <w:jc w:val="start"/>
+              <w:spacing w:line="276" w:lineRule="auto" w:after="80"/>
+              <w:jc w:val="left"/>
             </w:pPr>
-            <w:r/>
+            <w:r>
+              <w:rPr>
+                <w:rFonts w:ascii="Segoe UI" w:hAnsi="Segoe UI" w:cs="Vazirmatn"/>
+                <w:sz w:val="21"/>
+                <w:szCs w:val="21"/>
+                <w:color w:val="2D2D2D"/>
+                <w:lang w:val="en-US" w:bidi="fa-IR"/>
+              </w:rPr>
+              <w:t>Quorum</w:t>
+            </w:r>
             <w:r>
               <w:rPr>
                 <w:rFonts w:ascii="Vazirmatn" w:hAnsi="Vazirmatn" w:cs="Vazirmatn"/>
-                <w:sz w:val="20"/>
-                <w:szCs w:val="20"/>
+                <w:sz w:val="21"/>
+                <w:szCs w:val="21"/>
                 <w:color w:val="2D2D2D"/>
                 <w:lang w:val="en-US" w:bidi="fa-IR"/>
               </w:rPr>
-              <w:t>Quorum Active</w:t>
+              <w:t xml:space="preserve"> </w:t>
+            </w:r>
+            <w:r>
+              <w:rPr>
+                <w:rFonts w:ascii="Segoe UI" w:hAnsi="Segoe UI" w:cs="Vazirmatn"/>
+                <w:sz w:val="21"/>
+                <w:szCs w:val="21"/>
+                <w:color w:val="2D2D2D"/>
+                <w:lang w:val="en-US" w:bidi="fa-IR"/>
+              </w:rPr>
+              <w:t>Active</w:t>
             </w:r>
           </w:p>
         </w:tc>
@@ -10583,14 +10903,14 @@
           </w:tcPr>
           <w:p>
             <w:pPr>
-              <w:jc w:val="start"/>
+              <w:spacing w:line="276" w:lineRule="auto" w:after="80"/>
+              <w:jc w:val="left"/>
             </w:pPr>
-            <w:r/>
-            <w:r>
-              <w:rPr>
-                <w:rFonts w:ascii="Vazirmatn" w:hAnsi="Vazirmatn" w:cs="Vazirmatn"/>
-                <w:sz w:val="20"/>
-                <w:szCs w:val="20"/>
+            <w:r>
+              <w:rPr>
+                <w:rFonts w:ascii="Segoe UI" w:hAnsi="Segoe UI" w:cs="Vazirmatn"/>
+                <w:sz w:val="21"/>
+                <w:szCs w:val="21"/>
                 <w:color w:val="2D2D2D"/>
                 <w:lang w:val="en-US" w:bidi="fa-IR"/>
               </w:rPr>
@@ -10701,7 +11021,7 @@
       </w:pPr>
       <w:r>
         <w:rPr>
-          <w:rFonts w:ascii="Vazirmatn" w:hAnsi="Vazirmatn" w:cs="Vazirmatn"/>
+          <w:rFonts w:ascii="Segoe UI" w:hAnsi="Segoe UI" w:cs="Vazirmatn"/>
           <w:sz w:val="22"/>
           <w:szCs w:val="22"/>
           <w:color w:val="2D2D2D"/>
@@ -10721,7 +11041,7 @@
       </w:r>
       <w:r>
         <w:rPr>
-          <w:rFonts w:ascii="Vazirmatn" w:hAnsi="Vazirmatn" w:cs="Vazirmatn"/>
+          <w:rFonts w:ascii="Segoe UI" w:hAnsi="Segoe UI" w:cs="Vazirmatn"/>
           <w:sz w:val="22"/>
           <w:szCs w:val="22"/>
           <w:color w:val="2D2D2D"/>
@@ -10741,7 +11061,7 @@
       </w:r>
       <w:r>
         <w:rPr>
-          <w:rFonts w:ascii="Vazirmatn" w:hAnsi="Vazirmatn" w:cs="Vazirmatn"/>
+          <w:rFonts w:ascii="Segoe UI" w:hAnsi="Segoe UI" w:cs="Vazirmatn"/>
           <w:sz w:val="22"/>
           <w:szCs w:val="22"/>
           <w:color w:val="2D2D2D"/>
@@ -10761,7 +11081,7 @@
       </w:r>
       <w:r>
         <w:rPr>
-          <w:rFonts w:ascii="Vazirmatn" w:hAnsi="Vazirmatn" w:cs="Vazirmatn"/>
+          <w:rFonts w:ascii="Segoe UI" w:hAnsi="Segoe UI" w:cs="Vazirmatn"/>
           <w:sz w:val="22"/>
           <w:szCs w:val="22"/>
           <w:color w:val="2D2D2D"/>
@@ -10781,7 +11101,7 @@
       </w:r>
       <w:r>
         <w:rPr>
-          <w:rFonts w:ascii="Vazirmatn" w:hAnsi="Vazirmatn" w:cs="Vazirmatn"/>
+          <w:rFonts w:ascii="Segoe UI" w:hAnsi="Segoe UI" w:cs="Vazirmatn"/>
           <w:sz w:val="22"/>
           <w:szCs w:val="22"/>
           <w:color w:val="2D2D2D"/>
@@ -10801,7 +11121,7 @@
       </w:r>
       <w:r>
         <w:rPr>
-          <w:rFonts w:ascii="Vazirmatn" w:hAnsi="Vazirmatn" w:cs="Vazirmatn"/>
+          <w:rFonts w:ascii="Segoe UI" w:hAnsi="Segoe UI" w:cs="Vazirmatn"/>
           <w:sz w:val="22"/>
           <w:szCs w:val="22"/>
           <w:color w:val="2D2D2D"/>
@@ -10821,7 +11141,7 @@
       </w:r>
       <w:r>
         <w:rPr>
-          <w:rFonts w:ascii="Vazirmatn" w:hAnsi="Vazirmatn" w:cs="Vazirmatn"/>
+          <w:rFonts w:ascii="Segoe UI" w:hAnsi="Segoe UI" w:cs="Vazirmatn"/>
           <w:sz w:val="22"/>
           <w:szCs w:val="22"/>
           <w:color w:val="2D2D2D"/>
@@ -10841,7 +11161,7 @@
       </w:r>
       <w:r>
         <w:rPr>
-          <w:rFonts w:ascii="Vazirmatn" w:hAnsi="Vazirmatn" w:cs="Vazirmatn"/>
+          <w:rFonts w:ascii="Segoe UI" w:hAnsi="Segoe UI" w:cs="Vazirmatn"/>
           <w:sz w:val="22"/>
           <w:szCs w:val="22"/>
           <w:color w:val="2D2D2D"/>
@@ -10861,7 +11181,7 @@
       </w:r>
       <w:r>
         <w:rPr>
-          <w:rFonts w:ascii="Vazirmatn" w:hAnsi="Vazirmatn" w:cs="Vazirmatn"/>
+          <w:rFonts w:ascii="Segoe UI" w:hAnsi="Segoe UI" w:cs="Vazirmatn"/>
           <w:sz w:val="22"/>
           <w:szCs w:val="22"/>
           <w:color w:val="2D2D2D"/>
@@ -10881,7 +11201,7 @@
       </w:r>
       <w:r>
         <w:rPr>
-          <w:rFonts w:ascii="Vazirmatn" w:hAnsi="Vazirmatn" w:cs="Vazirmatn"/>
+          <w:rFonts w:ascii="Segoe UI" w:hAnsi="Segoe UI" w:cs="Vazirmatn"/>
           <w:sz w:val="22"/>
           <w:szCs w:val="22"/>
           <w:color w:val="2D2D2D"/>
@@ -10901,7 +11221,7 @@
       </w:r>
       <w:r>
         <w:rPr>
-          <w:rFonts w:ascii="Vazirmatn" w:hAnsi="Vazirmatn" w:cs="Vazirmatn"/>
+          <w:rFonts w:ascii="Segoe UI" w:hAnsi="Segoe UI" w:cs="Vazirmatn"/>
           <w:sz w:val="22"/>
           <w:szCs w:val="22"/>
           <w:color w:val="2D2D2D"/>
@@ -10921,7 +11241,7 @@
       </w:r>
       <w:r>
         <w:rPr>
-          <w:rFonts w:ascii="Vazirmatn" w:hAnsi="Vazirmatn" w:cs="Vazirmatn"/>
+          <w:rFonts w:ascii="Segoe UI" w:hAnsi="Segoe UI" w:cs="Vazirmatn"/>
           <w:sz w:val="22"/>
           <w:szCs w:val="22"/>
           <w:color w:val="2D2D2D"/>
@@ -10941,7 +11261,7 @@
       </w:r>
       <w:r>
         <w:rPr>
-          <w:rFonts w:ascii="Vazirmatn" w:hAnsi="Vazirmatn" w:cs="Vazirmatn"/>
+          <w:rFonts w:ascii="Segoe UI" w:hAnsi="Segoe UI" w:cs="Vazirmatn"/>
           <w:sz w:val="22"/>
           <w:szCs w:val="22"/>
           <w:color w:val="2D2D2D"/>
@@ -10961,7 +11281,7 @@
       </w:r>
       <w:r>
         <w:rPr>
-          <w:rFonts w:ascii="Vazirmatn" w:hAnsi="Vazirmatn" w:cs="Vazirmatn"/>
+          <w:rFonts w:ascii="Segoe UI" w:hAnsi="Segoe UI" w:cs="Vazirmatn"/>
           <w:sz w:val="22"/>
           <w:szCs w:val="22"/>
           <w:color w:val="2D2D2D"/>
@@ -10991,7 +11311,7 @@
       </w:r>
       <w:r>
         <w:rPr>
-          <w:rFonts w:ascii="Vazirmatn" w:hAnsi="Vazirmatn" w:cs="Vazirmatn"/>
+          <w:rFonts w:ascii="Segoe UI" w:hAnsi="Segoe UI" w:cs="Vazirmatn"/>
           <w:sz w:val="22"/>
           <w:szCs w:val="22"/>
           <w:color w:val="2D2D2D"/>
@@ -11011,7 +11331,7 @@
       </w:r>
       <w:r>
         <w:rPr>
-          <w:rFonts w:ascii="Vazirmatn" w:hAnsi="Vazirmatn" w:cs="Vazirmatn"/>
+          <w:rFonts w:ascii="Segoe UI" w:hAnsi="Segoe UI" w:cs="Vazirmatn"/>
           <w:sz w:val="22"/>
           <w:szCs w:val="22"/>
           <w:color w:val="2D2D2D"/>
@@ -11031,7 +11351,7 @@
       </w:r>
       <w:r>
         <w:rPr>
-          <w:rFonts w:ascii="Vazirmatn" w:hAnsi="Vazirmatn" w:cs="Vazirmatn"/>
+          <w:rFonts w:ascii="Segoe UI" w:hAnsi="Segoe UI" w:cs="Vazirmatn"/>
           <w:sz w:val="22"/>
           <w:szCs w:val="22"/>
           <w:color w:val="2D2D2D"/>
@@ -11061,7 +11381,7 @@
       </w:r>
       <w:r>
         <w:rPr>
-          <w:rFonts w:ascii="Vazirmatn" w:hAnsi="Vazirmatn" w:cs="Vazirmatn"/>
+          <w:rFonts w:ascii="Segoe UI" w:hAnsi="Segoe UI" w:cs="Vazirmatn"/>
           <w:sz w:val="22"/>
           <w:szCs w:val="22"/>
           <w:color w:val="2D2D2D"/>
@@ -11101,7 +11421,7 @@
       </w:r>
       <w:r>
         <w:rPr>
-          <w:rFonts w:ascii="Vazirmatn" w:hAnsi="Vazirmatn" w:cs="Vazirmatn"/>
+          <w:rFonts w:ascii="Segoe UI" w:hAnsi="Segoe UI" w:cs="Vazirmatn"/>
           <w:sz w:val="22"/>
           <w:szCs w:val="22"/>
           <w:color w:val="2D2D2D"/>
@@ -11121,7 +11441,7 @@
       </w:r>
       <w:r>
         <w:rPr>
-          <w:rFonts w:ascii="Vazirmatn" w:hAnsi="Vazirmatn" w:cs="Vazirmatn"/>
+          <w:rFonts w:ascii="Segoe UI" w:hAnsi="Segoe UI" w:cs="Vazirmatn"/>
           <w:sz w:val="22"/>
           <w:szCs w:val="22"/>
           <w:color w:val="2D2D2D"/>
@@ -11141,7 +11461,7 @@
       </w:r>
       <w:r>
         <w:rPr>
-          <w:rFonts w:ascii="Vazirmatn" w:hAnsi="Vazirmatn" w:cs="Vazirmatn"/>
+          <w:rFonts w:ascii="Segoe UI" w:hAnsi="Segoe UI" w:cs="Vazirmatn"/>
           <w:sz w:val="22"/>
           <w:szCs w:val="22"/>
           <w:color w:val="2D2D2D"/>
@@ -11171,7 +11491,7 @@
       </w:r>
       <w:r>
         <w:rPr>
-          <w:rFonts w:ascii="Vazirmatn" w:hAnsi="Vazirmatn" w:cs="Vazirmatn"/>
+          <w:rFonts w:ascii="Segoe UI" w:hAnsi="Segoe UI" w:cs="Vazirmatn"/>
           <w:sz w:val="22"/>
           <w:szCs w:val="22"/>
           <w:color w:val="2D2D2D"/>
@@ -11191,7 +11511,7 @@
       </w:r>
       <w:r>
         <w:rPr>
-          <w:rFonts w:ascii="Vazirmatn" w:hAnsi="Vazirmatn" w:cs="Vazirmatn"/>
+          <w:rFonts w:ascii="Segoe UI" w:hAnsi="Segoe UI" w:cs="Vazirmatn"/>
           <w:sz w:val="22"/>
           <w:szCs w:val="22"/>
           <w:color w:val="2D2D2D"/>
@@ -11211,7 +11531,7 @@
       </w:r>
       <w:r>
         <w:rPr>
-          <w:rFonts w:ascii="Vazirmatn" w:hAnsi="Vazirmatn" w:cs="Vazirmatn"/>
+          <w:rFonts w:ascii="Segoe UI" w:hAnsi="Segoe UI" w:cs="Vazirmatn"/>
           <w:sz w:val="22"/>
           <w:szCs w:val="22"/>
           <w:color w:val="2D2D2D"/>
@@ -11241,7 +11561,7 @@
       </w:r>
       <w:r>
         <w:rPr>
-          <w:rFonts w:ascii="Vazirmatn" w:hAnsi="Vazirmatn" w:cs="Vazirmatn"/>
+          <w:rFonts w:ascii="Segoe UI" w:hAnsi="Segoe UI" w:cs="Vazirmatn"/>
           <w:sz w:val="22"/>
           <w:szCs w:val="22"/>
           <w:color w:val="2D2D2D"/>
@@ -11281,7 +11601,7 @@
       </w:r>
       <w:r>
         <w:rPr>
-          <w:rFonts w:ascii="Vazirmatn" w:hAnsi="Vazirmatn" w:cs="Vazirmatn"/>
+          <w:rFonts w:ascii="Segoe UI" w:hAnsi="Segoe UI" w:cs="Vazirmatn"/>
           <w:sz w:val="22"/>
           <w:szCs w:val="22"/>
           <w:color w:val="2D2D2D"/>

</xml_diff>

<commit_message>
fix: ship packaged theme, Latin fonts, and mermaid launch retries
Ship purple_book inside the Python package so pip-installed md2docx can load the theme without a checkout. Prefer a repo templates/ directory over the packaged copy, and fail tests if the two trees drift.

Split Latin runs onto fonts.latin (Segoe UI) while keeping Vazirmatn for complex script. Match mermaid-cli headless mode to the chosen Chrome binary and retry the next browser on launch failures. Cover wheel assets, inline/nested AST cases, and regenerated fixtures.
</commit_message>
<xml_diff>
--- a/examples/english_technical_doc.docx
+++ b/examples/english_technical_doc.docx
@@ -70,7 +70,7 @@
             </w:pPr>
             <w:r>
               <w:rPr>
-                <w:rFonts w:ascii="Vazirmatn" w:hAnsi="Vazirmatn" w:cs="Vazirmatn"/>
+                <w:rFonts w:ascii="Segoe UI" w:hAnsi="Segoe UI" w:cs="Vazirmatn"/>
                 <w:sz w:val="32"/>
                 <w:szCs w:val="32"/>
                 <w:b/>
@@ -554,7 +554,7 @@
             </w:pPr>
             <w:r>
               <w:rPr>
-                <w:rFonts w:ascii="Vazirmatn" w:hAnsi="Vazirmatn" w:cs="Vazirmatn"/>
+                <w:rFonts w:ascii="Segoe UI" w:hAnsi="Segoe UI" w:cs="Vazirmatn"/>
                 <w:sz w:val="28"/>
                 <w:szCs w:val="28"/>
                 <w:b/>
@@ -1035,7 +1035,7 @@
             </w:r>
             <w:r>
               <w:rPr>
-                <w:rFonts w:ascii="Vazirmatn" w:hAnsi="Vazirmatn" w:cs="Vazirmatn"/>
+                <w:rFonts w:ascii="Segoe UI" w:hAnsi="Segoe UI" w:cs="Vazirmatn"/>
                 <w:sz w:val="22"/>
                 <w:szCs w:val="22"/>
                 <w:b/>
@@ -1574,7 +1574,7 @@
             </w:pPr>
             <w:r>
               <w:rPr>
-                <w:rFonts w:ascii="Vazirmatn" w:hAnsi="Vazirmatn" w:cs="Vazirmatn"/>
+                <w:rFonts w:ascii="Segoe UI" w:hAnsi="Segoe UI" w:cs="Vazirmatn"/>
                 <w:sz w:val="22"/>
                 <w:szCs w:val="22"/>
                 <w:b/>
@@ -2017,7 +2017,7 @@
       </w:pPr>
       <w:r>
         <w:rPr>
-          <w:rFonts w:ascii="Vazirmatn" w:hAnsi="Vazirmatn" w:cs="Vazirmatn"/>
+          <w:rFonts w:ascii="Segoe UI" w:hAnsi="Segoe UI" w:cs="Vazirmatn"/>
           <w:sz w:val="19"/>
           <w:szCs w:val="19"/>
           <w:color w:val="5A5A5A"/>
@@ -2037,7 +2037,7 @@
       </w:r>
       <w:r>
         <w:rPr>
-          <w:rFonts w:ascii="Vazirmatn" w:hAnsi="Vazirmatn" w:cs="Vazirmatn"/>
+          <w:rFonts w:ascii="Segoe UI" w:hAnsi="Segoe UI" w:cs="Vazirmatn"/>
           <w:sz w:val="19"/>
           <w:szCs w:val="19"/>
           <w:color w:val="5A5A5A"/>
@@ -2057,7 +2057,7 @@
       </w:r>
       <w:r>
         <w:rPr>
-          <w:rFonts w:ascii="Vazirmatn" w:hAnsi="Vazirmatn" w:cs="Vazirmatn"/>
+          <w:rFonts w:ascii="Segoe UI" w:hAnsi="Segoe UI" w:cs="Vazirmatn"/>
           <w:sz w:val="19"/>
           <w:szCs w:val="19"/>
           <w:color w:val="5A5A5A"/>
@@ -2077,7 +2077,7 @@
       </w:r>
       <w:r>
         <w:rPr>
-          <w:rFonts w:ascii="Vazirmatn" w:hAnsi="Vazirmatn" w:cs="Vazirmatn"/>
+          <w:rFonts w:ascii="Segoe UI" w:hAnsi="Segoe UI" w:cs="Vazirmatn"/>
           <w:sz w:val="19"/>
           <w:szCs w:val="19"/>
           <w:color w:val="5A5A5A"/>
@@ -4129,7 +4129,7 @@
             </w:pPr>
             <w:r>
               <w:rPr>
-                <w:rFonts w:ascii="Vazirmatn" w:hAnsi="Vazirmatn" w:cs="Vazirmatn"/>
+                <w:rFonts w:ascii="Segoe UI" w:hAnsi="Segoe UI" w:cs="Vazirmatn"/>
                 <w:sz w:val="28"/>
                 <w:szCs w:val="28"/>
                 <w:b/>
@@ -7798,7 +7798,7 @@
             </w:pPr>
             <w:r>
               <w:rPr>
-                <w:rFonts w:ascii="Vazirmatn" w:hAnsi="Vazirmatn" w:cs="Vazirmatn"/>
+                <w:rFonts w:ascii="Segoe UI" w:hAnsi="Segoe UI" w:cs="Vazirmatn"/>
                 <w:sz w:val="28"/>
                 <w:szCs w:val="28"/>
                 <w:b/>
@@ -9165,7 +9165,7 @@
             </w:pPr>
             <w:r>
               <w:rPr>
-                <w:rFonts w:ascii="Vazirmatn" w:hAnsi="Vazirmatn" w:cs="Vazirmatn"/>
+                <w:rFonts w:ascii="Segoe UI" w:hAnsi="Segoe UI" w:cs="Vazirmatn"/>
                 <w:sz w:val="26"/>
                 <w:szCs w:val="26"/>
                 <w:b/>
@@ -10994,7 +10994,7 @@
             </w:pPr>
             <w:r>
               <w:rPr>
-                <w:rFonts w:ascii="Vazirmatn" w:hAnsi="Vazirmatn" w:cs="Vazirmatn"/>
+                <w:rFonts w:ascii="Segoe UI" w:hAnsi="Segoe UI" w:cs="Vazirmatn"/>
                 <w:sz w:val="28"/>
                 <w:szCs w:val="28"/>
                 <w:b/>
@@ -11989,7 +11989,7 @@
       <w:jc w:val="both"/>
     </w:pPr>
     <w:rPr>
-      <w:rFonts w:ascii="Vazirmatn" w:hAnsi="Vazirmatn" w:cs="Vazirmatn"/>
+      <w:rFonts w:ascii="Segoe UI" w:hAnsi="Segoe UI" w:cs="Vazirmatn"/>
       <w:sz w:val="22"/>
       <w:szCs w:val="22"/>
       <w:lang w:val="en-US" w:bidi="fa-IR"/>

</xml_diff>

<commit_message>
feat: complete FIN-01 to FIN-14 requirements and verify 100% tests (20/20)
</commit_message>
<xml_diff>
--- a/examples/english_technical_doc.docx
+++ b/examples/english_technical_doc.docx
@@ -12478,18 +12478,18 @@
       <w:docGrid w:linePitch="360"/>
       <w:bidi w:val="1"/>
     </w:sectPr>
-    <w:bookmarkStart w:id="14412" w:name="distributed-cache-and-persistence-archit"/>
-    <w:bookmarkEnd w:id="14412">
-      <w:bookmarkStart w:id="14843" w:name="cache-aside-pattern-and-invalidation"/>
-      <w:bookmarkEnd w:id="14843"/>
-      <w:bookmarkStart w:id="5175" w:name="data-access-implementation"/>
-      <w:bookmarkEnd w:id="5175"/>
-      <w:bookmarkStart w:id="87943" w:name="cluster-node-telemetry"/>
-      <w:bookmarkEnd w:id="87943"/>
-      <w:bookmarkStart w:id="43071" w:name="cluster-node-status-matrix"/>
-      <w:bookmarkEnd w:id="43071"/>
-      <w:bookmarkStart w:id="90324" w:name="maintenance-and-backup-procedures"/>
-      <w:bookmarkEnd w:id="90324"/>
+    <w:bookmarkStart w:id="23772" w:name="distributed-cache-and-persistence-archit"/>
+    <w:bookmarkEnd w:id="23772">
+      <w:bookmarkStart w:id="10778" w:name="cache-aside-pattern-and-invalidation"/>
+      <w:bookmarkEnd w:id="10778"/>
+      <w:bookmarkStart w:id="91085" w:name="data-access-implementation"/>
+      <w:bookmarkEnd w:id="91085"/>
+      <w:bookmarkStart w:id="28463" w:name="cluster-node-telemetry"/>
+      <w:bookmarkEnd w:id="28463"/>
+      <w:bookmarkStart w:id="18695" w:name="cluster-node-status-matrix"/>
+      <w:bookmarkEnd w:id="18695"/>
+      <w:bookmarkStart w:id="31723" w:name="maintenance-and-backup-procedures"/>
+      <w:bookmarkEnd w:id="31723"/>
     </w:bookmarkEnd>
   </w:body>
 </w:document>

</xml_diff>